<commit_message>
registry v1.35: Stone BC executed and sealed (SM-067) - the 4-cube anomaly does NOT recur on the 8-cube: I_k = C_k at every lag on B8, the D9 half-spin (W(D9) enumerated in full, affine form), B6 and B7; two orbits carry the half-turn as -(e2e3)(e4e5)(e6e7), the analogue of -tau, but the correction's Weyl centralizer is {+-1}; the 'power of 2' law refuted at n = 8; 14 PASS + 4 INVERTED, first run kept; orientation slip R(lambda) = w0.lambda noted; papers v1.0 (build_v1.py) and v2.0 (Prop. 6.7, build_v2.py) rebuilt with the B8 result
Co-Authored-By: Claude Fable 5.1 <noreply@anthropic.com>
</commit_message>
<xml_diff>
--- a/joint_paper/Roof_and_Clock_MATH_v2.docx
+++ b/joint_paper/Roof_and_Clock_MATH_v2.docx
@@ -6494,6 +6494,131 @@
         <w:pStyle w:val="BodyText"/>
       </w:pPr>
       <w:r>
+        <w:t xml:space="preserve">The phenomenon does not recur on</w:t>
+      </w:r>
+      <w:r>
+        <w:t xml:space="preserve"> </w:t>
+      </w:r>
+      <m:oMath>
+        <m:sSub>
+          <m:e>
+            <m:r>
+              <m:t>B</m:t>
+            </m:r>
+          </m:e>
+          <m:sub>
+            <m:r>
+              <m:t>8</m:t>
+            </m:r>
+          </m:sub>
+        </m:sSub>
+      </m:oMath>
+      <w:r>
+        <w:t xml:space="preserve">, the next board on which the clock acts freely: there the half-turn again agrees with a Weyl element on exactly two orbits, but the correction’s centralizer is</w:t>
+      </w:r>
+      <w:r>
+        <w:t xml:space="preserve"> </w:t>
+      </w:r>
+      <m:oMath>
+        <m:r>
+          <m:rPr>
+            <m:sty m:val="p"/>
+          </m:rPr>
+          <m:t>{</m:t>
+        </m:r>
+        <m:r>
+          <m:rPr>
+            <m:sty m:val="p"/>
+          </m:rPr>
+          <m:t>±</m:t>
+        </m:r>
+        <m:r>
+          <m:t>1</m:t>
+        </m:r>
+        <m:r>
+          <m:rPr>
+            <m:sty m:val="p"/>
+          </m:rPr>
+          <m:t>}</m:t>
+        </m:r>
+      </m:oMath>
+      <w:r>
+        <w:t xml:space="preserve"> </w:t>
+      </w:r>
+      <w:r>
+        <w:t xml:space="preserve">and</w:t>
+      </w:r>
+      <w:r>
+        <w:t xml:space="preserve"> </w:t>
+      </w:r>
+      <m:oMath>
+        <m:sSub>
+          <m:e>
+            <m:r>
+              <m:t>I</m:t>
+            </m:r>
+          </m:e>
+          <m:sub>
+            <m:r>
+              <m:t>k</m:t>
+            </m:r>
+          </m:sub>
+        </m:sSub>
+        <m:r>
+          <m:rPr>
+            <m:sty m:val="p"/>
+          </m:rPr>
+          <m:t>=</m:t>
+        </m:r>
+        <m:sSub>
+          <m:e>
+            <m:r>
+              <m:t>C</m:t>
+            </m:r>
+          </m:e>
+          <m:sub>
+            <m:r>
+              <m:t>W</m:t>
+            </m:r>
+          </m:sub>
+        </m:sSub>
+        <m:r>
+          <m:rPr>
+            <m:sty m:val="p"/>
+          </m:rPr>
+          <m:t>(</m:t>
+        </m:r>
+        <m:sSup>
+          <m:e>
+            <m:r>
+              <m:t>R</m:t>
+            </m:r>
+          </m:e>
+          <m:sup>
+            <m:r>
+              <m:t>k</m:t>
+            </m:r>
+          </m:sup>
+        </m:sSup>
+        <m:r>
+          <m:rPr>
+            <m:sty m:val="p"/>
+          </m:rPr>
+          <m:t>)</m:t>
+        </m:r>
+      </m:oMath>
+      <w:r>
+        <w:t xml:space="preserve"> </w:t>
+      </w:r>
+      <w:r>
+        <w:t xml:space="preserve">at every lag (Proposition 6.7).</w:t>
+      </w:r>
+    </w:p>
+    <w:p>
+      <w:pPr>
+        <w:pStyle w:val="BodyText"/>
+      </w:pPr>
+      <w:r>
         <w:t xml:space="preserve">We also show (§7) that the three ternary label counts on any simply-laced minuscule board are homomesic under</w:t>
       </w:r>
       <w:r>
@@ -8097,7 +8222,7 @@
         </m:sSub>
       </m:oMath>
       <w:r>
-        <w:t xml:space="preserve">. §5 proves Theorem D and the vector-board part of Theorem E and reports the family computation. §6 proves Theorem F and describes the chain</w:t>
+        <w:t xml:space="preserve">. §5 proves Theorem D and the vector-board part of Theorem E and reports the family computation. §6 proves Theorem F, describes the chain</w:t>
       </w:r>
       <w:r>
         <w:t xml:space="preserve"> </w:t>
@@ -8135,7 +8260,30 @@
         <w:t xml:space="preserve"> </w:t>
       </w:r>
       <w:r>
-        <w:t xml:space="preserve">of iterated shared grammars. §7 is homomesy. §8 describes the computational model of</w:t>
+        <w:t xml:space="preserve">of iterated shared grammars, and reports the</w:t>
+      </w:r>
+      <w:r>
+        <w:t xml:space="preserve"> </w:t>
+      </w:r>
+      <m:oMath>
+        <m:sSub>
+          <m:e>
+            <m:r>
+              <m:t>B</m:t>
+            </m:r>
+          </m:e>
+          <m:sub>
+            <m:r>
+              <m:t>8</m:t>
+            </m:r>
+          </m:sub>
+        </m:sSub>
+      </m:oMath>
+      <w:r>
+        <w:t xml:space="preserve"> </w:t>
+      </w:r>
+      <w:r>
+        <w:t xml:space="preserve">computation. §7 is homomesy. §8 describes the computational model of</w:t>
       </w:r>
       <w:r>
         <w:t xml:space="preserve"> </w:t>
@@ -40728,7 +40876,7 @@
     </w:p>
     <w:bookmarkEnd w:id="24"/>
     <w:bookmarkEnd w:id="25"/>
-    <w:bookmarkStart w:id="29" w:name="the-4-cube"/>
+    <w:bookmarkStart w:id="30" w:name="the-4-cube"/>
     <w:p>
       <w:pPr>
         <w:pStyle w:val="Heading1"/>
@@ -44560,6 +44708,20 @@
         <w:t xml:space="preserve"> </w:t>
       </w:r>
       <m:oMath>
+        <m:r>
+          <m:t>λ</m:t>
+        </m:r>
+      </m:oMath>
+      <w:r>
+        <w:t xml:space="preserve"> </w:t>
+      </w:r>
+      <w:r>
+        <w:t xml:space="preserve">straight to</w:t>
+      </w:r>
+      <w:r>
+        <w:t xml:space="preserve"> </w:t>
+      </w:r>
+      <m:oMath>
         <m:sSub>
           <m:e>
             <m:r>
@@ -44580,18 +44742,7 @@
         <w:t xml:space="preserve"> </w:t>
       </w:r>
       <w:r>
-        <w:t xml:space="preserve">straight to</w:t>
-      </w:r>
-      <w:r>
-        <w:t xml:space="preserve"> </w:t>
-      </w:r>
-      <m:oMath>
-        <m:r>
-          <m:t>λ</m:t>
-        </m:r>
-      </m:oMath>
-      <w:r>
-        <w:t xml:space="preserve">), and</w:t>
+        <w:t xml:space="preserve">by Lemma 3.1(a), and the list is read around the clock), and</w:t>
       </w:r>
       <w:r>
         <w:t xml:space="preserve"> </w:t>
@@ -46993,7 +47144,7 @@
         <w:t xml:space="preserve"> </w:t>
       </w:r>
       <w:r>
-        <w:t xml:space="preserve">(256 weights, 16 orbits of 16). Whether it does is open (§10).</w:t>
+        <w:t xml:space="preserve">(256 weights, 16 orbits of 16). It does not (Proposition 6.7, §6.4).</w:t>
       </w:r>
     </w:p>
     <w:bookmarkEnd w:id="27"/>
@@ -49589,8 +49740,2592 @@
       </w:r>
     </w:p>
     <w:bookmarkEnd w:id="28"/>
+    <w:bookmarkStart w:id="29" w:name="the-8-cube"/>
+    <w:p>
+      <w:pPr>
+        <w:pStyle w:val="Heading2"/>
+      </w:pPr>
+      <w:r>
+        <w:t xml:space="preserve">6.4 The 8-cube</w:t>
+      </w:r>
+    </w:p>
+    <w:p>
+      <w:pPr>
+        <w:pStyle w:val="FirstParagraph"/>
+      </w:pPr>
+      <w:r>
+        <w:t xml:space="preserve">The clock acts freely on the</w:t>
+      </w:r>
+      <w:r>
+        <w:t xml:space="preserve"> </w:t>
+      </w:r>
+      <m:oMath>
+        <m:sSup>
+          <m:e>
+            <m:r>
+              <m:t>2</m:t>
+            </m:r>
+          </m:e>
+          <m:sup>
+            <m:r>
+              <m:t>n</m:t>
+            </m:r>
+          </m:sup>
+        </m:sSup>
+      </m:oMath>
+      <w:r>
+        <w:t xml:space="preserve"> </w:t>
+      </w:r>
+      <w:r>
+        <w:t xml:space="preserve">weights of the</w:t>
+      </w:r>
+      <w:r>
+        <w:t xml:space="preserve"> </w:t>
+      </w:r>
+      <m:oMath>
+        <m:sSub>
+          <m:e>
+            <m:r>
+              <m:t>B</m:t>
+            </m:r>
+          </m:e>
+          <m:sub>
+            <m:r>
+              <m:t>n</m:t>
+            </m:r>
+          </m:sub>
+        </m:sSub>
+      </m:oMath>
+      <w:r>
+        <w:t xml:space="preserve"> </w:t>
+      </w:r>
+      <w:r>
+        <w:t xml:space="preserve">spinor board, with orbits of size</w:t>
+      </w:r>
+      <w:r>
+        <w:t xml:space="preserve"> </w:t>
+      </w:r>
+      <m:oMath>
+        <m:r>
+          <m:t>h</m:t>
+        </m:r>
+        <m:r>
+          <m:rPr>
+            <m:sty m:val="p"/>
+          </m:rPr>
+          <m:t>=</m:t>
+        </m:r>
+        <m:r>
+          <m:t>2</m:t>
+        </m:r>
+        <m:r>
+          <m:t>n</m:t>
+        </m:r>
+      </m:oMath>
+      <w:r>
+        <w:t xml:space="preserve">, only when</w:t>
+      </w:r>
+      <w:r>
+        <w:t xml:space="preserve"> </w:t>
+      </w:r>
+      <m:oMath>
+        <m:r>
+          <m:t>2</m:t>
+        </m:r>
+        <m:r>
+          <m:t>n</m:t>
+        </m:r>
+        <m:r>
+          <m:rPr>
+            <m:sty m:val="p"/>
+          </m:rPr>
+          <m:t>∣</m:t>
+        </m:r>
+        <m:sSup>
+          <m:e>
+            <m:r>
+              <m:t>2</m:t>
+            </m:r>
+          </m:e>
+          <m:sup>
+            <m:r>
+              <m:t>n</m:t>
+            </m:r>
+          </m:sup>
+        </m:sSup>
+      </m:oMath>
+      <w:r>
+        <w:t xml:space="preserve">, i.e. when</w:t>
+      </w:r>
+      <w:r>
+        <w:t xml:space="preserve"> </w:t>
+      </w:r>
+      <m:oMath>
+        <m:r>
+          <m:t>n</m:t>
+        </m:r>
+      </m:oMath>
+      <w:r>
+        <w:t xml:space="preserve"> </w:t>
+      </w:r>
+      <w:r>
+        <w:t xml:space="preserve">is a power of 2;</w:t>
+      </w:r>
+      <w:r>
+        <w:t xml:space="preserve"> </w:t>
+      </w:r>
+      <m:oMath>
+        <m:sSub>
+          <m:e>
+            <m:r>
+              <m:t>B</m:t>
+            </m:r>
+          </m:e>
+          <m:sub>
+            <m:r>
+              <m:t>8</m:t>
+            </m:r>
+          </m:sub>
+        </m:sSub>
+      </m:oMath>
+      <w:r>
+        <w:t xml:space="preserve"> </w:t>
+      </w:r>
+      <w:r>
+        <w:t xml:space="preserve">is therefore the next board on which the two-orbit mechanism of Theorem 6.2 could recur, and the last one within reach (</w:t>
+      </w:r>
+      <m:oMath>
+        <m:sSub>
+          <m:e>
+            <m:r>
+              <m:t>B</m:t>
+            </m:r>
+          </m:e>
+          <m:sub>
+            <m:r>
+              <m:t>16</m:t>
+            </m:r>
+          </m:sub>
+        </m:sSub>
+      </m:oMath>
+      <w:r>
+        <w:t xml:space="preserve"> </w:t>
+      </w:r>
+      <w:r>
+        <w:t xml:space="preserve">has 65,536 weights).</w:t>
+      </w:r>
+      <w:r>
+        <w:t xml:space="preserve"> </w:t>
+      </w:r>
+      <m:oMath>
+        <m:r>
+          <m:t>W</m:t>
+        </m:r>
+        <m:r>
+          <m:rPr>
+            <m:sty m:val="p"/>
+          </m:rPr>
+          <m:t>(</m:t>
+        </m:r>
+        <m:sSub>
+          <m:e>
+            <m:r>
+              <m:t>B</m:t>
+            </m:r>
+          </m:e>
+          <m:sub>
+            <m:r>
+              <m:t>8</m:t>
+            </m:r>
+          </m:sub>
+        </m:sSub>
+        <m:r>
+          <m:rPr>
+            <m:sty m:val="p"/>
+          </m:rPr>
+          <m:t>)</m:t>
+        </m:r>
+        <m:r>
+          <m:rPr>
+            <m:sty m:val="p"/>
+          </m:rPr>
+          <m:t>=</m:t>
+        </m:r>
+        <m:sSubSup>
+          <m:e>
+            <m:r>
+              <m:rPr>
+                <m:scr m:val="double-struck"/>
+                <m:sty m:val="p"/>
+              </m:rPr>
+              <m:t>F</m:t>
+            </m:r>
+          </m:e>
+          <m:sub>
+            <m:r>
+              <m:t>2</m:t>
+            </m:r>
+          </m:sub>
+          <m:sup>
+            <m:r>
+              <m:t>8</m:t>
+            </m:r>
+          </m:sup>
+        </m:sSubSup>
+        <m:r>
+          <m:rPr>
+            <m:sty m:val="p"/>
+          </m:rPr>
+          <m:t>⋊</m:t>
+        </m:r>
+        <m:sSub>
+          <m:e>
+            <m:r>
+              <m:t>S</m:t>
+            </m:r>
+          </m:e>
+          <m:sub>
+            <m:r>
+              <m:t>8</m:t>
+            </m:r>
+          </m:sub>
+        </m:sSub>
+      </m:oMath>
+      <w:r>
+        <w:t xml:space="preserve"> </w:t>
+      </w:r>
+      <w:r>
+        <w:t xml:space="preserve">and</w:t>
+      </w:r>
+      <w:r>
+        <w:t xml:space="preserve"> </w:t>
+      </w:r>
+      <m:oMath>
+        <m:r>
+          <m:t>W</m:t>
+        </m:r>
+        <m:r>
+          <m:rPr>
+            <m:sty m:val="p"/>
+          </m:rPr>
+          <m:t>(</m:t>
+        </m:r>
+        <m:sSub>
+          <m:e>
+            <m:r>
+              <m:t>D</m:t>
+            </m:r>
+          </m:e>
+          <m:sub>
+            <m:r>
+              <m:t>9</m:t>
+            </m:r>
+          </m:sub>
+        </m:sSub>
+        <m:r>
+          <m:rPr>
+            <m:sty m:val="p"/>
+          </m:rPr>
+          <m:t>)</m:t>
+        </m:r>
+      </m:oMath>
+      <w:r>
+        <w:t xml:space="preserve"> </w:t>
+      </w:r>
+      <w:r>
+        <w:t xml:space="preserve">were enumerated in the affine form</w:t>
+      </w:r>
+      <w:r>
+        <w:t xml:space="preserve"> </w:t>
+      </w:r>
+      <m:oMath>
+        <m:r>
+          <m:t>x</m:t>
+        </m:r>
+        <m:r>
+          <m:rPr>
+            <m:sty m:val="p"/>
+          </m:rPr>
+          <m:t>↦</m:t>
+        </m:r>
+        <m:r>
+          <m:t>π</m:t>
+        </m:r>
+        <m:r>
+          <m:rPr>
+            <m:sty m:val="p"/>
+          </m:rPr>
+          <m:t>(</m:t>
+        </m:r>
+        <m:r>
+          <m:t>x</m:t>
+        </m:r>
+        <m:r>
+          <m:rPr>
+            <m:sty m:val="p"/>
+          </m:rPr>
+          <m:t>)</m:t>
+        </m:r>
+        <m:r>
+          <m:rPr>
+            <m:sty m:val="p"/>
+          </m:rPr>
+          <m:t>⊕</m:t>
+        </m:r>
+        <m:r>
+          <m:t>v</m:t>
+        </m:r>
+      </m:oMath>
+      <w:r>
+        <w:t xml:space="preserve"> </w:t>
+      </w:r>
+      <w:r>
+        <w:t xml:space="preserve">on the 256 sign patterns (for</w:t>
+      </w:r>
+      <w:r>
+        <w:t xml:space="preserve"> </w:t>
+      </w:r>
+      <m:oMath>
+        <m:sSub>
+          <m:e>
+            <m:r>
+              <m:t>D</m:t>
+            </m:r>
+          </m:e>
+          <m:sub>
+            <m:r>
+              <m:t>9</m:t>
+            </m:r>
+          </m:sub>
+        </m:sSub>
+      </m:oMath>
+      <w:r>
+        <w:t xml:space="preserve">, the even code with its parity bit dropped), never as permutation tuples; membership of a transport</w:t>
+      </w:r>
+      <w:r>
+        <w:t xml:space="preserve"> </w:t>
+      </w:r>
+      <m:oMath>
+        <m:sSup>
+          <m:e>
+            <m:r>
+              <m:t>R</m:t>
+            </m:r>
+          </m:e>
+          <m:sup>
+            <m:r>
+              <m:rPr>
+                <m:sty m:val="p"/>
+              </m:rPr>
+              <m:t>−</m:t>
+            </m:r>
+            <m:r>
+              <m:t>k</m:t>
+            </m:r>
+          </m:sup>
+        </m:sSup>
+        <m:r>
+          <m:t>g</m:t>
+        </m:r>
+        <m:sSup>
+          <m:e>
+            <m:r>
+              <m:t>R</m:t>
+            </m:r>
+          </m:e>
+          <m:sup>
+            <m:r>
+              <m:t>k</m:t>
+            </m:r>
+          </m:sup>
+        </m:sSup>
+      </m:oMath>
+      <w:r>
+        <w:t xml:space="preserve"> </w:t>
+      </w:r>
+      <w:r>
+        <w:t xml:space="preserve">in</w:t>
+      </w:r>
+      <w:r>
+        <w:t xml:space="preserve"> </w:t>
+      </w:r>
+      <m:oMath>
+        <m:r>
+          <m:t>W</m:t>
+        </m:r>
+      </m:oMath>
+      <w:r>
+        <w:t xml:space="preserve"> </w:t>
+      </w:r>
+      <w:r>
+        <w:t xml:space="preserve">is decided by its values at</w:t>
+      </w:r>
+      <w:r>
+        <w:t xml:space="preserve"> </w:t>
+      </w:r>
+      <m:oMath>
+        <m:r>
+          <m:t>0</m:t>
+        </m:r>
+      </m:oMath>
+      <w:r>
+        <w:t xml:space="preserve"> </w:t>
+      </w:r>
+      <w:r>
+        <w:t xml:space="preserve">and the unit vectors and then confirmed on all 256 points.</w:t>
+      </w:r>
+    </w:p>
+    <w:p>
+      <w:pPr>
+        <w:pStyle w:val="BodyText"/>
+      </w:pPr>
+      <w:r>
+        <w:rPr>
+          <w:b/>
+          <w:bCs/>
+        </w:rPr>
+        <w:t xml:space="preserve">Proposition 6.7 (C).</w:t>
+      </w:r>
+      <w:r>
+        <w:t xml:space="preserve"> </w:t>
+      </w:r>
+      <w:r>
+        <w:rPr>
+          <w:i/>
+          <w:iCs/>
+        </w:rPr>
+        <w:t xml:space="preserve">On the</w:t>
+      </w:r>
+      <w:r>
+        <w:rPr>
+          <w:i/>
+          <w:iCs/>
+        </w:rPr>
+        <w:t xml:space="preserve"> </w:t>
+      </w:r>
+      <m:oMath>
+        <m:sSub>
+          <m:e>
+            <m:r>
+              <m:t>B</m:t>
+            </m:r>
+          </m:e>
+          <m:sub>
+            <m:r>
+              <m:t>8</m:t>
+            </m:r>
+          </m:sub>
+        </m:sSub>
+      </m:oMath>
+      <w:r>
+        <w:rPr>
+          <w:i/>
+          <w:iCs/>
+        </w:rPr>
+        <w:t xml:space="preserve"> </w:t>
+      </w:r>
+      <w:r>
+        <w:rPr>
+          <w:i/>
+          <w:iCs/>
+        </w:rPr>
+        <w:t xml:space="preserve">spinor board (</w:t>
+      </w:r>
+      <m:oMath>
+        <m:r>
+          <m:t>256</m:t>
+        </m:r>
+      </m:oMath>
+      <w:r>
+        <w:rPr>
+          <w:i/>
+          <w:iCs/>
+        </w:rPr>
+        <w:t xml:space="preserve"> </w:t>
+      </w:r>
+      <w:r>
+        <w:rPr>
+          <w:i/>
+          <w:iCs/>
+        </w:rPr>
+        <w:t xml:space="preserve">weights,</w:t>
+      </w:r>
+      <w:r>
+        <w:rPr>
+          <w:i/>
+          <w:iCs/>
+        </w:rPr>
+        <w:t xml:space="preserve"> </w:t>
+      </w:r>
+      <m:oMath>
+        <m:r>
+          <m:rPr>
+            <m:sty m:val="p"/>
+          </m:rPr>
+          <m:t>|</m:t>
+        </m:r>
+        <m:r>
+          <m:t>W</m:t>
+        </m:r>
+        <m:r>
+          <m:rPr>
+            <m:sty m:val="p"/>
+          </m:rPr>
+          <m:t>|</m:t>
+        </m:r>
+        <m:r>
+          <m:rPr>
+            <m:sty m:val="p"/>
+          </m:rPr>
+          <m:t>=</m:t>
+        </m:r>
+        <m:sSup>
+          <m:e>
+            <m:r>
+              <m:t>2</m:t>
+            </m:r>
+          </m:e>
+          <m:sup>
+            <m:r>
+              <m:t>8</m:t>
+            </m:r>
+          </m:sup>
+        </m:sSup>
+        <m:r>
+          <m:rPr>
+            <m:sty m:val="p"/>
+          </m:rPr>
+          <m:t>⋅</m:t>
+        </m:r>
+        <m:r>
+          <m:t>8</m:t>
+        </m:r>
+        <m:r>
+          <m:rPr>
+            <m:sty m:val="p"/>
+          </m:rPr>
+          <m:t>!</m:t>
+        </m:r>
+        <m:r>
+          <m:rPr>
+            <m:sty m:val="p"/>
+          </m:rPr>
+          <m:t>=</m:t>
+        </m:r>
+        <m:r>
+          <m:t>10</m:t>
+        </m:r>
+        <m:r>
+          <m:rPr>
+            <m:sty m:val="p"/>
+          </m:rPr>
+          <m:t>,</m:t>
+        </m:r>
+        <m:r>
+          <m:t>321</m:t>
+        </m:r>
+        <m:r>
+          <m:rPr>
+            <m:sty m:val="p"/>
+          </m:rPr>
+          <m:t>,</m:t>
+        </m:r>
+        <m:r>
+          <m:t>920</m:t>
+        </m:r>
+      </m:oMath>
+      <w:r>
+        <w:rPr>
+          <w:i/>
+          <w:iCs/>
+        </w:rPr>
+        <w:t xml:space="preserve">,</w:t>
+      </w:r>
+      <w:r>
+        <w:rPr>
+          <w:i/>
+          <w:iCs/>
+        </w:rPr>
+        <w:t xml:space="preserve"> </w:t>
+      </w:r>
+      <m:oMath>
+        <m:r>
+          <m:t>h</m:t>
+        </m:r>
+        <m:r>
+          <m:rPr>
+            <m:sty m:val="p"/>
+          </m:rPr>
+          <m:t>=</m:t>
+        </m:r>
+        <m:r>
+          <m:t>16</m:t>
+        </m:r>
+      </m:oMath>
+      <w:r>
+        <w:rPr>
+          <w:i/>
+          <w:iCs/>
+        </w:rPr>
+        <w:t xml:space="preserve">):</w:t>
+      </w:r>
+    </w:p>
+    <w:p>
+      <w:pPr>
+        <w:pStyle w:val="BodyText"/>
+      </w:pPr>
+      <w:r>
+        <w:rPr>
+          <w:i/>
+          <w:iCs/>
+        </w:rPr>
+        <w:t xml:space="preserve">(i)</w:t>
+      </w:r>
+      <w:r>
+        <w:rPr>
+          <w:i/>
+          <w:iCs/>
+        </w:rPr>
+        <w:t xml:space="preserve"> </w:t>
+      </w:r>
+      <m:oMath>
+        <m:r>
+          <m:t>R</m:t>
+        </m:r>
+      </m:oMath>
+      <w:r>
+        <w:rPr>
+          <w:i/>
+          <w:iCs/>
+        </w:rPr>
+        <w:t xml:space="preserve"> </w:t>
+      </w:r>
+      <w:r>
+        <w:rPr>
+          <w:i/>
+          <w:iCs/>
+        </w:rPr>
+        <w:t xml:space="preserve">has sixteen free orbits of sixteen. The orbit</w:t>
+      </w:r>
+      <w:r>
+        <w:rPr>
+          <w:i/>
+          <w:iCs/>
+        </w:rPr>
+        <w:t xml:space="preserve"> </w:t>
+      </w:r>
+      <m:oMath>
+        <m:sSub>
+          <m:e>
+            <m:r>
+              <m:t>O</m:t>
+            </m:r>
+          </m:e>
+          <m:sub>
+            <m:r>
+              <m:t>1</m:t>
+            </m:r>
+          </m:sub>
+        </m:sSub>
+        <m:r>
+          <m:rPr>
+            <m:sty m:val="p"/>
+          </m:rPr>
+          <m:t>∋</m:t>
+        </m:r>
+        <m:r>
+          <m:t>λ</m:t>
+        </m:r>
+      </m:oMath>
+      <w:r>
+        <w:rPr>
+          <w:i/>
+          <w:iCs/>
+        </w:rPr>
+        <w:t xml:space="preserve"> </w:t>
+      </w:r>
+      <w:r>
+        <w:rPr>
+          <w:i/>
+          <w:iCs/>
+        </w:rPr>
+        <w:t xml:space="preserve">is the full-height orbit, with ranks</w:t>
+      </w:r>
+      <w:r>
+        <w:rPr>
+          <w:i/>
+          <w:iCs/>
+        </w:rPr>
+        <w:t xml:space="preserve"> </w:t>
+      </w:r>
+      <m:oMath>
+        <m:r>
+          <m:t>0</m:t>
+        </m:r>
+        <m:r>
+          <m:rPr>
+            <m:sty m:val="p"/>
+          </m:rPr>
+          <m:t>,</m:t>
+        </m:r>
+        <m:r>
+          <m:t>1</m:t>
+        </m:r>
+        <m:r>
+          <m:rPr>
+            <m:sty m:val="p"/>
+          </m:rPr>
+          <m:t>,</m:t>
+        </m:r>
+        <m:r>
+          <m:t>1</m:t>
+        </m:r>
+        <m:r>
+          <m:rPr>
+            <m:sty m:val="p"/>
+          </m:rPr>
+          <m:t>,</m:t>
+        </m:r>
+        <m:r>
+          <m:rPr>
+            <m:sty m:val="p"/>
+          </m:rPr>
+          <m:t>…</m:t>
+        </m:r>
+        <m:r>
+          <m:rPr>
+            <m:sty m:val="p"/>
+          </m:rPr>
+          <m:t>,</m:t>
+        </m:r>
+        <m:r>
+          <m:t>7</m:t>
+        </m:r>
+        <m:r>
+          <m:rPr>
+            <m:sty m:val="p"/>
+          </m:rPr>
+          <m:t>,</m:t>
+        </m:r>
+        <m:r>
+          <m:t>7</m:t>
+        </m:r>
+        <m:r>
+          <m:rPr>
+            <m:sty m:val="p"/>
+          </m:rPr>
+          <m:t>,</m:t>
+        </m:r>
+        <m:r>
+          <m:t>8</m:t>
+        </m:r>
+      </m:oMath>
+      <w:r>
+        <w:rPr>
+          <w:i/>
+          <w:iCs/>
+        </w:rPr>
+        <w:t xml:space="preserve"> </w:t>
+      </w:r>
+      <w:r>
+        <w:rPr>
+          <w:i/>
+          <w:iCs/>
+        </w:rPr>
+        <w:t xml:space="preserve">around the clock, and</w:t>
+      </w:r>
+      <w:r>
+        <w:rPr>
+          <w:i/>
+          <w:iCs/>
+        </w:rPr>
+        <w:t xml:space="preserve"> </w:t>
+      </w:r>
+      <m:oMath>
+        <m:sSup>
+          <m:e>
+            <m:r>
+              <m:t>R</m:t>
+            </m:r>
+          </m:e>
+          <m:sup>
+            <m:r>
+              <m:t>8</m:t>
+            </m:r>
+          </m:sup>
+        </m:sSup>
+      </m:oMath>
+      <w:r>
+        <w:rPr>
+          <w:i/>
+          <w:iCs/>
+        </w:rPr>
+        <w:t xml:space="preserve"> </w:t>
+      </w:r>
+      <w:r>
+        <w:rPr>
+          <w:i/>
+          <w:iCs/>
+        </w:rPr>
+        <w:t xml:space="preserve">shifts every rank on it by exactly</w:t>
+      </w:r>
+      <w:r>
+        <w:rPr>
+          <w:i/>
+          <w:iCs/>
+        </w:rPr>
+        <w:t xml:space="preserve"> </w:t>
+      </w:r>
+      <m:oMath>
+        <m:r>
+          <m:rPr>
+            <m:sty m:val="p"/>
+          </m:rPr>
+          <m:t>±</m:t>
+        </m:r>
+        <m:r>
+          <m:t>4</m:t>
+        </m:r>
+      </m:oMath>
+      <w:r>
+        <w:rPr>
+          <w:i/>
+          <w:iCs/>
+        </w:rPr>
+        <w:t xml:space="preserve">; by Lemma 6.3 no Weyl element agrees with</w:t>
+      </w:r>
+      <w:r>
+        <w:rPr>
+          <w:i/>
+          <w:iCs/>
+        </w:rPr>
+        <w:t xml:space="preserve"> </w:t>
+      </w:r>
+      <m:oMath>
+        <m:sSup>
+          <m:e>
+            <m:r>
+              <m:t>R</m:t>
+            </m:r>
+          </m:e>
+          <m:sup>
+            <m:r>
+              <m:t>8</m:t>
+            </m:r>
+          </m:sup>
+        </m:sSup>
+      </m:oMath>
+      <w:r>
+        <w:rPr>
+          <w:i/>
+          <w:iCs/>
+        </w:rPr>
+        <w:t xml:space="preserve"> </w:t>
+      </w:r>
+      <w:r>
+        <w:rPr>
+          <w:i/>
+          <w:iCs/>
+        </w:rPr>
+        <w:t xml:space="preserve">on</w:t>
+      </w:r>
+      <w:r>
+        <w:rPr>
+          <w:i/>
+          <w:iCs/>
+        </w:rPr>
+        <w:t xml:space="preserve"> </w:t>
+      </w:r>
+      <m:oMath>
+        <m:sSub>
+          <m:e>
+            <m:r>
+              <m:t>O</m:t>
+            </m:r>
+          </m:e>
+          <m:sub>
+            <m:r>
+              <m:t>1</m:t>
+            </m:r>
+          </m:sub>
+        </m:sSub>
+      </m:oMath>
+      <w:r>
+        <w:rPr>
+          <w:i/>
+          <w:iCs/>
+        </w:rPr>
+        <w:t xml:space="preserve">.</w:t>
+      </w:r>
+    </w:p>
+    <w:p>
+      <w:pPr>
+        <w:pStyle w:val="BodyText"/>
+      </w:pPr>
+      <w:r>
+        <w:rPr>
+          <w:i/>
+          <w:iCs/>
+        </w:rPr>
+        <w:t xml:space="preserve">(ii) Exactly two orbits carry the half-turn as a Weyl element, both by the same element</w:t>
+      </w:r>
+      <w:r>
+        <w:rPr>
+          <w:i/>
+          <w:iCs/>
+        </w:rPr>
+        <w:t xml:space="preserve"> </w:t>
+      </w:r>
+      <m:oMath>
+        <m:r>
+          <m:t>w</m:t>
+        </m:r>
+        <m:r>
+          <m:rPr>
+            <m:sty m:val="p"/>
+          </m:rPr>
+          <m:t>=</m:t>
+        </m:r>
+        <m:r>
+          <m:rPr>
+            <m:sty m:val="p"/>
+          </m:rPr>
+          <m:t>−</m:t>
+        </m:r>
+        <m:r>
+          <m:rPr>
+            <m:sty m:val="p"/>
+          </m:rPr>
+          <m:t>(</m:t>
+        </m:r>
+        <m:sSub>
+          <m:e>
+            <m:r>
+              <m:t>e</m:t>
+            </m:r>
+          </m:e>
+          <m:sub>
+            <m:r>
+              <m:t>2</m:t>
+            </m:r>
+          </m:sub>
+        </m:sSub>
+        <m:sSub>
+          <m:e>
+            <m:r>
+              <m:t>e</m:t>
+            </m:r>
+          </m:e>
+          <m:sub>
+            <m:r>
+              <m:t>3</m:t>
+            </m:r>
+          </m:sub>
+        </m:sSub>
+        <m:r>
+          <m:rPr>
+            <m:sty m:val="p"/>
+          </m:rPr>
+          <m:t>)</m:t>
+        </m:r>
+        <m:r>
+          <m:rPr>
+            <m:sty m:val="p"/>
+          </m:rPr>
+          <m:t>(</m:t>
+        </m:r>
+        <m:sSub>
+          <m:e>
+            <m:r>
+              <m:t>e</m:t>
+            </m:r>
+          </m:e>
+          <m:sub>
+            <m:r>
+              <m:t>4</m:t>
+            </m:r>
+          </m:sub>
+        </m:sSub>
+        <m:sSub>
+          <m:e>
+            <m:r>
+              <m:t>e</m:t>
+            </m:r>
+          </m:e>
+          <m:sub>
+            <m:r>
+              <m:t>5</m:t>
+            </m:r>
+          </m:sub>
+        </m:sSub>
+        <m:r>
+          <m:rPr>
+            <m:sty m:val="p"/>
+          </m:rPr>
+          <m:t>)</m:t>
+        </m:r>
+        <m:r>
+          <m:rPr>
+            <m:sty m:val="p"/>
+          </m:rPr>
+          <m:t>(</m:t>
+        </m:r>
+        <m:sSub>
+          <m:e>
+            <m:r>
+              <m:t>e</m:t>
+            </m:r>
+          </m:e>
+          <m:sub>
+            <m:r>
+              <m:t>6</m:t>
+            </m:r>
+          </m:sub>
+        </m:sSub>
+        <m:sSub>
+          <m:e>
+            <m:r>
+              <m:t>e</m:t>
+            </m:r>
+          </m:e>
+          <m:sub>
+            <m:r>
+              <m:t>7</m:t>
+            </m:r>
+          </m:sub>
+        </m:sSub>
+        <m:r>
+          <m:rPr>
+            <m:sty m:val="p"/>
+          </m:rPr>
+          <m:t>)</m:t>
+        </m:r>
+      </m:oMath>
+      <w:r>
+        <w:rPr>
+          <w:i/>
+          <w:iCs/>
+        </w:rPr>
+        <w:t xml:space="preserve">, which negates</w:t>
+      </w:r>
+      <w:r>
+        <w:rPr>
+          <w:i/>
+          <w:iCs/>
+        </w:rPr>
+        <w:t xml:space="preserve"> </w:t>
+      </w:r>
+      <m:oMath>
+        <m:sSub>
+          <m:e>
+            <m:r>
+              <m:t>e</m:t>
+            </m:r>
+          </m:e>
+          <m:sub>
+            <m:r>
+              <m:t>1</m:t>
+            </m:r>
+          </m:sub>
+        </m:sSub>
+        <m:r>
+          <m:rPr>
+            <m:sty m:val="p"/>
+          </m:rPr>
+          <m:t>,</m:t>
+        </m:r>
+        <m:r>
+          <m:rPr>
+            <m:sty m:val="p"/>
+          </m:rPr>
+          <m:t>…</m:t>
+        </m:r>
+        <m:r>
+          <m:rPr>
+            <m:sty m:val="p"/>
+          </m:rPr>
+          <m:t>,</m:t>
+        </m:r>
+        <m:sSub>
+          <m:e>
+            <m:r>
+              <m:t>e</m:t>
+            </m:r>
+          </m:e>
+          <m:sub>
+            <m:r>
+              <m:t>7</m:t>
+            </m:r>
+          </m:sub>
+        </m:sSub>
+      </m:oMath>
+      <w:r>
+        <w:rPr>
+          <w:i/>
+          <w:iCs/>
+        </w:rPr>
+        <w:t xml:space="preserve"> </w:t>
+      </w:r>
+      <w:r>
+        <w:rPr>
+          <w:i/>
+          <w:iCs/>
+        </w:rPr>
+        <w:t xml:space="preserve">and fixes</w:t>
+      </w:r>
+      <w:r>
+        <w:rPr>
+          <w:i/>
+          <w:iCs/>
+        </w:rPr>
+        <w:t xml:space="preserve"> </w:t>
+      </w:r>
+      <m:oMath>
+        <m:sSub>
+          <m:e>
+            <m:r>
+              <m:t>e</m:t>
+            </m:r>
+          </m:e>
+          <m:sub>
+            <m:r>
+              <m:t>8</m:t>
+            </m:r>
+          </m:sub>
+        </m:sSub>
+      </m:oMath>
+      <w:r>
+        <w:rPr>
+          <w:i/>
+          <w:iCs/>
+        </w:rPr>
+        <w:t xml:space="preserve"> </w:t>
+      </w:r>
+      <w:r>
+        <w:rPr>
+          <w:i/>
+          <w:iCs/>
+        </w:rPr>
+        <w:t xml:space="preserve">— the analogue of</w:t>
+      </w:r>
+      <w:r>
+        <w:rPr>
+          <w:i/>
+          <w:iCs/>
+        </w:rPr>
+        <w:t xml:space="preserve"> </w:t>
+      </w:r>
+      <m:oMath>
+        <m:r>
+          <m:rPr>
+            <m:sty m:val="p"/>
+          </m:rPr>
+          <m:t>−</m:t>
+        </m:r>
+        <m:r>
+          <m:t>τ</m:t>
+        </m:r>
+      </m:oMath>
+      <w:r>
+        <w:rPr>
+          <w:i/>
+          <w:iCs/>
+        </w:rPr>
+        <w:t xml:space="preserve">. It is the unique Weyl element nearest to</w:t>
+      </w:r>
+      <w:r>
+        <w:rPr>
+          <w:i/>
+          <w:iCs/>
+        </w:rPr>
+        <w:t xml:space="preserve"> </w:t>
+      </w:r>
+      <m:oMath>
+        <m:sSup>
+          <m:e>
+            <m:r>
+              <m:t>R</m:t>
+            </m:r>
+          </m:e>
+          <m:sup>
+            <m:r>
+              <m:t>8</m:t>
+            </m:r>
+          </m:sup>
+        </m:sSup>
+      </m:oMath>
+      <w:r>
+        <w:rPr>
+          <w:i/>
+          <w:iCs/>
+        </w:rPr>
+        <w:t xml:space="preserve">, agreeing with it on</w:t>
+      </w:r>
+      <w:r>
+        <w:rPr>
+          <w:i/>
+          <w:iCs/>
+        </w:rPr>
+        <w:t xml:space="preserve"> </w:t>
+      </w:r>
+      <m:oMath>
+        <m:r>
+          <m:t>52</m:t>
+        </m:r>
+      </m:oMath>
+      <w:r>
+        <w:rPr>
+          <w:i/>
+          <w:iCs/>
+        </w:rPr>
+        <w:t xml:space="preserve"> </w:t>
+      </w:r>
+      <w:r>
+        <w:rPr>
+          <w:i/>
+          <w:iCs/>
+        </w:rPr>
+        <w:t xml:space="preserve">of the</w:t>
+      </w:r>
+      <w:r>
+        <w:rPr>
+          <w:i/>
+          <w:iCs/>
+        </w:rPr>
+        <w:t xml:space="preserve"> </w:t>
+      </w:r>
+      <m:oMath>
+        <m:r>
+          <m:t>256</m:t>
+        </m:r>
+      </m:oMath>
+      <w:r>
+        <w:rPr>
+          <w:i/>
+          <w:iCs/>
+        </w:rPr>
+        <w:t xml:space="preserve"> </w:t>
+      </w:r>
+      <w:r>
+        <w:rPr>
+          <w:i/>
+          <w:iCs/>
+        </w:rPr>
+        <w:t xml:space="preserve">weights. Each carrying orbit is preserved by</w:t>
+      </w:r>
+      <w:r>
+        <w:rPr>
+          <w:i/>
+          <w:iCs/>
+        </w:rPr>
+        <w:t xml:space="preserve"> </w:t>
+      </w:r>
+      <m:oMath>
+        <m:r>
+          <m:rPr>
+            <m:sty m:val="p"/>
+          </m:rPr>
+          <m:t>−</m:t>
+        </m:r>
+        <m:r>
+          <m:t>1</m:t>
+        </m:r>
+      </m:oMath>
+      <w:r>
+        <w:rPr>
+          <w:i/>
+          <w:iCs/>
+        </w:rPr>
+        <w:t xml:space="preserve">. Every orbit affinely spans</w:t>
+      </w:r>
+      <w:r>
+        <w:rPr>
+          <w:i/>
+          <w:iCs/>
+        </w:rPr>
+        <w:t xml:space="preserve"> </w:t>
+      </w:r>
+      <m:oMath>
+        <m:sSubSup>
+          <m:e>
+            <m:r>
+              <m:rPr>
+                <m:scr m:val="double-struck"/>
+                <m:sty m:val="p"/>
+              </m:rPr>
+              <m:t>F</m:t>
+            </m:r>
+          </m:e>
+          <m:sub>
+            <m:r>
+              <m:t>2</m:t>
+            </m:r>
+          </m:sub>
+          <m:sup>
+            <m:r>
+              <m:t>8</m:t>
+            </m:r>
+          </m:sup>
+        </m:sSubSup>
+      </m:oMath>
+      <w:r>
+        <w:rPr>
+          <w:i/>
+          <w:iCs/>
+        </w:rPr>
+        <w:t xml:space="preserve">.</w:t>
+      </w:r>
+    </w:p>
+    <w:p>
+      <w:pPr>
+        <w:pStyle w:val="BodyText"/>
+      </w:pPr>
+      <w:r>
+        <w:rPr>
+          <w:i/>
+          <w:iCs/>
+        </w:rPr>
+        <w:t xml:space="preserve">(iii) Lemma 6.1 applies with</w:t>
+      </w:r>
+      <w:r>
+        <w:rPr>
+          <w:i/>
+          <w:iCs/>
+        </w:rPr>
+        <w:t xml:space="preserve"> </w:t>
+      </w:r>
+      <m:oMath>
+        <m:r>
+          <m:t>Y</m:t>
+        </m:r>
+        <m:r>
+          <m:rPr>
+            <m:sty m:val="p"/>
+          </m:rPr>
+          <m:t>=</m:t>
+        </m:r>
+        <m:r>
+          <m:rPr>
+            <m:sty m:val="p"/>
+          </m:rPr>
+          <m:t>F</m:t>
+        </m:r>
+        <m:r>
+          <m:rPr>
+            <m:sty m:val="p"/>
+          </m:rPr>
+          <m:t>i</m:t>
+        </m:r>
+        <m:r>
+          <m:rPr>
+            <m:sty m:val="p"/>
+          </m:rPr>
+          <m:t>x</m:t>
+        </m:r>
+        <m:r>
+          <m:rPr>
+            <m:sty m:val="p"/>
+          </m:rPr>
+          <m:t>(</m:t>
+        </m:r>
+        <m:sSup>
+          <m:e>
+            <m:r>
+              <m:t>w</m:t>
+            </m:r>
+          </m:e>
+          <m:sup>
+            <m:r>
+              <m:rPr>
+                <m:sty m:val="p"/>
+              </m:rPr>
+              <m:t>−</m:t>
+            </m:r>
+            <m:r>
+              <m:t>1</m:t>
+            </m:r>
+          </m:sup>
+        </m:sSup>
+        <m:sSup>
+          <m:e>
+            <m:r>
+              <m:t>R</m:t>
+            </m:r>
+          </m:e>
+          <m:sup>
+            <m:r>
+              <m:t>8</m:t>
+            </m:r>
+          </m:sup>
+        </m:sSup>
+        <m:r>
+          <m:rPr>
+            <m:sty m:val="p"/>
+          </m:rPr>
+          <m:t>)</m:t>
+        </m:r>
+      </m:oMath>
+      <w:r>
+        <w:rPr>
+          <w:i/>
+          <w:iCs/>
+        </w:rPr>
+        <w:t xml:space="preserve"> </w:t>
+      </w:r>
+      <w:r>
+        <w:rPr>
+          <w:i/>
+          <w:iCs/>
+        </w:rPr>
+        <w:t xml:space="preserve">(</w:t>
+      </w:r>
+      <m:oMath>
+        <m:r>
+          <m:t>52</m:t>
+        </m:r>
+      </m:oMath>
+      <w:r>
+        <w:rPr>
+          <w:i/>
+          <w:iCs/>
+        </w:rPr>
+        <w:t xml:space="preserve"> </w:t>
+      </w:r>
+      <w:r>
+        <w:rPr>
+          <w:i/>
+          <w:iCs/>
+        </w:rPr>
+        <w:t xml:space="preserve">points, spanning), but the correction</w:t>
+      </w:r>
+      <w:r>
+        <w:rPr>
+          <w:i/>
+          <w:iCs/>
+        </w:rPr>
+        <w:t xml:space="preserve"> </w:t>
+      </w:r>
+      <m:oMath>
+        <m:r>
+          <m:t>c</m:t>
+        </m:r>
+        <m:r>
+          <m:rPr>
+            <m:sty m:val="p"/>
+          </m:rPr>
+          <m:t>=</m:t>
+        </m:r>
+        <m:sSup>
+          <m:e>
+            <m:r>
+              <m:t>w</m:t>
+            </m:r>
+          </m:e>
+          <m:sup>
+            <m:r>
+              <m:rPr>
+                <m:sty m:val="p"/>
+              </m:rPr>
+              <m:t>−</m:t>
+            </m:r>
+            <m:r>
+              <m:t>1</m:t>
+            </m:r>
+          </m:sup>
+        </m:sSup>
+        <m:sSup>
+          <m:e>
+            <m:r>
+              <m:t>R</m:t>
+            </m:r>
+          </m:e>
+          <m:sup>
+            <m:r>
+              <m:t>8</m:t>
+            </m:r>
+          </m:sup>
+        </m:sSup>
+      </m:oMath>
+      <w:r>
+        <w:rPr>
+          <w:i/>
+          <w:iCs/>
+        </w:rPr>
+        <w:t xml:space="preserve"> </w:t>
+      </w:r>
+      <w:r>
+        <w:rPr>
+          <w:i/>
+          <w:iCs/>
+        </w:rPr>
+        <w:t xml:space="preserve">is not an involution (cycle type</w:t>
+      </w:r>
+      <w:r>
+        <w:rPr>
+          <w:i/>
+          <w:iCs/>
+        </w:rPr>
+        <w:t xml:space="preserve"> </w:t>
+      </w:r>
+      <m:oMath>
+        <m:sSup>
+          <m:e>
+            <m:r>
+              <m:t>8</m:t>
+            </m:r>
+          </m:e>
+          <m:sup>
+            <m:r>
+              <m:t>8</m:t>
+            </m:r>
+          </m:sup>
+        </m:sSup>
+        <m:r>
+          <m:t> </m:t>
+        </m:r>
+        <m:sSup>
+          <m:e>
+            <m:r>
+              <m:t>4</m:t>
+            </m:r>
+          </m:e>
+          <m:sup>
+            <m:r>
+              <m:t>12</m:t>
+            </m:r>
+          </m:sup>
+        </m:sSup>
+        <m:r>
+          <m:t> </m:t>
+        </m:r>
+        <m:sSup>
+          <m:e>
+            <m:r>
+              <m:t>3</m:t>
+            </m:r>
+          </m:e>
+          <m:sup>
+            <m:r>
+              <m:t>12</m:t>
+            </m:r>
+          </m:sup>
+        </m:sSup>
+        <m:r>
+          <m:t> </m:t>
+        </m:r>
+        <m:sSup>
+          <m:e>
+            <m:r>
+              <m:t>2</m:t>
+            </m:r>
+          </m:e>
+          <m:sup>
+            <m:r>
+              <m:t>28</m:t>
+            </m:r>
+          </m:sup>
+        </m:sSup>
+        <m:r>
+          <m:t> </m:t>
+        </m:r>
+        <m:sSup>
+          <m:e>
+            <m:r>
+              <m:t>1</m:t>
+            </m:r>
+          </m:e>
+          <m:sup>
+            <m:r>
+              <m:t>52</m:t>
+            </m:r>
+          </m:sup>
+        </m:sSup>
+      </m:oMath>
+      <w:r>
+        <w:rPr>
+          <w:i/>
+          <w:iCs/>
+        </w:rPr>
+        <w:t xml:space="preserve">) and</w:t>
+      </w:r>
+      <w:r>
+        <w:rPr>
+          <w:i/>
+          <w:iCs/>
+        </w:rPr>
+        <w:t xml:space="preserve"> </w:t>
+      </w:r>
+      <m:oMath>
+        <m:sSub>
+          <m:e>
+            <m:r>
+              <m:t>C</m:t>
+            </m:r>
+          </m:e>
+          <m:sub>
+            <m:r>
+              <m:t>W</m:t>
+            </m:r>
+          </m:sub>
+        </m:sSub>
+        <m:r>
+          <m:rPr>
+            <m:sty m:val="p"/>
+          </m:rPr>
+          <m:t>(</m:t>
+        </m:r>
+        <m:r>
+          <m:t>c</m:t>
+        </m:r>
+        <m:r>
+          <m:rPr>
+            <m:sty m:val="p"/>
+          </m:rPr>
+          <m:t>)</m:t>
+        </m:r>
+        <m:r>
+          <m:rPr>
+            <m:sty m:val="p"/>
+          </m:rPr>
+          <m:t>=</m:t>
+        </m:r>
+        <m:r>
+          <m:rPr>
+            <m:sty m:val="p"/>
+          </m:rPr>
+          <m:t>{</m:t>
+        </m:r>
+        <m:r>
+          <m:rPr>
+            <m:sty m:val="p"/>
+          </m:rPr>
+          <m:t>±</m:t>
+        </m:r>
+        <m:r>
+          <m:t>1</m:t>
+        </m:r>
+        <m:r>
+          <m:rPr>
+            <m:sty m:val="p"/>
+          </m:rPr>
+          <m:t>}</m:t>
+        </m:r>
+      </m:oMath>
+      <w:r>
+        <w:rPr>
+          <w:i/>
+          <w:iCs/>
+        </w:rPr>
+        <w:t xml:space="preserve">. Hence</w:t>
+      </w:r>
+      <w:r>
+        <w:rPr>
+          <w:i/>
+          <w:iCs/>
+        </w:rPr>
+        <w:t xml:space="preserve"> </w:t>
+      </w:r>
+      <m:oMath>
+        <m:sSub>
+          <m:e>
+            <m:r>
+              <m:t>I</m:t>
+            </m:r>
+          </m:e>
+          <m:sub>
+            <m:r>
+              <m:t>8</m:t>
+            </m:r>
+          </m:sub>
+        </m:sSub>
+        <m:r>
+          <m:rPr>
+            <m:sty m:val="p"/>
+          </m:rPr>
+          <m:t>=</m:t>
+        </m:r>
+        <m:sSub>
+          <m:e>
+            <m:r>
+              <m:t>C</m:t>
+            </m:r>
+          </m:e>
+          <m:sub>
+            <m:r>
+              <m:t>8</m:t>
+            </m:r>
+          </m:sub>
+        </m:sSub>
+        <m:r>
+          <m:rPr>
+            <m:sty m:val="p"/>
+          </m:rPr>
+          <m:t>=</m:t>
+        </m:r>
+        <m:r>
+          <m:rPr>
+            <m:sty m:val="p"/>
+          </m:rPr>
+          <m:t>{</m:t>
+        </m:r>
+        <m:r>
+          <m:rPr>
+            <m:sty m:val="p"/>
+          </m:rPr>
+          <m:t>±</m:t>
+        </m:r>
+        <m:r>
+          <m:t>1</m:t>
+        </m:r>
+        <m:r>
+          <m:rPr>
+            <m:sty m:val="p"/>
+          </m:rPr>
+          <m:t>}</m:t>
+        </m:r>
+      </m:oMath>
+      <w:r>
+        <w:rPr>
+          <w:i/>
+          <w:iCs/>
+        </w:rPr>
+        <w:t xml:space="preserve">, and</w:t>
+      </w:r>
+      <w:r>
+        <w:rPr>
+          <w:i/>
+          <w:iCs/>
+        </w:rPr>
+        <w:t xml:space="preserve"> </w:t>
+      </w:r>
+      <m:oMath>
+        <m:sSub>
+          <m:e>
+            <m:r>
+              <m:t>I</m:t>
+            </m:r>
+          </m:e>
+          <m:sub>
+            <m:r>
+              <m:t>k</m:t>
+            </m:r>
+          </m:sub>
+        </m:sSub>
+        <m:r>
+          <m:rPr>
+            <m:sty m:val="p"/>
+          </m:rPr>
+          <m:t>=</m:t>
+        </m:r>
+        <m:sSub>
+          <m:e>
+            <m:r>
+              <m:t>C</m:t>
+            </m:r>
+          </m:e>
+          <m:sub>
+            <m:r>
+              <m:t>k</m:t>
+            </m:r>
+          </m:sub>
+        </m:sSub>
+      </m:oMath>
+      <w:r>
+        <w:rPr>
+          <w:i/>
+          <w:iCs/>
+        </w:rPr>
+        <w:t xml:space="preserve"> </w:t>
+      </w:r>
+      <w:r>
+        <w:rPr>
+          <w:i/>
+          <w:iCs/>
+        </w:rPr>
+        <w:t xml:space="preserve">for every</w:t>
+      </w:r>
+      <w:r>
+        <w:rPr>
+          <w:i/>
+          <w:iCs/>
+        </w:rPr>
+        <w:t xml:space="preserve"> </w:t>
+      </w:r>
+      <m:oMath>
+        <m:r>
+          <m:t>k</m:t>
+        </m:r>
+        <m:r>
+          <m:rPr>
+            <m:sty m:val="p"/>
+          </m:rPr>
+          <m:t>=</m:t>
+        </m:r>
+        <m:r>
+          <m:t>1</m:t>
+        </m:r>
+        <m:r>
+          <m:rPr>
+            <m:sty m:val="p"/>
+          </m:rPr>
+          <m:t>,</m:t>
+        </m:r>
+        <m:r>
+          <m:rPr>
+            <m:sty m:val="p"/>
+          </m:rPr>
+          <m:t>…</m:t>
+        </m:r>
+        <m:r>
+          <m:rPr>
+            <m:sty m:val="p"/>
+          </m:rPr>
+          <m:t>,</m:t>
+        </m:r>
+        <m:r>
+          <m:t>15</m:t>
+        </m:r>
+      </m:oMath>
+      <w:r>
+        <w:rPr>
+          <w:i/>
+          <w:iCs/>
+        </w:rPr>
+        <w:t xml:space="preserve">. The same holds at every lag on the</w:t>
+      </w:r>
+      <w:r>
+        <w:rPr>
+          <w:i/>
+          <w:iCs/>
+        </w:rPr>
+        <w:t xml:space="preserve"> </w:t>
+      </w:r>
+      <m:oMath>
+        <m:sSub>
+          <m:e>
+            <m:r>
+              <m:t>D</m:t>
+            </m:r>
+          </m:e>
+          <m:sub>
+            <m:r>
+              <m:t>9</m:t>
+            </m:r>
+          </m:sub>
+        </m:sSub>
+      </m:oMath>
+      <w:r>
+        <w:rPr>
+          <w:i/>
+          <w:iCs/>
+        </w:rPr>
+        <w:t xml:space="preserve"> </w:t>
+      </w:r>
+      <w:r>
+        <w:rPr>
+          <w:i/>
+          <w:iCs/>
+        </w:rPr>
+        <w:t xml:space="preserve">half-spin (the same clock;</w:t>
+      </w:r>
+      <w:r>
+        <w:rPr>
+          <w:i/>
+          <w:iCs/>
+        </w:rPr>
+        <w:t xml:space="preserve"> </w:t>
+      </w:r>
+      <m:oMath>
+        <m:r>
+          <m:rPr>
+            <m:sty m:val="p"/>
+          </m:rPr>
+          <m:t>|</m:t>
+        </m:r>
+        <m:r>
+          <m:t>W</m:t>
+        </m:r>
+        <m:r>
+          <m:rPr>
+            <m:sty m:val="p"/>
+          </m:rPr>
+          <m:t>(</m:t>
+        </m:r>
+        <m:sSub>
+          <m:e>
+            <m:r>
+              <m:t>D</m:t>
+            </m:r>
+          </m:e>
+          <m:sub>
+            <m:r>
+              <m:t>9</m:t>
+            </m:r>
+          </m:sub>
+        </m:sSub>
+        <m:r>
+          <m:rPr>
+            <m:sty m:val="p"/>
+          </m:rPr>
+          <m:t>)</m:t>
+        </m:r>
+        <m:r>
+          <m:rPr>
+            <m:sty m:val="p"/>
+          </m:rPr>
+          <m:t>|</m:t>
+        </m:r>
+        <m:r>
+          <m:rPr>
+            <m:sty m:val="p"/>
+          </m:rPr>
+          <m:t>=</m:t>
+        </m:r>
+        <m:r>
+          <m:t>92</m:t>
+        </m:r>
+        <m:r>
+          <m:rPr>
+            <m:sty m:val="p"/>
+          </m:rPr>
+          <m:t>,</m:t>
+        </m:r>
+        <m:r>
+          <m:t>897</m:t>
+        </m:r>
+        <m:r>
+          <m:rPr>
+            <m:sty m:val="p"/>
+          </m:rPr>
+          <m:t>,</m:t>
+        </m:r>
+        <m:r>
+          <m:t>280</m:t>
+        </m:r>
+      </m:oMath>
+      <w:r>
+        <w:rPr>
+          <w:i/>
+          <w:iCs/>
+        </w:rPr>
+        <w:t xml:space="preserve">) and on the</w:t>
+      </w:r>
+      <w:r>
+        <w:rPr>
+          <w:i/>
+          <w:iCs/>
+        </w:rPr>
+        <w:t xml:space="preserve"> </w:t>
+      </w:r>
+      <m:oMath>
+        <m:sSub>
+          <m:e>
+            <m:r>
+              <m:t>B</m:t>
+            </m:r>
+          </m:e>
+          <m:sub>
+            <m:r>
+              <m:t>6</m:t>
+            </m:r>
+          </m:sub>
+        </m:sSub>
+      </m:oMath>
+      <w:r>
+        <w:rPr>
+          <w:i/>
+          <w:iCs/>
+        </w:rPr>
+        <w:t xml:space="preserve"> </w:t>
+      </w:r>
+      <w:r>
+        <w:rPr>
+          <w:i/>
+          <w:iCs/>
+        </w:rPr>
+        <w:t xml:space="preserve">and</w:t>
+      </w:r>
+      <w:r>
+        <w:rPr>
+          <w:i/>
+          <w:iCs/>
+        </w:rPr>
+        <w:t xml:space="preserve"> </w:t>
+      </w:r>
+      <m:oMath>
+        <m:sSub>
+          <m:e>
+            <m:r>
+              <m:t>B</m:t>
+            </m:r>
+          </m:e>
+          <m:sub>
+            <m:r>
+              <m:t>7</m:t>
+            </m:r>
+          </m:sub>
+        </m:sSub>
+      </m:oMath>
+      <w:r>
+        <w:rPr>
+          <w:i/>
+          <w:iCs/>
+        </w:rPr>
+        <w:t xml:space="preserve"> </w:t>
+      </w:r>
+      <w:r>
+        <w:rPr>
+          <w:i/>
+          <w:iCs/>
+        </w:rPr>
+        <w:t xml:space="preserve">spinor boards.</w:t>
+      </w:r>
+    </w:p>
+    <w:p>
+      <w:pPr>
+        <w:pStyle w:val="BodyText"/>
+      </w:pPr>
+      <w:r>
+        <w:rPr>
+          <w:i/>
+          <w:iCs/>
+        </w:rPr>
+        <w:t xml:space="preserve">Consequently, among the spinor boards</w:t>
+      </w:r>
+      <w:r>
+        <w:rPr>
+          <w:i/>
+          <w:iCs/>
+        </w:rPr>
+        <w:t xml:space="preserve"> </w:t>
+      </w:r>
+      <m:oMath>
+        <m:sSub>
+          <m:e>
+            <m:r>
+              <m:t>B</m:t>
+            </m:r>
+          </m:e>
+          <m:sub>
+            <m:r>
+              <m:t>n</m:t>
+            </m:r>
+          </m:sub>
+        </m:sSub>
+      </m:oMath>
+      <w:r>
+        <w:rPr>
+          <w:i/>
+          <w:iCs/>
+        </w:rPr>
+        <w:t xml:space="preserve"> </w:t>
+      </w:r>
+      <w:r>
+        <w:rPr>
+          <w:i/>
+          <w:iCs/>
+        </w:rPr>
+        <w:t xml:space="preserve">with</w:t>
+      </w:r>
+      <w:r>
+        <w:rPr>
+          <w:i/>
+          <w:iCs/>
+        </w:rPr>
+        <w:t xml:space="preserve"> </w:t>
+      </w:r>
+      <m:oMath>
+        <m:r>
+          <m:t>3</m:t>
+        </m:r>
+        <m:r>
+          <m:rPr>
+            <m:sty m:val="p"/>
+          </m:rPr>
+          <m:t>≤</m:t>
+        </m:r>
+        <m:r>
+          <m:t>n</m:t>
+        </m:r>
+        <m:r>
+          <m:rPr>
+            <m:sty m:val="p"/>
+          </m:rPr>
+          <m:t>≤</m:t>
+        </m:r>
+        <m:r>
+          <m:t>8</m:t>
+        </m:r>
+      </m:oMath>
+      <w:r>
+        <w:rPr>
+          <w:i/>
+          <w:iCs/>
+        </w:rPr>
+        <w:t xml:space="preserve">, the shared grammar exceeds the centralizer only on</w:t>
+      </w:r>
+      <w:r>
+        <w:rPr>
+          <w:i/>
+          <w:iCs/>
+        </w:rPr>
+        <w:t xml:space="preserve"> </w:t>
+      </w:r>
+      <m:oMath>
+        <m:sSub>
+          <m:e>
+            <m:r>
+              <m:t>B</m:t>
+            </m:r>
+          </m:e>
+          <m:sub>
+            <m:r>
+              <m:t>4</m:t>
+            </m:r>
+          </m:sub>
+        </m:sSub>
+      </m:oMath>
+      <w:r>
+        <w:rPr>
+          <w:i/>
+          <w:iCs/>
+        </w:rPr>
+        <w:t xml:space="preserve"> </w:t>
+      </w:r>
+      <w:r>
+        <w:rPr>
+          <w:i/>
+          <w:iCs/>
+        </w:rPr>
+        <w:t xml:space="preserve">and, through the overgroup</w:t>
+      </w:r>
+      <w:r>
+        <w:rPr>
+          <w:i/>
+          <w:iCs/>
+        </w:rPr>
+        <w:t xml:space="preserve"> </w:t>
+      </w:r>
+      <m:oMath>
+        <m:r>
+          <m:t>W</m:t>
+        </m:r>
+        <m:r>
+          <m:rPr>
+            <m:sty m:val="p"/>
+          </m:rPr>
+          <m:t>(</m:t>
+        </m:r>
+        <m:sSub>
+          <m:e>
+            <m:r>
+              <m:t>D</m:t>
+            </m:r>
+          </m:e>
+          <m:sub>
+            <m:r>
+              <m:t>4</m:t>
+            </m:r>
+          </m:sub>
+        </m:sSub>
+        <m:r>
+          <m:rPr>
+            <m:sty m:val="p"/>
+          </m:rPr>
+          <m:t>)</m:t>
+        </m:r>
+      </m:oMath>
+      <w:r>
+        <w:rPr>
+          <w:i/>
+          <w:iCs/>
+        </w:rPr>
+        <w:t xml:space="preserve">, on</w:t>
+      </w:r>
+      <w:r>
+        <w:rPr>
+          <w:i/>
+          <w:iCs/>
+        </w:rPr>
+        <w:t xml:space="preserve"> </w:t>
+      </w:r>
+      <m:oMath>
+        <m:sSub>
+          <m:e>
+            <m:r>
+              <m:t>B</m:t>
+            </m:r>
+          </m:e>
+          <m:sub>
+            <m:r>
+              <m:t>3</m:t>
+            </m:r>
+          </m:sub>
+        </m:sSub>
+      </m:oMath>
+      <w:r>
+        <w:rPr>
+          <w:i/>
+          <w:iCs/>
+        </w:rPr>
+        <w:t xml:space="preserve"> </w:t>
+      </w:r>
+      <w:r>
+        <w:rPr>
+          <w:i/>
+          <w:iCs/>
+        </w:rPr>
+        <w:t xml:space="preserve">(§6.1). The mechanism of Theorem 6.2 — the half-turn agreeing with a Weyl element on an orbit that avoids the extreme ranks — recurs on</w:t>
+      </w:r>
+      <w:r>
+        <w:rPr>
+          <w:i/>
+          <w:iCs/>
+        </w:rPr>
+        <w:t xml:space="preserve"> </w:t>
+      </w:r>
+      <m:oMath>
+        <m:sSub>
+          <m:e>
+            <m:r>
+              <m:t>B</m:t>
+            </m:r>
+          </m:e>
+          <m:sub>
+            <m:r>
+              <m:t>8</m:t>
+            </m:r>
+          </m:sub>
+        </m:sSub>
+      </m:oMath>
+      <w:r>
+        <w:rPr>
+          <w:i/>
+          <w:iCs/>
+        </w:rPr>
+        <w:t xml:space="preserve">; its consequence does not, because the correction’s centralizer collapses to</w:t>
+      </w:r>
+      <w:r>
+        <w:rPr>
+          <w:i/>
+          <w:iCs/>
+        </w:rPr>
+        <w:t xml:space="preserve"> </w:t>
+      </w:r>
+      <m:oMath>
+        <m:r>
+          <m:rPr>
+            <m:sty m:val="p"/>
+          </m:rPr>
+          <m:t>{</m:t>
+        </m:r>
+        <m:r>
+          <m:rPr>
+            <m:sty m:val="p"/>
+          </m:rPr>
+          <m:t>±</m:t>
+        </m:r>
+        <m:r>
+          <m:t>1</m:t>
+        </m:r>
+        <m:r>
+          <m:rPr>
+            <m:sty m:val="p"/>
+          </m:rPr>
+          <m:t>}</m:t>
+        </m:r>
+      </m:oMath>
+      <w:r>
+        <w:rPr>
+          <w:i/>
+          <w:iCs/>
+        </w:rPr>
+        <w:t xml:space="preserve">.</w:t>
+      </w:r>
+    </w:p>
+    <w:p>
+      <w:pPr>
+        <w:pStyle w:val="BodyText"/>
+      </w:pPr>
+      <w:r>
+        <w:rPr>
+          <w:b/>
+          <w:bCs/>
+        </w:rPr>
+        <w:t xml:space="preserve">Remark 6.8.</w:t>
+      </w:r>
+      <w:r>
+        <w:t xml:space="preserve"> </w:t>
+      </w:r>
+      <w:r>
+        <w:t xml:space="preserve">On</w:t>
+      </w:r>
+      <w:r>
+        <w:t xml:space="preserve"> </w:t>
+      </w:r>
+      <m:oMath>
+        <m:sSub>
+          <m:e>
+            <m:r>
+              <m:t>B</m:t>
+            </m:r>
+          </m:e>
+          <m:sub>
+            <m:r>
+              <m:t>8</m:t>
+            </m:r>
+          </m:sub>
+        </m:sSub>
+      </m:oMath>
+      <w:r>
+        <w:t xml:space="preserve"> </w:t>
+      </w:r>
+      <w:r>
+        <w:t xml:space="preserve">the two carrying orbits are exactly the orbits whose ranks stay in</w:t>
+      </w:r>
+      <w:r>
+        <w:t xml:space="preserve"> </w:t>
+      </w:r>
+      <m:oMath>
+        <m:r>
+          <m:rPr>
+            <m:sty m:val="p"/>
+          </m:rPr>
+          <m:t>{</m:t>
+        </m:r>
+        <m:r>
+          <m:t>3</m:t>
+        </m:r>
+        <m:r>
+          <m:rPr>
+            <m:sty m:val="p"/>
+          </m:rPr>
+          <m:t>,</m:t>
+        </m:r>
+        <m:r>
+          <m:t>4</m:t>
+        </m:r>
+        <m:r>
+          <m:rPr>
+            <m:sty m:val="p"/>
+          </m:rPr>
+          <m:t>,</m:t>
+        </m:r>
+        <m:r>
+          <m:t>5</m:t>
+        </m:r>
+        <m:r>
+          <m:rPr>
+            <m:sty m:val="p"/>
+          </m:rPr>
+          <m:t>}</m:t>
+        </m:r>
+      </m:oMath>
+      <w:r>
+        <w:t xml:space="preserve">, equivalently those on which every half-turn rank-shift is</w:t>
+      </w:r>
+      <w:r>
+        <w:t xml:space="preserve"> </w:t>
+      </w:r>
+      <m:oMath>
+        <m:r>
+          <m:rPr>
+            <m:sty m:val="p"/>
+          </m:rPr>
+          <m:t>±</m:t>
+        </m:r>
+        <m:r>
+          <m:t>1</m:t>
+        </m:r>
+      </m:oMath>
+      <w:r>
+        <w:t xml:space="preserve">; on</w:t>
+      </w:r>
+      <w:r>
+        <w:t xml:space="preserve"> </w:t>
+      </w:r>
+      <m:oMath>
+        <m:sSub>
+          <m:e>
+            <m:r>
+              <m:t>B</m:t>
+            </m:r>
+          </m:e>
+          <m:sub>
+            <m:r>
+              <m:t>4</m:t>
+            </m:r>
+          </m:sub>
+        </m:sSub>
+      </m:oMath>
+      <w:r>
+        <w:t xml:space="preserve"> </w:t>
+      </w:r>
+      <w:r>
+        <w:t xml:space="preserve">the carrying orbit</w:t>
+      </w:r>
+      <w:r>
+        <w:t xml:space="preserve"> </w:t>
+      </w:r>
+      <m:oMath>
+        <m:sSub>
+          <m:e>
+            <m:r>
+              <m:t>O</m:t>
+            </m:r>
+          </m:e>
+          <m:sub>
+            <m:r>
+              <m:t>2</m:t>
+            </m:r>
+          </m:sub>
+        </m:sSub>
+      </m:oMath>
+      <w:r>
+        <w:t xml:space="preserve"> </w:t>
+      </w:r>
+      <w:r>
+        <w:t xml:space="preserve">likewise has ranks</w:t>
+      </w:r>
+      <w:r>
+        <w:t xml:space="preserve"> </w:t>
+      </w:r>
+      <m:oMath>
+        <m:r>
+          <m:rPr>
+            <m:sty m:val="p"/>
+          </m:rPr>
+          <m:t>{</m:t>
+        </m:r>
+        <m:r>
+          <m:t>1</m:t>
+        </m:r>
+        <m:r>
+          <m:rPr>
+            <m:sty m:val="p"/>
+          </m:rPr>
+          <m:t>,</m:t>
+        </m:r>
+        <m:r>
+          <m:t>2</m:t>
+        </m:r>
+        <m:r>
+          <m:rPr>
+            <m:sty m:val="p"/>
+          </m:rPr>
+          <m:t>,</m:t>
+        </m:r>
+        <m:r>
+          <m:t>3</m:t>
+        </m:r>
+        <m:r>
+          <m:rPr>
+            <m:sty m:val="p"/>
+          </m:rPr>
+          <m:t>}</m:t>
+        </m:r>
+      </m:oMath>
+      <w:r>
+        <w:t xml:space="preserve">. This is an observation on two boards. The expectations that the phenomenon of Theorem 6.2 recurs on</w:t>
+      </w:r>
+      <w:r>
+        <w:t xml:space="preserve"> </w:t>
+      </w:r>
+      <m:oMath>
+        <m:sSub>
+          <m:e>
+            <m:r>
+              <m:t>B</m:t>
+            </m:r>
+          </m:e>
+          <m:sub>
+            <m:r>
+              <m:t>8</m:t>
+            </m:r>
+          </m:sub>
+        </m:sSub>
+      </m:oMath>
+      <w:r>
+        <w:t xml:space="preserve">, that it marks the boards with a free clock (</w:t>
+      </w:r>
+      <w:r>
+        <w:t xml:space="preserve">“</w:t>
+      </w:r>
+      <m:oMath>
+        <m:r>
+          <m:t>n</m:t>
+        </m:r>
+      </m:oMath>
+      <w:r>
+        <w:t xml:space="preserve"> </w:t>
+      </w:r>
+      <w:r>
+        <w:t xml:space="preserve">a power of 2”</w:t>
+      </w:r>
+      <w:r>
+        <w:t xml:space="preserve">), that</w:t>
+      </w:r>
+      <w:r>
+        <w:t xml:space="preserve"> </w:t>
+      </w:r>
+      <m:oMath>
+        <m:r>
+          <m:rPr>
+            <m:sty m:val="p"/>
+          </m:rPr>
+          <m:t>−</m:t>
+        </m:r>
+        <m:r>
+          <m:t>1</m:t>
+        </m:r>
+      </m:oMath>
+      <w:r>
+        <w:t xml:space="preserve"> </w:t>
+      </w:r>
+      <w:r>
+        <w:t xml:space="preserve">exchanges the two carrying orbits, and that</w:t>
+      </w:r>
+      <w:r>
+        <w:t xml:space="preserve"> </w:t>
+      </w:r>
+      <m:oMath>
+        <m:sSub>
+          <m:e>
+            <m:r>
+              <m:t>D</m:t>
+            </m:r>
+          </m:e>
+          <m:sub>
+            <m:r>
+              <m:t>9</m:t>
+            </m:r>
+          </m:sub>
+        </m:sSub>
+      </m:oMath>
+      <w:r>
+        <w:t xml:space="preserve"> </w:t>
+      </w:r>
+      <w:r>
+        <w:t xml:space="preserve">carries a survivor at a lag coprime to</w:t>
+      </w:r>
+      <w:r>
+        <w:t xml:space="preserve"> </w:t>
+      </w:r>
+      <m:oMath>
+        <m:r>
+          <m:t>16</m:t>
+        </m:r>
+      </m:oMath>
+      <w:r>
+        <w:t xml:space="preserve"> </w:t>
+      </w:r>
+      <w:r>
+        <w:t xml:space="preserve">were all inverted by the computation.</w:t>
+      </w:r>
+    </w:p>
     <w:bookmarkEnd w:id="29"/>
-    <w:bookmarkStart w:id="30" w:name="homomesy-of-the-label-counts"/>
+    <w:bookmarkEnd w:id="30"/>
+    <w:bookmarkStart w:id="31" w:name="homomesy-of-the-label-counts"/>
     <w:p>
       <w:pPr>
         <w:pStyle w:val="Heading1"/>
@@ -51028,8 +53763,8 @@
         <w:t xml:space="preserve">on each 27-sheet but not on the 56 (the poles are fixed points).</w:t>
       </w:r>
     </w:p>
-    <w:bookmarkEnd w:id="30"/>
-    <w:bookmarkStart w:id="31" w:name="the-computational-model"/>
+    <w:bookmarkEnd w:id="31"/>
+    <w:bookmarkStart w:id="32" w:name="the-computational-model"/>
     <w:p>
       <w:pPr>
         <w:pStyle w:val="Heading1"/>
@@ -56626,8 +59361,8 @@
         <w:t xml:space="preserve">.</w:t>
       </w:r>
     </w:p>
-    <w:bookmarkEnd w:id="31"/>
-    <w:bookmarkStart w:id="32" w:name="the-bitangent-bridge"/>
+    <w:bookmarkEnd w:id="32"/>
+    <w:bookmarkStart w:id="33" w:name="the-bitangent-bridge"/>
     <w:p>
       <w:pPr>
         <w:pStyle w:val="Heading1"/>
@@ -62109,8 +64844,8 @@
         <w:t xml:space="preserve">of the fixed even theta characteristic.</w:t>
       </w:r>
     </w:p>
-    <w:bookmarkEnd w:id="32"/>
-    <w:bookmarkStart w:id="33" w:name="open-problems"/>
+    <w:bookmarkEnd w:id="33"/>
+    <w:bookmarkStart w:id="34" w:name="open-problems"/>
     <w:p>
       <w:pPr>
         <w:pStyle w:val="Heading1"/>
@@ -62592,32 +65327,18 @@
           <w:numId w:val="1001"/>
         </w:numPr>
       </w:pPr>
-      <m:oMath>
-        <m:sSub>
-          <m:e>
-            <m:r>
-              <m:t>B</m:t>
-            </m:r>
-          </m:e>
-          <m:sub>
-            <m:r>
-              <m:t>8</m:t>
-            </m:r>
-          </m:sub>
-        </m:sSub>
-      </m:oMath>
       <w:r>
         <w:rPr>
           <w:b/>
           <w:bCs/>
         </w:rPr>
-        <w:t xml:space="preserve">.</w:t>
-      </w:r>
-      <w:r>
-        <w:t xml:space="preserve"> </w:t>
-      </w:r>
-      <w:r>
-        <w:t xml:space="preserve">Does the phenomenon of Theorem 6.2 recur on the</w:t>
+        <w:t xml:space="preserve">The spinor boards.</w:t>
+      </w:r>
+      <w:r>
+        <w:t xml:space="preserve"> </w:t>
+      </w:r>
+      <w:r>
+        <w:t xml:space="preserve">Among</w:t>
       </w:r>
       <w:r>
         <w:t xml:space="preserve"> </w:t>
@@ -62631,6 +65352,36 @@
           </m:e>
           <m:sub>
             <m:r>
+              <m:t>3</m:t>
+            </m:r>
+          </m:sub>
+        </m:sSub>
+        <m:r>
+          <m:rPr>
+            <m:sty m:val="p"/>
+          </m:rPr>
+          <m:t>,</m:t>
+        </m:r>
+        <m:r>
+          <m:rPr>
+            <m:sty m:val="p"/>
+          </m:rPr>
+          <m:t>…</m:t>
+        </m:r>
+        <m:r>
+          <m:rPr>
+            <m:sty m:val="p"/>
+          </m:rPr>
+          <m:t>,</m:t>
+        </m:r>
+        <m:sSub>
+          <m:e>
+            <m:r>
+              <m:t>B</m:t>
+            </m:r>
+          </m:e>
+          <m:sub>
+            <m:r>
               <m:t>8</m:t>
             </m:r>
           </m:sub>
@@ -62640,19 +65391,7 @@
         <w:t xml:space="preserve"> </w:t>
       </w:r>
       <w:r>
-        <w:t xml:space="preserve">spinor board — the next board on which the clock acts freely — and is</w:t>
-      </w:r>
-      <w:r>
-        <w:t xml:space="preserve"> </w:t>
-      </w:r>
-      <w:r>
-        <w:t xml:space="preserve">“the shared grammar exceeds the centralizer at some lag”</w:t>
-      </w:r>
-      <w:r>
-        <w:t xml:space="preserve"> </w:t>
-      </w:r>
-      <w:r>
-        <w:t xml:space="preserve">equivalent, among the</w:t>
+        <w:t xml:space="preserve">the shared grammar exceeds the centralizer only on</w:t>
       </w:r>
       <w:r>
         <w:t xml:space="preserve"> </w:t>
@@ -62666,6 +65405,110 @@
           </m:e>
           <m:sub>
             <m:r>
+              <m:t>4</m:t>
+            </m:r>
+          </m:sub>
+        </m:sSub>
+      </m:oMath>
+      <w:r>
+        <w:t xml:space="preserve"> </w:t>
+      </w:r>
+      <w:r>
+        <w:t xml:space="preserve">and, through</w:t>
+      </w:r>
+      <w:r>
+        <w:t xml:space="preserve"> </w:t>
+      </w:r>
+      <m:oMath>
+        <m:r>
+          <m:t>W</m:t>
+        </m:r>
+        <m:r>
+          <m:rPr>
+            <m:sty m:val="p"/>
+          </m:rPr>
+          <m:t>(</m:t>
+        </m:r>
+        <m:sSub>
+          <m:e>
+            <m:r>
+              <m:t>D</m:t>
+            </m:r>
+          </m:e>
+          <m:sub>
+            <m:r>
+              <m:t>4</m:t>
+            </m:r>
+          </m:sub>
+        </m:sSub>
+        <m:r>
+          <m:rPr>
+            <m:sty m:val="p"/>
+          </m:rPr>
+          <m:t>)</m:t>
+        </m:r>
+      </m:oMath>
+      <w:r>
+        <w:t xml:space="preserve">, on</w:t>
+      </w:r>
+      <w:r>
+        <w:t xml:space="preserve"> </w:t>
+      </w:r>
+      <m:oMath>
+        <m:sSub>
+          <m:e>
+            <m:r>
+              <m:t>B</m:t>
+            </m:r>
+          </m:e>
+          <m:sub>
+            <m:r>
+              <m:t>3</m:t>
+            </m:r>
+          </m:sub>
+        </m:sSub>
+      </m:oMath>
+      <w:r>
+        <w:t xml:space="preserve"> </w:t>
+      </w:r>
+      <w:r>
+        <w:t xml:space="preserve">(Proposition 6.7). Is</w:t>
+      </w:r>
+      <w:r>
+        <w:t xml:space="preserve"> </w:t>
+      </w:r>
+      <m:oMath>
+        <m:sSub>
+          <m:e>
+            <m:r>
+              <m:t>B</m:t>
+            </m:r>
+          </m:e>
+          <m:sub>
+            <m:r>
+              <m:t>4</m:t>
+            </m:r>
+          </m:sub>
+        </m:sSub>
+      </m:oMath>
+      <w:r>
+        <w:t xml:space="preserve"> </w:t>
+      </w:r>
+      <w:r>
+        <w:t xml:space="preserve">the only</w:t>
+      </w:r>
+      <w:r>
+        <w:t xml:space="preserve"> </w:t>
+      </w:r>
+      <m:oMath>
+        <m:sSub>
+          <m:e>
+            <m:r>
+              <m:t>B</m:t>
+            </m:r>
+          </m:e>
+          <m:sub>
+            <m:r>
               <m:t>n</m:t>
             </m:r>
           </m:sub>
@@ -62675,7 +65518,7 @@
         <w:t xml:space="preserve"> </w:t>
       </w:r>
       <w:r>
-        <w:t xml:space="preserve">spinors, to</w:t>
+        <w:t xml:space="preserve">spinor board with</w:t>
       </w:r>
       <w:r>
         <w:t xml:space="preserve"> </w:t>
@@ -62684,12 +65527,110 @@
         <m:r>
           <m:t>n</m:t>
         </m:r>
-      </m:oMath>
-      <w:r>
-        <w:t xml:space="preserve"> </w:t>
-      </w:r>
-      <w:r>
-        <w:t xml:space="preserve">being a power of 2?</w:t>
+        <m:r>
+          <m:rPr>
+            <m:sty m:val="p"/>
+          </m:rPr>
+          <m:t>≥</m:t>
+        </m:r>
+        <m:r>
+          <m:t>4</m:t>
+        </m:r>
+      </m:oMath>
+      <w:r>
+        <w:t xml:space="preserve"> </w:t>
+      </w:r>
+      <w:r>
+        <w:t xml:space="preserve">on which it does? The clock is free exactly when</w:t>
+      </w:r>
+      <w:r>
+        <w:t xml:space="preserve"> </w:t>
+      </w:r>
+      <m:oMath>
+        <m:r>
+          <m:t>n</m:t>
+        </m:r>
+      </m:oMath>
+      <w:r>
+        <w:t xml:space="preserve"> </w:t>
+      </w:r>
+      <w:r>
+        <w:t xml:space="preserve">is a power of 2, and</w:t>
+      </w:r>
+      <w:r>
+        <w:t xml:space="preserve"> </w:t>
+      </w:r>
+      <m:oMath>
+        <m:sSub>
+          <m:e>
+            <m:r>
+              <m:t>B</m:t>
+            </m:r>
+          </m:e>
+          <m:sub>
+            <m:r>
+              <m:t>16</m:t>
+            </m:r>
+          </m:sub>
+        </m:sSub>
+      </m:oMath>
+      <w:r>
+        <w:t xml:space="preserve"> </w:t>
+      </w:r>
+      <w:r>
+        <w:t xml:space="preserve">(65,536 weights) is the next free case; is there a proof that the correction’s centralizer is</w:t>
+      </w:r>
+      <w:r>
+        <w:t xml:space="preserve"> </w:t>
+      </w:r>
+      <m:oMath>
+        <m:r>
+          <m:rPr>
+            <m:sty m:val="p"/>
+          </m:rPr>
+          <m:t>{</m:t>
+        </m:r>
+        <m:r>
+          <m:rPr>
+            <m:sty m:val="p"/>
+          </m:rPr>
+          <m:t>±</m:t>
+        </m:r>
+        <m:r>
+          <m:t>1</m:t>
+        </m:r>
+        <m:r>
+          <m:rPr>
+            <m:sty m:val="p"/>
+          </m:rPr>
+          <m:t>}</m:t>
+        </m:r>
+      </m:oMath>
+      <w:r>
+        <w:t xml:space="preserve"> </w:t>
+      </w:r>
+      <w:r>
+        <w:t xml:space="preserve">for every</w:t>
+      </w:r>
+      <w:r>
+        <w:t xml:space="preserve"> </w:t>
+      </w:r>
+      <m:oMath>
+        <m:r>
+          <m:t>n</m:t>
+        </m:r>
+        <m:r>
+          <m:rPr>
+            <m:sty m:val="p"/>
+          </m:rPr>
+          <m:t>&gt;</m:t>
+        </m:r>
+        <m:r>
+          <m:t>4</m:t>
+        </m:r>
+      </m:oMath>
+      <w:r>
+        <w:t xml:space="preserve">?</w:t>
       </w:r>
     </w:p>
     <w:p>
@@ -62942,8 +65883,8 @@
         <w:t xml:space="preserve">vector boards inner (Proposition 5.8)?</w:t>
       </w:r>
     </w:p>
-    <w:bookmarkEnd w:id="33"/>
-    <w:bookmarkStart w:id="34" w:name="appendix-a.-the-literature-search"/>
+    <w:bookmarkEnd w:id="34"/>
+    <w:bookmarkStart w:id="35" w:name="appendix-a.-the-literature-search"/>
     <w:p>
       <w:pPr>
         <w:pStyle w:val="Heading1"/>
@@ -63369,8 +66310,8 @@
         <w:t xml:space="preserve">MathSciNet and the full text of zbMATH’s reviews; theses and work in progress. A reader who knows Theorems A–F as corollaries of the Rush–Shi conjugacy or of the toggle description of rowmotion is asked for the reference.</w:t>
       </w:r>
     </w:p>
-    <w:bookmarkEnd w:id="34"/>
-    <w:bookmarkStart w:id="35" w:name="appendix-b.-verification"/>
+    <w:bookmarkEnd w:id="35"/>
+    <w:bookmarkStart w:id="36" w:name="appendix-b.-verification"/>
     <w:p>
       <w:pPr>
         <w:pStyle w:val="Heading1"/>
@@ -64519,6 +67460,55 @@
               <w:pStyle w:val="Compact"/>
             </w:pPr>
             <w:r>
+              <w:t xml:space="preserve">Prop. 6.7</w:t>
+            </w:r>
+          </w:p>
+        </w:tc>
+        <w:tc>
+          <w:tcPr/>
+          <w:p>
+            <w:pPr>
+              <w:pStyle w:val="Compact"/>
+            </w:pPr>
+            <w:r>
+              <w:rPr>
+                <w:rStyle w:val="VerbatimChar"/>
+              </w:rPr>
+              <w:t xml:space="preserve">verify_stone_bc_b8_halfturn.py</w:t>
+            </w:r>
+          </w:p>
+        </w:tc>
+        <w:tc>
+          <w:tcPr/>
+          <w:p>
+            <w:pPr>
+              <w:pStyle w:val="Compact"/>
+            </w:pPr>
+            <w:r>
+              <w:t xml:space="preserve">14 + 4 inverted</w:t>
+            </w:r>
+          </w:p>
+        </w:tc>
+        <w:tc>
+          <w:tcPr/>
+          <w:p>
+            <w:pPr>
+              <w:pStyle w:val="Compact"/>
+            </w:pPr>
+            <w:r>
+              <w:t xml:space="preserve">none</w:t>
+            </w:r>
+          </w:p>
+        </w:tc>
+      </w:tr>
+      <w:tr>
+        <w:tc>
+          <w:tcPr/>
+          <w:p>
+            <w:pPr>
+              <w:pStyle w:val="Compact"/>
+            </w:pPr>
+            <w:r>
               <w:t xml:space="preserve">Prop. 9.1</w:t>
             </w:r>
           </w:p>
@@ -64746,8 +67736,8 @@
         <w:t xml:space="preserve">counts record expectations registered before the computation that the computation refuted; each is described where it is informative (Remarks 3.7, 5.5, 5.9; Propositions 8.2, 8.4). The scripts and logs are archived with the authors and will be deposited with the paper.</w:t>
       </w:r>
     </w:p>
-    <w:bookmarkEnd w:id="35"/>
-    <w:bookmarkStart w:id="36" w:name="references"/>
+    <w:bookmarkEnd w:id="36"/>
+    <w:bookmarkStart w:id="37" w:name="references"/>
     <w:p>
       <w:pPr>
         <w:pStyle w:val="Heading1"/>
@@ -65610,7 +68600,7 @@
         <w:t xml:space="preserve">Graduate Texts in Mathematics 251, Springer, 2009.</w:t>
       </w:r>
     </w:p>
-    <w:bookmarkEnd w:id="36"/>
+    <w:bookmarkEnd w:id="37"/>
     <w:sectPr>
       <w:footnotePr>
         <w:numRestart w:val="eachSect"/>

</xml_diff>

<commit_message>
registry v1.38: Stone BE executed and sealed (SM-069) - the 16-cube at the orbit level: free clock 32^2048, O1 shift +-8, SIXTEEN carrying orbits all by -(e2e3)(e4e5)...(e14e15) = exactly the rank band {7,8,9} (third board), w does not commute with R^16, C_W(c) = {+-1}, Stab_W(Fix c) = <-1,w>, C_W(R^16) = {+-1}, so I_16 cap Stab(Fix c) = {+-1} by Lemma B; |I_16| not claimed; 9 PASS + 2 INVERTED; papers v1.0 and v2.0 rebuilt with SM-068 (Lemma 6.9, Prop 6.10) and SM-069 (Prop 6.11)
Co-Authored-By: Claude Fable 5.1 <noreply@anthropic.com>
</commit_message>
<xml_diff>
--- a/joint_paper/Roof_and_Clock_MATH_v2.docx
+++ b/joint_paper/Roof_and_Clock_MATH_v2.docx
@@ -6611,7 +6611,82 @@
         <w:t xml:space="preserve"> </w:t>
       </w:r>
       <w:r>
-        <w:t xml:space="preserve">at every lag (Proposition 6.7).</w:t>
+        <w:t xml:space="preserve">at every lag (Proposition 6.7). The reason is a commutation (Lemma 6.9): the Weyl element nearest to the half-turn commutes with it on</w:t>
+      </w:r>
+      <w:r>
+        <w:t xml:space="preserve"> </w:t>
+      </w:r>
+      <m:oMath>
+        <m:sSub>
+          <m:e>
+            <m:r>
+              <m:t>B</m:t>
+            </m:r>
+          </m:e>
+          <m:sub>
+            <m:r>
+              <m:t>4</m:t>
+            </m:r>
+          </m:sub>
+        </m:sSub>
+      </m:oMath>
+      <w:r>
+        <w:t xml:space="preserve"> </w:t>
+      </w:r>
+      <w:r>
+        <w:t xml:space="preserve">and on no other enumerable spinor board (Proposition 6.10); on</w:t>
+      </w:r>
+      <w:r>
+        <w:t xml:space="preserve"> </w:t>
+      </w:r>
+      <m:oMath>
+        <m:sSub>
+          <m:e>
+            <m:r>
+              <m:t>B</m:t>
+            </m:r>
+          </m:e>
+          <m:sub>
+            <m:r>
+              <m:t>16</m:t>
+            </m:r>
+          </m:sub>
+        </m:sSub>
+      </m:oMath>
+      <w:r>
+        <w:t xml:space="preserve">, computed at the orbit level, the same element again fails to commute and the correction’s centralizer is again</w:t>
+      </w:r>
+      <w:r>
+        <w:t xml:space="preserve"> </w:t>
+      </w:r>
+      <m:oMath>
+        <m:r>
+          <m:rPr>
+            <m:sty m:val="p"/>
+          </m:rPr>
+          <m:t>{</m:t>
+        </m:r>
+        <m:r>
+          <m:rPr>
+            <m:sty m:val="p"/>
+          </m:rPr>
+          <m:t>±</m:t>
+        </m:r>
+        <m:r>
+          <m:t>1</m:t>
+        </m:r>
+        <m:r>
+          <m:rPr>
+            <m:sty m:val="p"/>
+          </m:rPr>
+          <m:t>}</m:t>
+        </m:r>
+      </m:oMath>
+      <w:r>
+        <w:t xml:space="preserve"> </w:t>
+      </w:r>
+      <w:r>
+        <w:t xml:space="preserve">(Proposition 6.11).</w:t>
       </w:r>
     </w:p>
     <w:p>
@@ -52226,7 +52301,7 @@
         </m:r>
       </m:oMath>
       <w:r>
-        <w:t xml:space="preserve">. This is an observation on two boards. The expectations that the phenomenon of Theorem 6.2 recurs on</w:t>
+        <w:t xml:space="preserve">. On</w:t>
       </w:r>
       <w:r>
         <w:t xml:space="preserve"> </w:t>
@@ -52240,6 +52315,73 @@
           </m:e>
           <m:sub>
             <m:r>
+              <m:t>16</m:t>
+            </m:r>
+          </m:sub>
+        </m:sSub>
+      </m:oMath>
+      <w:r>
+        <w:t xml:space="preserve"> </w:t>
+      </w:r>
+      <w:r>
+        <w:t xml:space="preserve">the sixteen carrying orbits are again exactly the band</w:t>
+      </w:r>
+      <w:r>
+        <w:t xml:space="preserve"> </w:t>
+      </w:r>
+      <m:oMath>
+        <m:r>
+          <m:rPr>
+            <m:sty m:val="p"/>
+          </m:rPr>
+          <m:t>{</m:t>
+        </m:r>
+        <m:r>
+          <m:t>7</m:t>
+        </m:r>
+        <m:r>
+          <m:rPr>
+            <m:sty m:val="p"/>
+          </m:rPr>
+          <m:t>,</m:t>
+        </m:r>
+        <m:r>
+          <m:t>8</m:t>
+        </m:r>
+        <m:r>
+          <m:rPr>
+            <m:sty m:val="p"/>
+          </m:rPr>
+          <m:t>,</m:t>
+        </m:r>
+        <m:r>
+          <m:t>9</m:t>
+        </m:r>
+        <m:r>
+          <m:rPr>
+            <m:sty m:val="p"/>
+          </m:rPr>
+          <m:t>}</m:t>
+        </m:r>
+      </m:oMath>
+      <w:r>
+        <w:t xml:space="preserve"> </w:t>
+      </w:r>
+      <w:r>
+        <w:t xml:space="preserve">(Proposition 6.11). This is an observation on three boards. The expectations that the phenomenon of Theorem 6.2 recurs on</w:t>
+      </w:r>
+      <w:r>
+        <w:t xml:space="preserve"> </w:t>
+      </w:r>
+      <m:oMath>
+        <m:sSub>
+          <m:e>
+            <m:r>
+              <m:t>B</m:t>
+            </m:r>
+          </m:e>
+          <m:sub>
+            <m:r>
               <m:t>8</m:t>
             </m:r>
           </m:sub>
@@ -52321,6 +52463,4159 @@
       </w:r>
       <w:r>
         <w:t xml:space="preserve">were all inverted by the computation.</w:t>
+      </w:r>
+    </w:p>
+    <w:p>
+      <w:pPr>
+        <w:pStyle w:val="BodyText"/>
+      </w:pPr>
+      <w:r>
+        <w:rPr>
+          <w:b/>
+          <w:bCs/>
+        </w:rPr>
+        <w:t xml:space="preserve">Lemma 6.9 (the half-turn criterion).</w:t>
+      </w:r>
+      <w:r>
+        <w:t xml:space="preserve"> </w:t>
+      </w:r>
+      <w:r>
+        <w:rPr>
+          <w:i/>
+          <w:iCs/>
+        </w:rPr>
+        <w:t xml:space="preserve">Let</w:t>
+      </w:r>
+      <w:r>
+        <w:rPr>
+          <w:i/>
+          <w:iCs/>
+        </w:rPr>
+        <w:t xml:space="preserve"> </w:t>
+      </w:r>
+      <m:oMath>
+        <m:r>
+          <m:t>m</m:t>
+        </m:r>
+        <m:r>
+          <m:rPr>
+            <m:sty m:val="p"/>
+          </m:rPr>
+          <m:t>=</m:t>
+        </m:r>
+        <m:r>
+          <m:t>h</m:t>
+        </m:r>
+        <m:r>
+          <m:rPr>
+            <m:sty m:val="p"/>
+          </m:rPr>
+          <m:t>/</m:t>
+        </m:r>
+        <m:r>
+          <m:t>2</m:t>
+        </m:r>
+      </m:oMath>
+      <w:r>
+        <w:rPr>
+          <w:i/>
+          <w:iCs/>
+        </w:rPr>
+        <w:t xml:space="preserve">,</w:t>
+      </w:r>
+      <w:r>
+        <w:rPr>
+          <w:i/>
+          <w:iCs/>
+        </w:rPr>
+        <w:t xml:space="preserve"> </w:t>
+      </w:r>
+      <m:oMath>
+        <m:r>
+          <m:t>w</m:t>
+        </m:r>
+        <m:r>
+          <m:rPr>
+            <m:sty m:val="p"/>
+          </m:rPr>
+          <m:t>∈</m:t>
+        </m:r>
+        <m:r>
+          <m:t>W</m:t>
+        </m:r>
+      </m:oMath>
+      <w:r>
+        <w:rPr>
+          <w:i/>
+          <w:iCs/>
+        </w:rPr>
+        <w:t xml:space="preserve"> </w:t>
+      </w:r>
+      <w:r>
+        <w:rPr>
+          <w:i/>
+          <w:iCs/>
+        </w:rPr>
+        <w:t xml:space="preserve">and</w:t>
+      </w:r>
+      <w:r>
+        <w:rPr>
+          <w:i/>
+          <w:iCs/>
+        </w:rPr>
+        <w:t xml:space="preserve"> </w:t>
+      </w:r>
+      <m:oMath>
+        <m:r>
+          <m:t>c</m:t>
+        </m:r>
+        <m:r>
+          <m:rPr>
+            <m:sty m:val="p"/>
+          </m:rPr>
+          <m:t>=</m:t>
+        </m:r>
+        <m:sSup>
+          <m:e>
+            <m:r>
+              <m:t>w</m:t>
+            </m:r>
+          </m:e>
+          <m:sup>
+            <m:r>
+              <m:rPr>
+                <m:sty m:val="p"/>
+              </m:rPr>
+              <m:t>−</m:t>
+            </m:r>
+            <m:r>
+              <m:t>1</m:t>
+            </m:r>
+          </m:sup>
+        </m:sSup>
+        <m:sSup>
+          <m:e>
+            <m:r>
+              <m:t>R</m:t>
+            </m:r>
+          </m:e>
+          <m:sup>
+            <m:r>
+              <m:t>m</m:t>
+            </m:r>
+          </m:sup>
+        </m:sSup>
+      </m:oMath>
+      <w:r>
+        <w:rPr>
+          <w:i/>
+          <w:iCs/>
+        </w:rPr>
+        <w:t xml:space="preserve">. (i)</w:t>
+      </w:r>
+      <w:r>
+        <w:rPr>
+          <w:i/>
+          <w:iCs/>
+        </w:rPr>
+        <w:t xml:space="preserve"> </w:t>
+      </w:r>
+      <m:oMath>
+        <m:sSup>
+          <m:e>
+            <m:r>
+              <m:t>c</m:t>
+            </m:r>
+          </m:e>
+          <m:sup>
+            <m:r>
+              <m:t>2</m:t>
+            </m:r>
+          </m:sup>
+        </m:sSup>
+        <m:r>
+          <m:rPr>
+            <m:sty m:val="p"/>
+          </m:rPr>
+          <m:t>=</m:t>
+        </m:r>
+        <m:r>
+          <m:t>1</m:t>
+        </m:r>
+      </m:oMath>
+      <w:r>
+        <w:rPr>
+          <w:i/>
+          <w:iCs/>
+        </w:rPr>
+        <w:t xml:space="preserve"> </w:t>
+      </w:r>
+      <w:r>
+        <w:rPr>
+          <w:i/>
+          <w:iCs/>
+        </w:rPr>
+        <w:t xml:space="preserve">if and only if</w:t>
+      </w:r>
+      <w:r>
+        <w:rPr>
+          <w:i/>
+          <w:iCs/>
+        </w:rPr>
+        <w:t xml:space="preserve"> </w:t>
+      </w:r>
+      <m:oMath>
+        <m:sSup>
+          <m:e>
+            <m:r>
+              <m:t>R</m:t>
+            </m:r>
+          </m:e>
+          <m:sup>
+            <m:r>
+              <m:t>m</m:t>
+            </m:r>
+          </m:sup>
+        </m:sSup>
+        <m:r>
+          <m:t>w</m:t>
+        </m:r>
+        <m:sSup>
+          <m:e>
+            <m:r>
+              <m:t>R</m:t>
+            </m:r>
+          </m:e>
+          <m:sup>
+            <m:r>
+              <m:t>m</m:t>
+            </m:r>
+          </m:sup>
+        </m:sSup>
+        <m:r>
+          <m:rPr>
+            <m:sty m:val="p"/>
+          </m:rPr>
+          <m:t>=</m:t>
+        </m:r>
+        <m:sSup>
+          <m:e>
+            <m:r>
+              <m:t>w</m:t>
+            </m:r>
+          </m:e>
+          <m:sup>
+            <m:r>
+              <m:rPr>
+                <m:sty m:val="p"/>
+              </m:rPr>
+              <m:t>−</m:t>
+            </m:r>
+            <m:r>
+              <m:t>1</m:t>
+            </m:r>
+          </m:sup>
+        </m:sSup>
+      </m:oMath>
+      <w:r>
+        <w:rPr>
+          <w:i/>
+          <w:iCs/>
+        </w:rPr>
+        <w:t xml:space="preserve">; for an involution</w:t>
+      </w:r>
+      <w:r>
+        <w:rPr>
+          <w:i/>
+          <w:iCs/>
+        </w:rPr>
+        <w:t xml:space="preserve"> </w:t>
+      </w:r>
+      <m:oMath>
+        <m:r>
+          <m:t>w</m:t>
+        </m:r>
+      </m:oMath>
+      <w:r>
+        <w:rPr>
+          <w:i/>
+          <w:iCs/>
+        </w:rPr>
+        <w:t xml:space="preserve"> </w:t>
+      </w:r>
+      <w:r>
+        <w:rPr>
+          <w:i/>
+          <w:iCs/>
+        </w:rPr>
+        <w:t xml:space="preserve">this says</w:t>
+      </w:r>
+      <w:r>
+        <w:rPr>
+          <w:i/>
+          <w:iCs/>
+        </w:rPr>
+        <w:t xml:space="preserve"> </w:t>
+      </w:r>
+      <m:oMath>
+        <m:r>
+          <m:t>w</m:t>
+        </m:r>
+        <m:r>
+          <m:rPr>
+            <m:sty m:val="p"/>
+          </m:rPr>
+          <m:t>∈</m:t>
+        </m:r>
+        <m:sSub>
+          <m:e>
+            <m:r>
+              <m:t>C</m:t>
+            </m:r>
+          </m:e>
+          <m:sub>
+            <m:r>
+              <m:t>W</m:t>
+            </m:r>
+          </m:sub>
+        </m:sSub>
+        <m:r>
+          <m:rPr>
+            <m:sty m:val="p"/>
+          </m:rPr>
+          <m:t>(</m:t>
+        </m:r>
+        <m:sSup>
+          <m:e>
+            <m:r>
+              <m:t>R</m:t>
+            </m:r>
+          </m:e>
+          <m:sup>
+            <m:r>
+              <m:t>m</m:t>
+            </m:r>
+          </m:sup>
+        </m:sSup>
+        <m:r>
+          <m:rPr>
+            <m:sty m:val="p"/>
+          </m:rPr>
+          <m:t>)</m:t>
+        </m:r>
+      </m:oMath>
+      <w:r>
+        <w:rPr>
+          <w:i/>
+          <w:iCs/>
+        </w:rPr>
+        <w:t xml:space="preserve">. (ii) If</w:t>
+      </w:r>
+      <w:r>
+        <w:rPr>
+          <w:i/>
+          <w:iCs/>
+        </w:rPr>
+        <w:t xml:space="preserve"> </w:t>
+      </w:r>
+      <m:oMath>
+        <m:r>
+          <m:t>w</m:t>
+        </m:r>
+        <m:r>
+          <m:rPr>
+            <m:sty m:val="p"/>
+          </m:rPr>
+          <m:t>∈</m:t>
+        </m:r>
+        <m:sSub>
+          <m:e>
+            <m:r>
+              <m:t>C</m:t>
+            </m:r>
+          </m:e>
+          <m:sub>
+            <m:r>
+              <m:t>W</m:t>
+            </m:r>
+          </m:sub>
+        </m:sSub>
+        <m:r>
+          <m:rPr>
+            <m:sty m:val="p"/>
+          </m:rPr>
+          <m:t>(</m:t>
+        </m:r>
+        <m:sSup>
+          <m:e>
+            <m:r>
+              <m:t>R</m:t>
+            </m:r>
+          </m:e>
+          <m:sup>
+            <m:r>
+              <m:t>m</m:t>
+            </m:r>
+          </m:sup>
+        </m:sSup>
+        <m:r>
+          <m:rPr>
+            <m:sty m:val="p"/>
+          </m:rPr>
+          <m:t>)</m:t>
+        </m:r>
+      </m:oMath>
+      <w:r>
+        <w:rPr>
+          <w:i/>
+          <w:iCs/>
+        </w:rPr>
+        <w:t xml:space="preserve"> </w:t>
+      </w:r>
+      <w:r>
+        <w:rPr>
+          <w:i/>
+          <w:iCs/>
+        </w:rPr>
+        <w:t xml:space="preserve">then</w:t>
+      </w:r>
+      <w:r>
+        <w:rPr>
+          <w:i/>
+          <w:iCs/>
+        </w:rPr>
+        <w:t xml:space="preserve"> </w:t>
+      </w:r>
+      <m:oMath>
+        <m:r>
+          <m:t>w</m:t>
+        </m:r>
+      </m:oMath>
+      <w:r>
+        <w:rPr>
+          <w:i/>
+          <w:iCs/>
+        </w:rPr>
+        <w:t xml:space="preserve">,</w:t>
+      </w:r>
+      <w:r>
+        <w:rPr>
+          <w:i/>
+          <w:iCs/>
+        </w:rPr>
+        <w:t xml:space="preserve"> </w:t>
+      </w:r>
+      <m:oMath>
+        <m:r>
+          <m:t>c</m:t>
+        </m:r>
+      </m:oMath>
+      <w:r>
+        <w:rPr>
+          <w:i/>
+          <w:iCs/>
+        </w:rPr>
+        <w:t xml:space="preserve"> </w:t>
+      </w:r>
+      <w:r>
+        <w:rPr>
+          <w:i/>
+          <w:iCs/>
+        </w:rPr>
+        <w:t xml:space="preserve">and</w:t>
+      </w:r>
+      <w:r>
+        <w:rPr>
+          <w:i/>
+          <w:iCs/>
+        </w:rPr>
+        <w:t xml:space="preserve"> </w:t>
+      </w:r>
+      <m:oMath>
+        <m:sSup>
+          <m:e>
+            <m:r>
+              <m:t>R</m:t>
+            </m:r>
+          </m:e>
+          <m:sup>
+            <m:r>
+              <m:t>m</m:t>
+            </m:r>
+          </m:sup>
+        </m:sSup>
+      </m:oMath>
+      <w:r>
+        <w:rPr>
+          <w:i/>
+          <w:iCs/>
+        </w:rPr>
+        <w:t xml:space="preserve"> </w:t>
+      </w:r>
+      <w:r>
+        <w:rPr>
+          <w:i/>
+          <w:iCs/>
+        </w:rPr>
+        <w:t xml:space="preserve">pairwise commute; for</w:t>
+      </w:r>
+      <w:r>
+        <w:rPr>
+          <w:i/>
+          <w:iCs/>
+        </w:rPr>
+        <w:t xml:space="preserve"> </w:t>
+      </w:r>
+      <m:oMath>
+        <m:r>
+          <m:t>g</m:t>
+        </m:r>
+        <m:r>
+          <m:rPr>
+            <m:sty m:val="p"/>
+          </m:rPr>
+          <m:t>∈</m:t>
+        </m:r>
+        <m:r>
+          <m:t>W</m:t>
+        </m:r>
+      </m:oMath>
+      <w:r>
+        <w:rPr>
+          <w:i/>
+          <w:iCs/>
+        </w:rPr>
+        <w:t xml:space="preserve"> </w:t>
+      </w:r>
+      <w:r>
+        <w:rPr>
+          <w:i/>
+          <w:iCs/>
+        </w:rPr>
+        <w:t xml:space="preserve">any two of</w:t>
+      </w:r>
+      <w:r>
+        <w:rPr>
+          <w:i/>
+          <w:iCs/>
+        </w:rPr>
+        <w:t xml:space="preserve"> </w:t>
+      </w:r>
+      <w:r>
+        <w:rPr>
+          <w:i/>
+          <w:iCs/>
+        </w:rPr>
+        <w:t xml:space="preserve">“</w:t>
+      </w:r>
+      <m:oMath>
+        <m:r>
+          <m:t>g</m:t>
+        </m:r>
+      </m:oMath>
+      <w:r>
+        <w:rPr>
+          <w:i/>
+          <w:iCs/>
+        </w:rPr>
+        <w:t xml:space="preserve"> </w:t>
+      </w:r>
+      <w:r>
+        <w:rPr>
+          <w:i/>
+          <w:iCs/>
+        </w:rPr>
+        <w:t xml:space="preserve">commutes with</w:t>
+      </w:r>
+      <w:r>
+        <w:rPr>
+          <w:i/>
+          <w:iCs/>
+        </w:rPr>
+        <w:t xml:space="preserve"> </w:t>
+      </w:r>
+      <m:oMath>
+        <m:r>
+          <m:t>w</m:t>
+        </m:r>
+      </m:oMath>
+      <w:r>
+        <w:rPr>
+          <w:i/>
+          <w:iCs/>
+        </w:rPr>
+        <w:t xml:space="preserve">”</w:t>
+      </w:r>
+      <w:r>
+        <w:rPr>
+          <w:i/>
+          <w:iCs/>
+        </w:rPr>
+        <w:t xml:space="preserve">,</w:t>
+      </w:r>
+      <w:r>
+        <w:rPr>
+          <w:i/>
+          <w:iCs/>
+        </w:rPr>
+        <w:t xml:space="preserve"> </w:t>
+      </w:r>
+      <w:r>
+        <w:rPr>
+          <w:i/>
+          <w:iCs/>
+        </w:rPr>
+        <w:t xml:space="preserve">“with</w:t>
+      </w:r>
+      <w:r>
+        <w:rPr>
+          <w:i/>
+          <w:iCs/>
+        </w:rPr>
+        <w:t xml:space="preserve"> </w:t>
+      </w:r>
+      <m:oMath>
+        <m:sSup>
+          <m:e>
+            <m:r>
+              <m:t>R</m:t>
+            </m:r>
+          </m:e>
+          <m:sup>
+            <m:r>
+              <m:t>m</m:t>
+            </m:r>
+          </m:sup>
+        </m:sSup>
+      </m:oMath>
+      <w:r>
+        <w:rPr>
+          <w:i/>
+          <w:iCs/>
+        </w:rPr>
+        <w:t xml:space="preserve">”</w:t>
+      </w:r>
+      <w:r>
+        <w:rPr>
+          <w:i/>
+          <w:iCs/>
+        </w:rPr>
+        <w:t xml:space="preserve">,</w:t>
+      </w:r>
+      <w:r>
+        <w:rPr>
+          <w:i/>
+          <w:iCs/>
+        </w:rPr>
+        <w:t xml:space="preserve"> </w:t>
+      </w:r>
+      <w:r>
+        <w:rPr>
+          <w:i/>
+          <w:iCs/>
+        </w:rPr>
+        <w:t xml:space="preserve">“with</w:t>
+      </w:r>
+      <w:r>
+        <w:rPr>
+          <w:i/>
+          <w:iCs/>
+        </w:rPr>
+        <w:t xml:space="preserve"> </w:t>
+      </w:r>
+      <m:oMath>
+        <m:r>
+          <m:t>c</m:t>
+        </m:r>
+      </m:oMath>
+      <w:r>
+        <w:rPr>
+          <w:i/>
+          <w:iCs/>
+        </w:rPr>
+        <w:t xml:space="preserve">”</w:t>
+      </w:r>
+      <w:r>
+        <w:rPr>
+          <w:i/>
+          <w:iCs/>
+        </w:rPr>
+        <w:t xml:space="preserve"> </w:t>
+      </w:r>
+      <w:r>
+        <w:rPr>
+          <w:i/>
+          <w:iCs/>
+        </w:rPr>
+        <w:t xml:space="preserve">imply the third; and when</w:t>
+      </w:r>
+      <w:r>
+        <w:rPr>
+          <w:i/>
+          <w:iCs/>
+        </w:rPr>
+        <w:t xml:space="preserve"> </w:t>
+      </w:r>
+      <m:oMath>
+        <m:r>
+          <m:rPr>
+            <m:sty m:val="p"/>
+          </m:rPr>
+          <m:t>F</m:t>
+        </m:r>
+        <m:r>
+          <m:rPr>
+            <m:sty m:val="p"/>
+          </m:rPr>
+          <m:t>i</m:t>
+        </m:r>
+        <m:r>
+          <m:rPr>
+            <m:sty m:val="p"/>
+          </m:rPr>
+          <m:t>x</m:t>
+        </m:r>
+        <m:r>
+          <m:rPr>
+            <m:sty m:val="p"/>
+          </m:rPr>
+          <m:t>(</m:t>
+        </m:r>
+        <m:r>
+          <m:t>c</m:t>
+        </m:r>
+        <m:r>
+          <m:rPr>
+            <m:sty m:val="p"/>
+          </m:rPr>
+          <m:t>)</m:t>
+        </m:r>
+      </m:oMath>
+      <w:r>
+        <w:rPr>
+          <w:i/>
+          <w:iCs/>
+        </w:rPr>
+        <w:t xml:space="preserve"> </w:t>
+      </w:r>
+      <w:r>
+        <w:rPr>
+          <w:i/>
+          <w:iCs/>
+        </w:rPr>
+        <w:t xml:space="preserve">has trivial pointwise stabilizer,</w:t>
+      </w:r>
+      <w:r>
+        <w:rPr>
+          <w:i/>
+          <w:iCs/>
+        </w:rPr>
+        <w:t xml:space="preserve"> </w:t>
+      </w:r>
+      <m:oMath>
+        <m:sSub>
+          <m:e>
+            <m:r>
+              <m:t>I</m:t>
+            </m:r>
+          </m:e>
+          <m:sub>
+            <m:r>
+              <m:t>m</m:t>
+            </m:r>
+          </m:sub>
+        </m:sSub>
+        <m:r>
+          <m:rPr>
+            <m:sty m:val="p"/>
+          </m:rPr>
+          <m:t>∩</m:t>
+        </m:r>
+        <m:sSub>
+          <m:e>
+            <m:r>
+              <m:rPr>
+                <m:sty m:val="p"/>
+              </m:rPr>
+              <m:t>S</m:t>
+            </m:r>
+            <m:r>
+              <m:rPr>
+                <m:sty m:val="p"/>
+              </m:rPr>
+              <m:t>t</m:t>
+            </m:r>
+            <m:r>
+              <m:rPr>
+                <m:sty m:val="p"/>
+              </m:rPr>
+              <m:t>a</m:t>
+            </m:r>
+            <m:r>
+              <m:rPr>
+                <m:sty m:val="p"/>
+              </m:rPr>
+              <m:t>b</m:t>
+            </m:r>
+          </m:e>
+          <m:sub>
+            <m:r>
+              <m:t>W</m:t>
+            </m:r>
+          </m:sub>
+        </m:sSub>
+        <m:r>
+          <m:rPr>
+            <m:sty m:val="p"/>
+          </m:rPr>
+          <m:t>(</m:t>
+        </m:r>
+        <m:r>
+          <m:rPr>
+            <m:sty m:val="p"/>
+          </m:rPr>
+          <m:t>F</m:t>
+        </m:r>
+        <m:r>
+          <m:rPr>
+            <m:sty m:val="p"/>
+          </m:rPr>
+          <m:t>i</m:t>
+        </m:r>
+        <m:r>
+          <m:rPr>
+            <m:sty m:val="p"/>
+          </m:rPr>
+          <m:t>x</m:t>
+        </m:r>
+        <m:r>
+          <m:t> </m:t>
+        </m:r>
+        <m:r>
+          <m:t>c</m:t>
+        </m:r>
+        <m:r>
+          <m:rPr>
+            <m:sty m:val="p"/>
+          </m:rPr>
+          <m:t>)</m:t>
+        </m:r>
+        <m:r>
+          <m:rPr>
+            <m:sty m:val="p"/>
+          </m:rPr>
+          <m:t>=</m:t>
+        </m:r>
+        <m:sSub>
+          <m:e>
+            <m:r>
+              <m:t>C</m:t>
+            </m:r>
+          </m:e>
+          <m:sub>
+            <m:r>
+              <m:t>W</m:t>
+            </m:r>
+          </m:sub>
+        </m:sSub>
+        <m:r>
+          <m:rPr>
+            <m:sty m:val="p"/>
+          </m:rPr>
+          <m:t>(</m:t>
+        </m:r>
+        <m:r>
+          <m:t>c</m:t>
+        </m:r>
+        <m:r>
+          <m:rPr>
+            <m:sty m:val="p"/>
+          </m:rPr>
+          <m:t>)</m:t>
+        </m:r>
+      </m:oMath>
+      <w:r>
+        <w:rPr>
+          <w:i/>
+          <w:iCs/>
+        </w:rPr>
+        <w:t xml:space="preserve"> </w:t>
+      </w:r>
+      <w:r>
+        <w:rPr>
+          <w:i/>
+          <w:iCs/>
+        </w:rPr>
+        <w:t xml:space="preserve">with</w:t>
+      </w:r>
+      <w:r>
+        <w:rPr>
+          <w:i/>
+          <w:iCs/>
+        </w:rPr>
+        <w:t xml:space="preserve"> </w:t>
+      </w:r>
+      <m:oMath>
+        <m:d>
+          <m:dPr>
+            <m:begChr m:val="("/>
+            <m:sepChr m:val=""/>
+            <m:endChr m:val=")"/>
+            <m:grow/>
+          </m:dPr>
+          <m:e>
+            <m:sSub>
+              <m:e>
+                <m:r>
+                  <m:t>I</m:t>
+                </m:r>
+              </m:e>
+              <m:sub>
+                <m:r>
+                  <m:t>m</m:t>
+                </m:r>
+              </m:sub>
+            </m:sSub>
+            <m:r>
+              <m:rPr>
+                <m:sty m:val="p"/>
+              </m:rPr>
+              <m:t>∩</m:t>
+            </m:r>
+            <m:sSub>
+              <m:e>
+                <m:r>
+                  <m:rPr>
+                    <m:sty m:val="p"/>
+                  </m:rPr>
+                  <m:t>S</m:t>
+                </m:r>
+                <m:r>
+                  <m:rPr>
+                    <m:sty m:val="p"/>
+                  </m:rPr>
+                  <m:t>t</m:t>
+                </m:r>
+                <m:r>
+                  <m:rPr>
+                    <m:sty m:val="p"/>
+                  </m:rPr>
+                  <m:t>a</m:t>
+                </m:r>
+                <m:r>
+                  <m:rPr>
+                    <m:sty m:val="p"/>
+                  </m:rPr>
+                  <m:t>b</m:t>
+                </m:r>
+              </m:e>
+              <m:sub>
+                <m:r>
+                  <m:t>W</m:t>
+                </m:r>
+              </m:sub>
+            </m:sSub>
+            <m:r>
+              <m:rPr>
+                <m:sty m:val="p"/>
+              </m:rPr>
+              <m:t>(</m:t>
+            </m:r>
+            <m:r>
+              <m:rPr>
+                <m:sty m:val="p"/>
+              </m:rPr>
+              <m:t>F</m:t>
+            </m:r>
+            <m:r>
+              <m:rPr>
+                <m:sty m:val="p"/>
+              </m:rPr>
+              <m:t>i</m:t>
+            </m:r>
+            <m:r>
+              <m:rPr>
+                <m:sty m:val="p"/>
+              </m:rPr>
+              <m:t>x</m:t>
+            </m:r>
+            <m:r>
+              <m:t> </m:t>
+            </m:r>
+            <m:r>
+              <m:t>c</m:t>
+            </m:r>
+            <m:r>
+              <m:rPr>
+                <m:sty m:val="p"/>
+              </m:rPr>
+              <m:t>)</m:t>
+            </m:r>
+          </m:e>
+        </m:d>
+        <m:r>
+          <m:rPr>
+            <m:sty m:val="p"/>
+          </m:rPr>
+          <m:t>\</m:t>
+        </m:r>
+        <m:sSub>
+          <m:e>
+            <m:r>
+              <m:t>C</m:t>
+            </m:r>
+          </m:e>
+          <m:sub>
+            <m:r>
+              <m:t>W</m:t>
+            </m:r>
+          </m:sub>
+        </m:sSub>
+        <m:r>
+          <m:rPr>
+            <m:sty m:val="p"/>
+          </m:rPr>
+          <m:t>(</m:t>
+        </m:r>
+        <m:sSup>
+          <m:e>
+            <m:r>
+              <m:t>R</m:t>
+            </m:r>
+          </m:e>
+          <m:sup>
+            <m:r>
+              <m:t>m</m:t>
+            </m:r>
+          </m:sup>
+        </m:sSup>
+        <m:r>
+          <m:rPr>
+            <m:sty m:val="p"/>
+          </m:rPr>
+          <m:t>)</m:t>
+        </m:r>
+        <m:r>
+          <m:rPr>
+            <m:sty m:val="p"/>
+          </m:rPr>
+          <m:t>=</m:t>
+        </m:r>
+        <m:sSub>
+          <m:e>
+            <m:r>
+              <m:t>C</m:t>
+            </m:r>
+          </m:e>
+          <m:sub>
+            <m:r>
+              <m:t>W</m:t>
+            </m:r>
+          </m:sub>
+        </m:sSub>
+        <m:r>
+          <m:rPr>
+            <m:sty m:val="p"/>
+          </m:rPr>
+          <m:t>(</m:t>
+        </m:r>
+        <m:r>
+          <m:t>c</m:t>
+        </m:r>
+        <m:r>
+          <m:rPr>
+            <m:sty m:val="p"/>
+          </m:rPr>
+          <m:t>)</m:t>
+        </m:r>
+        <m:r>
+          <m:rPr>
+            <m:sty m:val="p"/>
+          </m:rPr>
+          <m:t>\</m:t>
+        </m:r>
+        <m:sSub>
+          <m:e>
+            <m:r>
+              <m:t>C</m:t>
+            </m:r>
+          </m:e>
+          <m:sub>
+            <m:r>
+              <m:t>W</m:t>
+            </m:r>
+          </m:sub>
+        </m:sSub>
+        <m:r>
+          <m:rPr>
+            <m:sty m:val="p"/>
+          </m:rPr>
+          <m:t>(</m:t>
+        </m:r>
+        <m:r>
+          <m:t>w</m:t>
+        </m:r>
+        <m:r>
+          <m:rPr>
+            <m:sty m:val="p"/>
+          </m:rPr>
+          <m:t>)</m:t>
+        </m:r>
+      </m:oMath>
+      <w:r>
+        <w:rPr>
+          <w:i/>
+          <w:iCs/>
+        </w:rPr>
+        <w:t xml:space="preserve">.</w:t>
+      </w:r>
+    </w:p>
+    <w:p>
+      <w:pPr>
+        <w:pStyle w:val="BodyText"/>
+      </w:pPr>
+      <w:r>
+        <w:rPr>
+          <w:i/>
+          <w:iCs/>
+        </w:rPr>
+        <w:t xml:space="preserve">Proof.</w:t>
+      </w:r>
+      <w:r>
+        <w:t xml:space="preserve"> </w:t>
+      </w:r>
+      <w:r>
+        <w:t xml:space="preserve">(i)</w:t>
+      </w:r>
+      <w:r>
+        <w:t xml:space="preserve"> </w:t>
+      </w:r>
+      <m:oMath>
+        <m:sSup>
+          <m:e>
+            <m:r>
+              <m:t>c</m:t>
+            </m:r>
+          </m:e>
+          <m:sup>
+            <m:r>
+              <m:t>2</m:t>
+            </m:r>
+          </m:sup>
+        </m:sSup>
+        <m:r>
+          <m:rPr>
+            <m:sty m:val="p"/>
+          </m:rPr>
+          <m:t>=</m:t>
+        </m:r>
+        <m:sSup>
+          <m:e>
+            <m:r>
+              <m:t>w</m:t>
+            </m:r>
+          </m:e>
+          <m:sup>
+            <m:r>
+              <m:rPr>
+                <m:sty m:val="p"/>
+              </m:rPr>
+              <m:t>−</m:t>
+            </m:r>
+            <m:r>
+              <m:t>1</m:t>
+            </m:r>
+          </m:sup>
+        </m:sSup>
+        <m:sSup>
+          <m:e>
+            <m:r>
+              <m:t>R</m:t>
+            </m:r>
+          </m:e>
+          <m:sup>
+            <m:r>
+              <m:t>m</m:t>
+            </m:r>
+          </m:sup>
+        </m:sSup>
+        <m:sSup>
+          <m:e>
+            <m:r>
+              <m:t>w</m:t>
+            </m:r>
+          </m:e>
+          <m:sup>
+            <m:r>
+              <m:rPr>
+                <m:sty m:val="p"/>
+              </m:rPr>
+              <m:t>−</m:t>
+            </m:r>
+            <m:r>
+              <m:t>1</m:t>
+            </m:r>
+          </m:sup>
+        </m:sSup>
+        <m:sSup>
+          <m:e>
+            <m:r>
+              <m:t>R</m:t>
+            </m:r>
+          </m:e>
+          <m:sup>
+            <m:r>
+              <m:t>m</m:t>
+            </m:r>
+          </m:sup>
+        </m:sSup>
+        <m:r>
+          <m:rPr>
+            <m:sty m:val="p"/>
+          </m:rPr>
+          <m:t>=</m:t>
+        </m:r>
+        <m:r>
+          <m:t>1</m:t>
+        </m:r>
+        <m:r>
+          <m:rPr>
+            <m:sty m:val="p"/>
+          </m:rPr>
+          <m:t>⇔</m:t>
+        </m:r>
+        <m:sSup>
+          <m:e>
+            <m:r>
+              <m:t>R</m:t>
+            </m:r>
+          </m:e>
+          <m:sup>
+            <m:r>
+              <m:t>m</m:t>
+            </m:r>
+          </m:sup>
+        </m:sSup>
+        <m:sSup>
+          <m:e>
+            <m:r>
+              <m:t>w</m:t>
+            </m:r>
+          </m:e>
+          <m:sup>
+            <m:r>
+              <m:rPr>
+                <m:sty m:val="p"/>
+              </m:rPr>
+              <m:t>−</m:t>
+            </m:r>
+            <m:r>
+              <m:t>1</m:t>
+            </m:r>
+          </m:sup>
+        </m:sSup>
+        <m:sSup>
+          <m:e>
+            <m:r>
+              <m:t>R</m:t>
+            </m:r>
+          </m:e>
+          <m:sup>
+            <m:r>
+              <m:t>m</m:t>
+            </m:r>
+          </m:sup>
+        </m:sSup>
+        <m:r>
+          <m:rPr>
+            <m:sty m:val="p"/>
+          </m:rPr>
+          <m:t>=</m:t>
+        </m:r>
+        <m:r>
+          <m:t>w</m:t>
+        </m:r>
+        <m:r>
+          <m:rPr>
+            <m:sty m:val="p"/>
+          </m:rPr>
+          <m:t>⇔</m:t>
+        </m:r>
+        <m:sSup>
+          <m:e>
+            <m:r>
+              <m:t>R</m:t>
+            </m:r>
+          </m:e>
+          <m:sup>
+            <m:r>
+              <m:t>m</m:t>
+            </m:r>
+          </m:sup>
+        </m:sSup>
+        <m:r>
+          <m:t>w</m:t>
+        </m:r>
+        <m:sSup>
+          <m:e>
+            <m:r>
+              <m:t>R</m:t>
+            </m:r>
+          </m:e>
+          <m:sup>
+            <m:r>
+              <m:t>m</m:t>
+            </m:r>
+          </m:sup>
+        </m:sSup>
+        <m:r>
+          <m:rPr>
+            <m:sty m:val="p"/>
+          </m:rPr>
+          <m:t>=</m:t>
+        </m:r>
+        <m:sSup>
+          <m:e>
+            <m:r>
+              <m:t>w</m:t>
+            </m:r>
+          </m:e>
+          <m:sup>
+            <m:r>
+              <m:rPr>
+                <m:sty m:val="p"/>
+              </m:rPr>
+              <m:t>−</m:t>
+            </m:r>
+            <m:r>
+              <m:t>1</m:t>
+            </m:r>
+          </m:sup>
+        </m:sSup>
+      </m:oMath>
+      <w:r>
+        <w:t xml:space="preserve">, since</w:t>
+      </w:r>
+      <w:r>
+        <w:t xml:space="preserve"> </w:t>
+      </w:r>
+      <m:oMath>
+        <m:sSup>
+          <m:e>
+            <m:r>
+              <m:t>R</m:t>
+            </m:r>
+          </m:e>
+          <m:sup>
+            <m:r>
+              <m:t>m</m:t>
+            </m:r>
+          </m:sup>
+        </m:sSup>
+      </m:oMath>
+      <w:r>
+        <w:t xml:space="preserve"> </w:t>
+      </w:r>
+      <w:r>
+        <w:t xml:space="preserve">is an involution. (ii)</w:t>
+      </w:r>
+      <w:r>
+        <w:t xml:space="preserve"> </w:t>
+      </w:r>
+      <m:oMath>
+        <m:r>
+          <m:t>c</m:t>
+        </m:r>
+        <m:r>
+          <m:t>w</m:t>
+        </m:r>
+        <m:r>
+          <m:rPr>
+            <m:sty m:val="p"/>
+          </m:rPr>
+          <m:t>=</m:t>
+        </m:r>
+        <m:sSup>
+          <m:e>
+            <m:r>
+              <m:t>w</m:t>
+            </m:r>
+          </m:e>
+          <m:sup>
+            <m:r>
+              <m:rPr>
+                <m:sty m:val="p"/>
+              </m:rPr>
+              <m:t>−</m:t>
+            </m:r>
+            <m:r>
+              <m:t>1</m:t>
+            </m:r>
+          </m:sup>
+        </m:sSup>
+        <m:sSup>
+          <m:e>
+            <m:r>
+              <m:t>R</m:t>
+            </m:r>
+          </m:e>
+          <m:sup>
+            <m:r>
+              <m:t>m</m:t>
+            </m:r>
+          </m:sup>
+        </m:sSup>
+        <m:r>
+          <m:t>w</m:t>
+        </m:r>
+        <m:r>
+          <m:rPr>
+            <m:sty m:val="p"/>
+          </m:rPr>
+          <m:t>=</m:t>
+        </m:r>
+        <m:sSup>
+          <m:e>
+            <m:r>
+              <m:t>w</m:t>
+            </m:r>
+          </m:e>
+          <m:sup>
+            <m:r>
+              <m:rPr>
+                <m:sty m:val="p"/>
+              </m:rPr>
+              <m:t>−</m:t>
+            </m:r>
+            <m:r>
+              <m:t>1</m:t>
+            </m:r>
+          </m:sup>
+        </m:sSup>
+        <m:r>
+          <m:t>w</m:t>
+        </m:r>
+        <m:sSup>
+          <m:e>
+            <m:r>
+              <m:t>R</m:t>
+            </m:r>
+          </m:e>
+          <m:sup>
+            <m:r>
+              <m:t>m</m:t>
+            </m:r>
+          </m:sup>
+        </m:sSup>
+        <m:r>
+          <m:rPr>
+            <m:sty m:val="p"/>
+          </m:rPr>
+          <m:t>=</m:t>
+        </m:r>
+        <m:sSup>
+          <m:e>
+            <m:r>
+              <m:t>R</m:t>
+            </m:r>
+          </m:e>
+          <m:sup>
+            <m:r>
+              <m:t>m</m:t>
+            </m:r>
+          </m:sup>
+        </m:sSup>
+        <m:r>
+          <m:rPr>
+            <m:sty m:val="p"/>
+          </m:rPr>
+          <m:t>=</m:t>
+        </m:r>
+        <m:r>
+          <m:t>w</m:t>
+        </m:r>
+        <m:r>
+          <m:t>c</m:t>
+        </m:r>
+      </m:oMath>
+      <w:r>
+        <w:t xml:space="preserve">, and both commute with</w:t>
+      </w:r>
+      <w:r>
+        <w:t xml:space="preserve"> </w:t>
+      </w:r>
+      <m:oMath>
+        <m:sSup>
+          <m:e>
+            <m:r>
+              <m:t>R</m:t>
+            </m:r>
+          </m:e>
+          <m:sup>
+            <m:r>
+              <m:t>m</m:t>
+            </m:r>
+          </m:sup>
+        </m:sSup>
+        <m:r>
+          <m:rPr>
+            <m:sty m:val="p"/>
+          </m:rPr>
+          <m:t>=</m:t>
+        </m:r>
+        <m:r>
+          <m:t>w</m:t>
+        </m:r>
+        <m:r>
+          <m:t>c</m:t>
+        </m:r>
+      </m:oMath>
+      <w:r>
+        <w:t xml:space="preserve">; if</w:t>
+      </w:r>
+      <w:r>
+        <w:t xml:space="preserve"> </w:t>
+      </w:r>
+      <m:oMath>
+        <m:r>
+          <m:t>g</m:t>
+        </m:r>
+      </m:oMath>
+      <w:r>
+        <w:t xml:space="preserve"> </w:t>
+      </w:r>
+      <w:r>
+        <w:t xml:space="preserve">commutes with two of</w:t>
+      </w:r>
+      <w:r>
+        <w:t xml:space="preserve"> </w:t>
+      </w:r>
+      <m:oMath>
+        <m:r>
+          <m:t>w</m:t>
+        </m:r>
+      </m:oMath>
+      <w:r>
+        <w:t xml:space="preserve">,</w:t>
+      </w:r>
+      <w:r>
+        <w:t xml:space="preserve"> </w:t>
+      </w:r>
+      <m:oMath>
+        <m:r>
+          <m:t>c</m:t>
+        </m:r>
+      </m:oMath>
+      <w:r>
+        <w:t xml:space="preserve">,</w:t>
+      </w:r>
+      <w:r>
+        <w:t xml:space="preserve"> </w:t>
+      </w:r>
+      <m:oMath>
+        <m:r>
+          <m:t>w</m:t>
+        </m:r>
+        <m:r>
+          <m:t>c</m:t>
+        </m:r>
+      </m:oMath>
+      <w:r>
+        <w:t xml:space="preserve"> </w:t>
+      </w:r>
+      <w:r>
+        <w:t xml:space="preserve">it commutes with the third. The rest is Lemma 6.1 together with the observation that for</w:t>
+      </w:r>
+      <w:r>
+        <w:t xml:space="preserve"> </w:t>
+      </w:r>
+      <m:oMath>
+        <m:r>
+          <m:t>g</m:t>
+        </m:r>
+        <m:r>
+          <m:rPr>
+            <m:sty m:val="p"/>
+          </m:rPr>
+          <m:t>∈</m:t>
+        </m:r>
+        <m:sSub>
+          <m:e>
+            <m:r>
+              <m:t>C</m:t>
+            </m:r>
+          </m:e>
+          <m:sub>
+            <m:r>
+              <m:t>W</m:t>
+            </m:r>
+          </m:sub>
+        </m:sSub>
+        <m:r>
+          <m:rPr>
+            <m:sty m:val="p"/>
+          </m:rPr>
+          <m:t>(</m:t>
+        </m:r>
+        <m:r>
+          <m:t>c</m:t>
+        </m:r>
+        <m:r>
+          <m:rPr>
+            <m:sty m:val="p"/>
+          </m:rPr>
+          <m:t>)</m:t>
+        </m:r>
+      </m:oMath>
+      <w:r>
+        <w:t xml:space="preserve">,</w:t>
+      </w:r>
+      <w:r>
+        <w:t xml:space="preserve"> </w:t>
+      </w:r>
+      <m:oMath>
+        <m:r>
+          <m:t>g</m:t>
+        </m:r>
+        <m:r>
+          <m:rPr>
+            <m:sty m:val="p"/>
+          </m:rPr>
+          <m:t>∉</m:t>
+        </m:r>
+        <m:sSub>
+          <m:e>
+            <m:r>
+              <m:t>C</m:t>
+            </m:r>
+          </m:e>
+          <m:sub>
+            <m:r>
+              <m:t>W</m:t>
+            </m:r>
+          </m:sub>
+        </m:sSub>
+        <m:r>
+          <m:rPr>
+            <m:sty m:val="p"/>
+          </m:rPr>
+          <m:t>(</m:t>
+        </m:r>
+        <m:sSup>
+          <m:e>
+            <m:r>
+              <m:t>R</m:t>
+            </m:r>
+          </m:e>
+          <m:sup>
+            <m:r>
+              <m:t>m</m:t>
+            </m:r>
+          </m:sup>
+        </m:sSup>
+        <m:r>
+          <m:rPr>
+            <m:sty m:val="p"/>
+          </m:rPr>
+          <m:t>)</m:t>
+        </m:r>
+      </m:oMath>
+      <w:r>
+        <w:t xml:space="preserve"> </w:t>
+      </w:r>
+      <w:r>
+        <w:t xml:space="preserve">if and only if</w:t>
+      </w:r>
+      <w:r>
+        <w:t xml:space="preserve"> </w:t>
+      </w:r>
+      <m:oMath>
+        <m:r>
+          <m:t>g</m:t>
+        </m:r>
+        <m:r>
+          <m:rPr>
+            <m:sty m:val="p"/>
+          </m:rPr>
+          <m:t>∉</m:t>
+        </m:r>
+        <m:sSub>
+          <m:e>
+            <m:r>
+              <m:t>C</m:t>
+            </m:r>
+          </m:e>
+          <m:sub>
+            <m:r>
+              <m:t>W</m:t>
+            </m:r>
+          </m:sub>
+        </m:sSub>
+        <m:r>
+          <m:rPr>
+            <m:sty m:val="p"/>
+          </m:rPr>
+          <m:t>(</m:t>
+        </m:r>
+        <m:r>
+          <m:t>w</m:t>
+        </m:r>
+        <m:r>
+          <m:rPr>
+            <m:sty m:val="p"/>
+          </m:rPr>
+          <m:t>)</m:t>
+        </m:r>
+      </m:oMath>
+      <w:r>
+        <w:t xml:space="preserve">.</w:t>
+      </w:r>
+      <w:r>
+        <w:t xml:space="preserve"> </w:t>
+      </w:r>
+      <m:oMath>
+        <m:r>
+          <m:rPr>
+            <m:sty m:val="p"/>
+          </m:rPr>
+          <m:t>▫</m:t>
+        </m:r>
+      </m:oMath>
+    </w:p>
+    <w:p>
+      <w:pPr>
+        <w:pStyle w:val="BodyText"/>
+      </w:pPr>
+      <w:r>
+        <w:rPr>
+          <w:b/>
+          <w:bCs/>
+        </w:rPr>
+        <w:t xml:space="preserve">Proposition 6.10 (C).</w:t>
+      </w:r>
+      <w:r>
+        <w:t xml:space="preserve"> </w:t>
+      </w:r>
+      <w:r>
+        <w:rPr>
+          <w:i/>
+          <w:iCs/>
+        </w:rPr>
+        <w:t xml:space="preserve">On the spinor boards</w:t>
+      </w:r>
+      <w:r>
+        <w:rPr>
+          <w:i/>
+          <w:iCs/>
+        </w:rPr>
+        <w:t xml:space="preserve"> </w:t>
+      </w:r>
+      <m:oMath>
+        <m:sSub>
+          <m:e>
+            <m:r>
+              <m:t>B</m:t>
+            </m:r>
+          </m:e>
+          <m:sub>
+            <m:r>
+              <m:t>3</m:t>
+            </m:r>
+          </m:sub>
+        </m:sSub>
+        <m:r>
+          <m:rPr>
+            <m:sty m:val="p"/>
+          </m:rPr>
+          <m:t>,</m:t>
+        </m:r>
+        <m:r>
+          <m:rPr>
+            <m:sty m:val="p"/>
+          </m:rPr>
+          <m:t>…</m:t>
+        </m:r>
+        <m:r>
+          <m:rPr>
+            <m:sty m:val="p"/>
+          </m:rPr>
+          <m:t>,</m:t>
+        </m:r>
+        <m:sSub>
+          <m:e>
+            <m:r>
+              <m:t>B</m:t>
+            </m:r>
+          </m:e>
+          <m:sub>
+            <m:r>
+              <m:t>8</m:t>
+            </m:r>
+          </m:sub>
+        </m:sSub>
+      </m:oMath>
+      <w:r>
+        <w:rPr>
+          <w:i/>
+          <w:iCs/>
+        </w:rPr>
+        <w:t xml:space="preserve">,</w:t>
+      </w:r>
+      <w:r>
+        <w:rPr>
+          <w:i/>
+          <w:iCs/>
+        </w:rPr>
+        <w:t xml:space="preserve"> </w:t>
+      </w:r>
+      <m:oMath>
+        <m:sSub>
+          <m:e>
+            <m:r>
+              <m:t>I</m:t>
+            </m:r>
+          </m:e>
+          <m:sub>
+            <m:r>
+              <m:t>h</m:t>
+            </m:r>
+            <m:r>
+              <m:rPr>
+                <m:sty m:val="p"/>
+              </m:rPr>
+              <m:t>/</m:t>
+            </m:r>
+            <m:r>
+              <m:t>2</m:t>
+            </m:r>
+          </m:sub>
+        </m:sSub>
+        <m:r>
+          <m:rPr>
+            <m:sty m:val="p"/>
+          </m:rPr>
+          <m:t>⊋</m:t>
+        </m:r>
+        <m:sSub>
+          <m:e>
+            <m:r>
+              <m:t>C</m:t>
+            </m:r>
+          </m:e>
+          <m:sub>
+            <m:r>
+              <m:t>h</m:t>
+            </m:r>
+            <m:r>
+              <m:rPr>
+                <m:sty m:val="p"/>
+              </m:rPr>
+              <m:t>/</m:t>
+            </m:r>
+            <m:r>
+              <m:t>2</m:t>
+            </m:r>
+          </m:sub>
+        </m:sSub>
+      </m:oMath>
+      <w:r>
+        <w:rPr>
+          <w:i/>
+          <w:iCs/>
+        </w:rPr>
+        <w:t xml:space="preserve"> </w:t>
+      </w:r>
+      <w:r>
+        <w:rPr>
+          <w:i/>
+          <w:iCs/>
+        </w:rPr>
+        <w:t xml:space="preserve">if and only if a Weyl element nearest to</w:t>
+      </w:r>
+      <w:r>
+        <w:rPr>
+          <w:i/>
+          <w:iCs/>
+        </w:rPr>
+        <w:t xml:space="preserve"> </w:t>
+      </w:r>
+      <m:oMath>
+        <m:sSup>
+          <m:e>
+            <m:r>
+              <m:t>R</m:t>
+            </m:r>
+          </m:e>
+          <m:sup>
+            <m:r>
+              <m:t>h</m:t>
+            </m:r>
+            <m:r>
+              <m:rPr>
+                <m:sty m:val="p"/>
+              </m:rPr>
+              <m:t>/</m:t>
+            </m:r>
+            <m:r>
+              <m:t>2</m:t>
+            </m:r>
+          </m:sup>
+        </m:sSup>
+      </m:oMath>
+      <w:r>
+        <w:rPr>
+          <w:i/>
+          <w:iCs/>
+        </w:rPr>
+        <w:t xml:space="preserve"> </w:t>
+      </w:r>
+      <w:r>
+        <w:rPr>
+          <w:i/>
+          <w:iCs/>
+        </w:rPr>
+        <w:t xml:space="preserve">(one maximising the agreement set</w:t>
+      </w:r>
+      <w:r>
+        <w:rPr>
+          <w:i/>
+          <w:iCs/>
+        </w:rPr>
+        <w:t xml:space="preserve"> </w:t>
+      </w:r>
+      <m:oMath>
+        <m:r>
+          <m:rPr>
+            <m:sty m:val="p"/>
+          </m:rPr>
+          <m:t>F</m:t>
+        </m:r>
+        <m:r>
+          <m:rPr>
+            <m:sty m:val="p"/>
+          </m:rPr>
+          <m:t>i</m:t>
+        </m:r>
+        <m:r>
+          <m:rPr>
+            <m:sty m:val="p"/>
+          </m:rPr>
+          <m:t>x</m:t>
+        </m:r>
+        <m:r>
+          <m:rPr>
+            <m:sty m:val="p"/>
+          </m:rPr>
+          <m:t>(</m:t>
+        </m:r>
+        <m:sSup>
+          <m:e>
+            <m:r>
+              <m:t>w</m:t>
+            </m:r>
+          </m:e>
+          <m:sup>
+            <m:r>
+              <m:rPr>
+                <m:sty m:val="p"/>
+              </m:rPr>
+              <m:t>−</m:t>
+            </m:r>
+            <m:r>
+              <m:t>1</m:t>
+            </m:r>
+          </m:sup>
+        </m:sSup>
+        <m:sSup>
+          <m:e>
+            <m:r>
+              <m:t>R</m:t>
+            </m:r>
+          </m:e>
+          <m:sup>
+            <m:r>
+              <m:t>h</m:t>
+            </m:r>
+            <m:r>
+              <m:rPr>
+                <m:sty m:val="p"/>
+              </m:rPr>
+              <m:t>/</m:t>
+            </m:r>
+            <m:r>
+              <m:t>2</m:t>
+            </m:r>
+          </m:sup>
+        </m:sSup>
+        <m:r>
+          <m:rPr>
+            <m:sty m:val="p"/>
+          </m:rPr>
+          <m:t>)</m:t>
+        </m:r>
+      </m:oMath>
+      <w:r>
+        <w:rPr>
+          <w:i/>
+          <w:iCs/>
+        </w:rPr>
+        <w:t xml:space="preserve">) commutes with</w:t>
+      </w:r>
+      <w:r>
+        <w:rPr>
+          <w:i/>
+          <w:iCs/>
+        </w:rPr>
+        <w:t xml:space="preserve"> </w:t>
+      </w:r>
+      <m:oMath>
+        <m:sSup>
+          <m:e>
+            <m:r>
+              <m:t>R</m:t>
+            </m:r>
+          </m:e>
+          <m:sup>
+            <m:r>
+              <m:t>h</m:t>
+            </m:r>
+            <m:r>
+              <m:rPr>
+                <m:sty m:val="p"/>
+              </m:rPr>
+              <m:t>/</m:t>
+            </m:r>
+            <m:r>
+              <m:t>2</m:t>
+            </m:r>
+          </m:sup>
+        </m:sSup>
+      </m:oMath>
+      <w:r>
+        <w:rPr>
+          <w:i/>
+          <w:iCs/>
+        </w:rPr>
+        <w:t xml:space="preserve">. On</w:t>
+      </w:r>
+      <w:r>
+        <w:rPr>
+          <w:i/>
+          <w:iCs/>
+        </w:rPr>
+        <w:t xml:space="preserve"> </w:t>
+      </w:r>
+      <m:oMath>
+        <m:sSub>
+          <m:e>
+            <m:r>
+              <m:t>B</m:t>
+            </m:r>
+          </m:e>
+          <m:sub>
+            <m:r>
+              <m:t>4</m:t>
+            </m:r>
+          </m:sub>
+        </m:sSub>
+      </m:oMath>
+      <w:r>
+        <w:rPr>
+          <w:i/>
+          <w:iCs/>
+        </w:rPr>
+        <w:t xml:space="preserve"> </w:t>
+      </w:r>
+      <w:r>
+        <w:rPr>
+          <w:i/>
+          <w:iCs/>
+        </w:rPr>
+        <w:t xml:space="preserve">the nearest element is</w:t>
+      </w:r>
+      <w:r>
+        <w:rPr>
+          <w:i/>
+          <w:iCs/>
+        </w:rPr>
+        <w:t xml:space="preserve"> </w:t>
+      </w:r>
+      <m:oMath>
+        <m:r>
+          <m:rPr>
+            <m:sty m:val="p"/>
+          </m:rPr>
+          <m:t>−</m:t>
+        </m:r>
+        <m:r>
+          <m:t>τ</m:t>
+        </m:r>
+      </m:oMath>
+      <w:r>
+        <w:rPr>
+          <w:i/>
+          <w:iCs/>
+        </w:rPr>
+        <w:t xml:space="preserve">, it commutes with</w:t>
+      </w:r>
+      <w:r>
+        <w:rPr>
+          <w:i/>
+          <w:iCs/>
+        </w:rPr>
+        <w:t xml:space="preserve"> </w:t>
+      </w:r>
+      <m:oMath>
+        <m:sSup>
+          <m:e>
+            <m:r>
+              <m:t>R</m:t>
+            </m:r>
+          </m:e>
+          <m:sup>
+            <m:r>
+              <m:t>4</m:t>
+            </m:r>
+          </m:sup>
+        </m:sSup>
+      </m:oMath>
+      <w:r>
+        <w:rPr>
+          <w:i/>
+          <w:iCs/>
+        </w:rPr>
+        <w:t xml:space="preserve">,</w:t>
+      </w:r>
+      <w:r>
+        <w:rPr>
+          <w:i/>
+          <w:iCs/>
+        </w:rPr>
+        <w:t xml:space="preserve"> </w:t>
+      </w:r>
+      <m:oMath>
+        <m:r>
+          <m:t>c</m:t>
+        </m:r>
+      </m:oMath>
+      <w:r>
+        <w:rPr>
+          <w:i/>
+          <w:iCs/>
+        </w:rPr>
+        <w:t xml:space="preserve"> </w:t>
+      </w:r>
+      <w:r>
+        <w:rPr>
+          <w:i/>
+          <w:iCs/>
+        </w:rPr>
+        <w:t xml:space="preserve">is an involution and the four extras are</w:t>
+      </w:r>
+      <w:r>
+        <w:rPr>
+          <w:i/>
+          <w:iCs/>
+        </w:rPr>
+        <w:t xml:space="preserve"> </w:t>
+      </w:r>
+      <m:oMath>
+        <m:sSub>
+          <m:e>
+            <m:r>
+              <m:t>C</m:t>
+            </m:r>
+          </m:e>
+          <m:sub>
+            <m:r>
+              <m:t>W</m:t>
+            </m:r>
+          </m:sub>
+        </m:sSub>
+        <m:r>
+          <m:rPr>
+            <m:sty m:val="p"/>
+          </m:rPr>
+          <m:t>(</m:t>
+        </m:r>
+        <m:r>
+          <m:t>c</m:t>
+        </m:r>
+        <m:r>
+          <m:rPr>
+            <m:sty m:val="p"/>
+          </m:rPr>
+          <m:t>)</m:t>
+        </m:r>
+        <m:r>
+          <m:rPr>
+            <m:sty m:val="p"/>
+          </m:rPr>
+          <m:t>\</m:t>
+        </m:r>
+        <m:sSub>
+          <m:e>
+            <m:r>
+              <m:t>C</m:t>
+            </m:r>
+          </m:e>
+          <m:sub>
+            <m:r>
+              <m:t>W</m:t>
+            </m:r>
+          </m:sub>
+        </m:sSub>
+        <m:r>
+          <m:rPr>
+            <m:sty m:val="p"/>
+          </m:rPr>
+          <m:t>(</m:t>
+        </m:r>
+        <m:r>
+          <m:rPr>
+            <m:sty m:val="p"/>
+          </m:rPr>
+          <m:t>−</m:t>
+        </m:r>
+        <m:r>
+          <m:t>τ</m:t>
+        </m:r>
+        <m:r>
+          <m:rPr>
+            <m:sty m:val="p"/>
+          </m:rPr>
+          <m:t>)</m:t>
+        </m:r>
+      </m:oMath>
+      <w:r>
+        <w:rPr>
+          <w:i/>
+          <w:iCs/>
+        </w:rPr>
+        <w:t xml:space="preserve">. On</w:t>
+      </w:r>
+      <w:r>
+        <w:rPr>
+          <w:i/>
+          <w:iCs/>
+        </w:rPr>
+        <w:t xml:space="preserve"> </w:t>
+      </w:r>
+      <m:oMath>
+        <m:sSub>
+          <m:e>
+            <m:r>
+              <m:t>B</m:t>
+            </m:r>
+          </m:e>
+          <m:sub>
+            <m:r>
+              <m:t>5</m:t>
+            </m:r>
+          </m:sub>
+        </m:sSub>
+        <m:r>
+          <m:rPr>
+            <m:sty m:val="p"/>
+          </m:rPr>
+          <m:t>,</m:t>
+        </m:r>
+        <m:r>
+          <m:rPr>
+            <m:sty m:val="p"/>
+          </m:rPr>
+          <m:t>…</m:t>
+        </m:r>
+        <m:r>
+          <m:rPr>
+            <m:sty m:val="p"/>
+          </m:rPr>
+          <m:t>,</m:t>
+        </m:r>
+        <m:sSub>
+          <m:e>
+            <m:r>
+              <m:t>B</m:t>
+            </m:r>
+          </m:e>
+          <m:sub>
+            <m:r>
+              <m:t>8</m:t>
+            </m:r>
+          </m:sub>
+        </m:sSub>
+      </m:oMath>
+      <w:r>
+        <w:rPr>
+          <w:i/>
+          <w:iCs/>
+        </w:rPr>
+        <w:t xml:space="preserve"> </w:t>
+      </w:r>
+      <w:r>
+        <w:rPr>
+          <w:i/>
+          <w:iCs/>
+        </w:rPr>
+        <w:t xml:space="preserve">the nearest element is unique, of the shape</w:t>
+      </w:r>
+      <w:r>
+        <w:rPr>
+          <w:i/>
+          <w:iCs/>
+        </w:rPr>
+        <w:t xml:space="preserve"> </w:t>
+      </w:r>
+      <m:oMath>
+        <m:r>
+          <m:rPr>
+            <m:sty m:val="p"/>
+          </m:rPr>
+          <m:t>−</m:t>
+        </m:r>
+        <m:r>
+          <m:rPr>
+            <m:sty m:val="p"/>
+          </m:rPr>
+          <m:t>(</m:t>
+        </m:r>
+        <m:sSub>
+          <m:e>
+            <m:r>
+              <m:t>e</m:t>
+            </m:r>
+          </m:e>
+          <m:sub>
+            <m:r>
+              <m:t>2</m:t>
+            </m:r>
+          </m:sub>
+        </m:sSub>
+        <m:sSub>
+          <m:e>
+            <m:r>
+              <m:t>e</m:t>
+            </m:r>
+          </m:e>
+          <m:sub>
+            <m:r>
+              <m:t>3</m:t>
+            </m:r>
+          </m:sub>
+        </m:sSub>
+        <m:r>
+          <m:rPr>
+            <m:sty m:val="p"/>
+          </m:rPr>
+          <m:t>)</m:t>
+        </m:r>
+        <m:r>
+          <m:rPr>
+            <m:sty m:val="p"/>
+          </m:rPr>
+          <m:t>(</m:t>
+        </m:r>
+        <m:sSub>
+          <m:e>
+            <m:r>
+              <m:t>e</m:t>
+            </m:r>
+          </m:e>
+          <m:sub>
+            <m:r>
+              <m:t>4</m:t>
+            </m:r>
+          </m:sub>
+        </m:sSub>
+        <m:sSub>
+          <m:e>
+            <m:r>
+              <m:t>e</m:t>
+            </m:r>
+          </m:e>
+          <m:sub>
+            <m:r>
+              <m:t>5</m:t>
+            </m:r>
+          </m:sub>
+        </m:sSub>
+        <m:r>
+          <m:rPr>
+            <m:sty m:val="p"/>
+          </m:rPr>
+          <m:t>)</m:t>
+        </m:r>
+        <m:r>
+          <m:rPr>
+            <m:sty m:val="p"/>
+          </m:rPr>
+          <m:t>⋯</m:t>
+        </m:r>
+      </m:oMath>
+      <w:r>
+        <w:rPr>
+          <w:i/>
+          <w:iCs/>
+        </w:rPr>
+        <w:t xml:space="preserve"> </w:t>
+      </w:r>
+      <w:r>
+        <w:rPr>
+          <w:i/>
+          <w:iCs/>
+        </w:rPr>
+        <w:t xml:space="preserve">with the last coordinate fixed or negated, does not commute with</w:t>
+      </w:r>
+      <w:r>
+        <w:rPr>
+          <w:i/>
+          <w:iCs/>
+        </w:rPr>
+        <w:t xml:space="preserve"> </w:t>
+      </w:r>
+      <m:oMath>
+        <m:sSup>
+          <m:e>
+            <m:r>
+              <m:t>R</m:t>
+            </m:r>
+          </m:e>
+          <m:sup>
+            <m:r>
+              <m:t>h</m:t>
+            </m:r>
+            <m:r>
+              <m:rPr>
+                <m:sty m:val="p"/>
+              </m:rPr>
+              <m:t>/</m:t>
+            </m:r>
+            <m:r>
+              <m:t>2</m:t>
+            </m:r>
+          </m:sup>
+        </m:sSup>
+      </m:oMath>
+      <w:r>
+        <w:rPr>
+          <w:i/>
+          <w:iCs/>
+        </w:rPr>
+        <w:t xml:space="preserve">,</w:t>
+      </w:r>
+      <w:r>
+        <w:rPr>
+          <w:i/>
+          <w:iCs/>
+        </w:rPr>
+        <w:t xml:space="preserve"> </w:t>
+      </w:r>
+      <m:oMath>
+        <m:r>
+          <m:t>c</m:t>
+        </m:r>
+      </m:oMath>
+      <w:r>
+        <w:rPr>
+          <w:i/>
+          <w:iCs/>
+        </w:rPr>
+        <w:t xml:space="preserve"> </w:t>
+      </w:r>
+      <w:r>
+        <w:rPr>
+          <w:i/>
+          <w:iCs/>
+        </w:rPr>
+        <w:t xml:space="preserve">is not an involution, and</w:t>
+      </w:r>
+      <w:r>
+        <w:rPr>
+          <w:i/>
+          <w:iCs/>
+        </w:rPr>
+        <w:t xml:space="preserve"> </w:t>
+      </w:r>
+      <m:oMath>
+        <m:sSub>
+          <m:e>
+            <m:r>
+              <m:t>C</m:t>
+            </m:r>
+          </m:e>
+          <m:sub>
+            <m:r>
+              <m:t>W</m:t>
+            </m:r>
+          </m:sub>
+        </m:sSub>
+        <m:r>
+          <m:rPr>
+            <m:sty m:val="p"/>
+          </m:rPr>
+          <m:t>(</m:t>
+        </m:r>
+        <m:r>
+          <m:t>c</m:t>
+        </m:r>
+        <m:r>
+          <m:rPr>
+            <m:sty m:val="p"/>
+          </m:rPr>
+          <m:t>)</m:t>
+        </m:r>
+        <m:r>
+          <m:rPr>
+            <m:sty m:val="p"/>
+          </m:rPr>
+          <m:t>=</m:t>
+        </m:r>
+        <m:r>
+          <m:rPr>
+            <m:sty m:val="p"/>
+          </m:rPr>
+          <m:t>{</m:t>
+        </m:r>
+        <m:r>
+          <m:rPr>
+            <m:sty m:val="p"/>
+          </m:rPr>
+          <m:t>±</m:t>
+        </m:r>
+        <m:r>
+          <m:t>1</m:t>
+        </m:r>
+        <m:r>
+          <m:rPr>
+            <m:sty m:val="p"/>
+          </m:rPr>
+          <m:t>}</m:t>
+        </m:r>
+      </m:oMath>
+      <w:r>
+        <w:rPr>
+          <w:i/>
+          <w:iCs/>
+        </w:rPr>
+        <w:t xml:space="preserve">; on</w:t>
+      </w:r>
+      <w:r>
+        <w:rPr>
+          <w:i/>
+          <w:iCs/>
+        </w:rPr>
+        <w:t xml:space="preserve"> </w:t>
+      </w:r>
+      <m:oMath>
+        <m:sSub>
+          <m:e>
+            <m:r>
+              <m:t>B</m:t>
+            </m:r>
+          </m:e>
+          <m:sub>
+            <m:r>
+              <m:t>8</m:t>
+            </m:r>
+          </m:sub>
+        </m:sSub>
+      </m:oMath>
+      <w:r>
+        <w:rPr>
+          <w:i/>
+          <w:iCs/>
+        </w:rPr>
+        <w:t xml:space="preserve"> </w:t>
+      </w:r>
+      <w:r>
+        <w:rPr>
+          <w:i/>
+          <w:iCs/>
+        </w:rPr>
+        <w:t xml:space="preserve">the stabilizer of the 52-point agreement set is</w:t>
+      </w:r>
+      <w:r>
+        <w:rPr>
+          <w:i/>
+          <w:iCs/>
+        </w:rPr>
+        <w:t xml:space="preserve"> </w:t>
+      </w:r>
+      <m:oMath>
+        <m:r>
+          <m:rPr>
+            <m:sty m:val="p"/>
+          </m:rPr>
+          <m:t>⟨</m:t>
+        </m:r>
+        <m:r>
+          <m:rPr>
+            <m:sty m:val="p"/>
+          </m:rPr>
+          <m:t>−</m:t>
+        </m:r>
+        <m:r>
+          <m:t>1</m:t>
+        </m:r>
+        <m:r>
+          <m:rPr>
+            <m:sty m:val="p"/>
+          </m:rPr>
+          <m:t>,</m:t>
+        </m:r>
+        <m:r>
+          <m:t>w</m:t>
+        </m:r>
+        <m:r>
+          <m:rPr>
+            <m:sty m:val="p"/>
+          </m:rPr>
+          <m:t>⟩</m:t>
+        </m:r>
+      </m:oMath>
+      <w:r>
+        <w:rPr>
+          <w:i/>
+          <w:iCs/>
+        </w:rPr>
+        <w:t xml:space="preserve">. On</w:t>
+      </w:r>
+      <w:r>
+        <w:rPr>
+          <w:i/>
+          <w:iCs/>
+        </w:rPr>
+        <w:t xml:space="preserve"> </w:t>
+      </w:r>
+      <m:oMath>
+        <m:sSub>
+          <m:e>
+            <m:r>
+              <m:t>B</m:t>
+            </m:r>
+          </m:e>
+          <m:sub>
+            <m:r>
+              <m:t>3</m:t>
+            </m:r>
+          </m:sub>
+        </m:sSub>
+      </m:oMath>
+      <w:r>
+        <w:rPr>
+          <w:i/>
+          <w:iCs/>
+        </w:rPr>
+        <w:t xml:space="preserve"> </w:t>
+      </w:r>
+      <w:r>
+        <w:rPr>
+          <w:i/>
+          <w:iCs/>
+        </w:rPr>
+        <w:t xml:space="preserve">no element of</w:t>
+      </w:r>
+      <w:r>
+        <w:rPr>
+          <w:i/>
+          <w:iCs/>
+        </w:rPr>
+        <w:t xml:space="preserve"> </w:t>
+      </w:r>
+      <m:oMath>
+        <m:r>
+          <m:t>W</m:t>
+        </m:r>
+        <m:r>
+          <m:rPr>
+            <m:sty m:val="p"/>
+          </m:rPr>
+          <m:t>(</m:t>
+        </m:r>
+        <m:sSub>
+          <m:e>
+            <m:r>
+              <m:t>B</m:t>
+            </m:r>
+          </m:e>
+          <m:sub>
+            <m:r>
+              <m:t>3</m:t>
+            </m:r>
+          </m:sub>
+        </m:sSub>
+        <m:r>
+          <m:rPr>
+            <m:sty m:val="p"/>
+          </m:rPr>
+          <m:t>)</m:t>
+        </m:r>
+      </m:oMath>
+      <w:r>
+        <w:rPr>
+          <w:i/>
+          <w:iCs/>
+        </w:rPr>
+        <w:t xml:space="preserve"> </w:t>
+      </w:r>
+      <w:r>
+        <w:rPr>
+          <w:i/>
+          <w:iCs/>
+        </w:rPr>
+        <w:t xml:space="preserve">agrees with</w:t>
+      </w:r>
+      <w:r>
+        <w:rPr>
+          <w:i/>
+          <w:iCs/>
+        </w:rPr>
+        <w:t xml:space="preserve"> </w:t>
+      </w:r>
+      <m:oMath>
+        <m:sSup>
+          <m:e>
+            <m:r>
+              <m:t>R</m:t>
+            </m:r>
+          </m:e>
+          <m:sup>
+            <m:r>
+              <m:t>3</m:t>
+            </m:r>
+          </m:sup>
+        </m:sSup>
+      </m:oMath>
+      <w:r>
+        <w:rPr>
+          <w:i/>
+          <w:iCs/>
+        </w:rPr>
+        <w:t xml:space="preserve"> </w:t>
+      </w:r>
+      <w:r>
+        <w:rPr>
+          <w:i/>
+          <w:iCs/>
+        </w:rPr>
+        <w:t xml:space="preserve">on an affinely spanning set, so Lemma 6.1 does not apply and the excess is that of the overgroup</w:t>
+      </w:r>
+      <w:r>
+        <w:rPr>
+          <w:i/>
+          <w:iCs/>
+        </w:rPr>
+        <w:t xml:space="preserve"> </w:t>
+      </w:r>
+      <m:oMath>
+        <m:r>
+          <m:t>W</m:t>
+        </m:r>
+        <m:r>
+          <m:rPr>
+            <m:sty m:val="p"/>
+          </m:rPr>
+          <m:t>(</m:t>
+        </m:r>
+        <m:sSub>
+          <m:e>
+            <m:r>
+              <m:t>D</m:t>
+            </m:r>
+          </m:e>
+          <m:sub>
+            <m:r>
+              <m:t>4</m:t>
+            </m:r>
+          </m:sub>
+        </m:sSub>
+        <m:r>
+          <m:rPr>
+            <m:sty m:val="p"/>
+          </m:rPr>
+          <m:t>)</m:t>
+        </m:r>
+        <m:r>
+          <m:rPr>
+            <m:sty m:val="p"/>
+          </m:rPr>
+          <m:t>∋</m:t>
+        </m:r>
+        <m:sSup>
+          <m:e>
+            <m:r>
+              <m:t>R</m:t>
+            </m:r>
+          </m:e>
+          <m:sup>
+            <m:r>
+              <m:t>3</m:t>
+            </m:r>
+          </m:sup>
+        </m:sSup>
+      </m:oMath>
+      <w:r>
+        <w:rPr>
+          <w:i/>
+          <w:iCs/>
+        </w:rPr>
+        <w:t xml:space="preserve"> </w:t>
+      </w:r>
+      <w:r>
+        <w:rPr>
+          <w:i/>
+          <w:iCs/>
+        </w:rPr>
+        <w:t xml:space="preserve">(§6.1); the criterion holds there only as a marker.</w:t>
+      </w:r>
+    </w:p>
+    <w:p>
+      <w:pPr>
+        <w:pStyle w:val="BodyText"/>
+      </w:pPr>
+      <w:r>
+        <w:rPr>
+          <w:b/>
+          <w:bCs/>
+        </w:rPr>
+        <w:t xml:space="preserve">Proposition 6.11 (C, the 16-cube at the orbit level).</w:t>
+      </w:r>
+      <w:r>
+        <w:t xml:space="preserve"> </w:t>
+      </w:r>
+      <w:r>
+        <w:rPr>
+          <w:i/>
+          <w:iCs/>
+        </w:rPr>
+        <w:t xml:space="preserve">On the</w:t>
+      </w:r>
+      <w:r>
+        <w:rPr>
+          <w:i/>
+          <w:iCs/>
+        </w:rPr>
+        <w:t xml:space="preserve"> </w:t>
+      </w:r>
+      <m:oMath>
+        <m:sSub>
+          <m:e>
+            <m:r>
+              <m:t>B</m:t>
+            </m:r>
+          </m:e>
+          <m:sub>
+            <m:r>
+              <m:t>16</m:t>
+            </m:r>
+          </m:sub>
+        </m:sSub>
+      </m:oMath>
+      <w:r>
+        <w:rPr>
+          <w:i/>
+          <w:iCs/>
+        </w:rPr>
+        <w:t xml:space="preserve"> </w:t>
+      </w:r>
+      <w:r>
+        <w:rPr>
+          <w:i/>
+          <w:iCs/>
+        </w:rPr>
+        <w:t xml:space="preserve">spinor board (</w:t>
+      </w:r>
+      <m:oMath>
+        <m:r>
+          <m:t>65</m:t>
+        </m:r>
+        <m:r>
+          <m:rPr>
+            <m:sty m:val="p"/>
+          </m:rPr>
+          <m:t>,</m:t>
+        </m:r>
+        <m:r>
+          <m:t>536</m:t>
+        </m:r>
+      </m:oMath>
+      <w:r>
+        <w:rPr>
+          <w:i/>
+          <w:iCs/>
+        </w:rPr>
+        <w:t xml:space="preserve"> </w:t>
+      </w:r>
+      <w:r>
+        <w:rPr>
+          <w:i/>
+          <w:iCs/>
+        </w:rPr>
+        <w:t xml:space="preserve">weights,</w:t>
+      </w:r>
+      <w:r>
+        <w:rPr>
+          <w:i/>
+          <w:iCs/>
+        </w:rPr>
+        <w:t xml:space="preserve"> </w:t>
+      </w:r>
+      <m:oMath>
+        <m:r>
+          <m:t>h</m:t>
+        </m:r>
+        <m:r>
+          <m:rPr>
+            <m:sty m:val="p"/>
+          </m:rPr>
+          <m:t>=</m:t>
+        </m:r>
+        <m:r>
+          <m:t>32</m:t>
+        </m:r>
+      </m:oMath>
+      <w:r>
+        <w:rPr>
+          <w:i/>
+          <w:iCs/>
+        </w:rPr>
+        <w:t xml:space="preserve">;</w:t>
+      </w:r>
+      <w:r>
+        <w:rPr>
+          <w:i/>
+          <w:iCs/>
+        </w:rPr>
+        <w:t xml:space="preserve"> </w:t>
+      </w:r>
+      <m:oMath>
+        <m:r>
+          <m:t>W</m:t>
+        </m:r>
+      </m:oMath>
+      <w:r>
+        <w:rPr>
+          <w:i/>
+          <w:iCs/>
+        </w:rPr>
+        <w:t xml:space="preserve"> </w:t>
+      </w:r>
+      <w:r>
+        <w:rPr>
+          <w:i/>
+          <w:iCs/>
+        </w:rPr>
+        <w:t xml:space="preserve">is not enumerated):</w:t>
+      </w:r>
+      <w:r>
+        <w:rPr>
+          <w:i/>
+          <w:iCs/>
+        </w:rPr>
+        <w:t xml:space="preserve"> </w:t>
+      </w:r>
+      <m:oMath>
+        <m:r>
+          <m:t>R</m:t>
+        </m:r>
+      </m:oMath>
+      <w:r>
+        <w:rPr>
+          <w:i/>
+          <w:iCs/>
+        </w:rPr>
+        <w:t xml:space="preserve"> </w:t>
+      </w:r>
+      <w:r>
+        <w:rPr>
+          <w:i/>
+          <w:iCs/>
+        </w:rPr>
+        <w:t xml:space="preserve">has</w:t>
+      </w:r>
+      <w:r>
+        <w:rPr>
+          <w:i/>
+          <w:iCs/>
+        </w:rPr>
+        <w:t xml:space="preserve"> </w:t>
+      </w:r>
+      <m:oMath>
+        <m:r>
+          <m:t>2</m:t>
+        </m:r>
+        <m:r>
+          <m:rPr>
+            <m:sty m:val="p"/>
+          </m:rPr>
+          <m:t>,</m:t>
+        </m:r>
+        <m:r>
+          <m:t>048</m:t>
+        </m:r>
+      </m:oMath>
+      <w:r>
+        <w:rPr>
+          <w:i/>
+          <w:iCs/>
+        </w:rPr>
+        <w:t xml:space="preserve"> </w:t>
+      </w:r>
+      <w:r>
+        <w:rPr>
+          <w:i/>
+          <w:iCs/>
+        </w:rPr>
+        <w:t xml:space="preserve">free orbits of</w:t>
+      </w:r>
+      <w:r>
+        <w:rPr>
+          <w:i/>
+          <w:iCs/>
+        </w:rPr>
+        <w:t xml:space="preserve"> </w:t>
+      </w:r>
+      <m:oMath>
+        <m:r>
+          <m:t>32</m:t>
+        </m:r>
+      </m:oMath>
+      <w:r>
+        <w:rPr>
+          <w:i/>
+          <w:iCs/>
+        </w:rPr>
+        <w:t xml:space="preserve">; the orbit of</w:t>
+      </w:r>
+      <w:r>
+        <w:rPr>
+          <w:i/>
+          <w:iCs/>
+        </w:rPr>
+        <w:t xml:space="preserve"> </w:t>
+      </w:r>
+      <m:oMath>
+        <m:r>
+          <m:t>λ</m:t>
+        </m:r>
+      </m:oMath>
+      <w:r>
+        <w:rPr>
+          <w:i/>
+          <w:iCs/>
+        </w:rPr>
+        <w:t xml:space="preserve"> </w:t>
+      </w:r>
+      <w:r>
+        <w:rPr>
+          <w:i/>
+          <w:iCs/>
+        </w:rPr>
+        <w:t xml:space="preserve">is the full-height orbit and</w:t>
+      </w:r>
+      <w:r>
+        <w:rPr>
+          <w:i/>
+          <w:iCs/>
+        </w:rPr>
+        <w:t xml:space="preserve"> </w:t>
+      </w:r>
+      <m:oMath>
+        <m:sSup>
+          <m:e>
+            <m:r>
+              <m:t>R</m:t>
+            </m:r>
+          </m:e>
+          <m:sup>
+            <m:r>
+              <m:t>16</m:t>
+            </m:r>
+          </m:sup>
+        </m:sSup>
+      </m:oMath>
+      <w:r>
+        <w:rPr>
+          <w:i/>
+          <w:iCs/>
+        </w:rPr>
+        <w:t xml:space="preserve"> </w:t>
+      </w:r>
+      <w:r>
+        <w:rPr>
+          <w:i/>
+          <w:iCs/>
+        </w:rPr>
+        <w:t xml:space="preserve">shifts every rank on it by exactly</w:t>
+      </w:r>
+      <w:r>
+        <w:rPr>
+          <w:i/>
+          <w:iCs/>
+        </w:rPr>
+        <w:t xml:space="preserve"> </w:t>
+      </w:r>
+      <m:oMath>
+        <m:r>
+          <m:rPr>
+            <m:sty m:val="p"/>
+          </m:rPr>
+          <m:t>±</m:t>
+        </m:r>
+        <m:r>
+          <m:t>8</m:t>
+        </m:r>
+      </m:oMath>
+      <w:r>
+        <w:rPr>
+          <w:i/>
+          <w:iCs/>
+        </w:rPr>
+        <w:t xml:space="preserve">; exactly sixteen orbits carry the half-turn as a Weyl element, all by the same</w:t>
+      </w:r>
+      <w:r>
+        <w:rPr>
+          <w:i/>
+          <w:iCs/>
+        </w:rPr>
+        <w:t xml:space="preserve"> </w:t>
+      </w:r>
+      <m:oMath>
+        <m:r>
+          <m:t>w</m:t>
+        </m:r>
+        <m:r>
+          <m:rPr>
+            <m:sty m:val="p"/>
+          </m:rPr>
+          <m:t>=</m:t>
+        </m:r>
+        <m:r>
+          <m:rPr>
+            <m:sty m:val="p"/>
+          </m:rPr>
+          <m:t>−</m:t>
+        </m:r>
+        <m:r>
+          <m:rPr>
+            <m:sty m:val="p"/>
+          </m:rPr>
+          <m:t>(</m:t>
+        </m:r>
+        <m:sSub>
+          <m:e>
+            <m:r>
+              <m:t>e</m:t>
+            </m:r>
+          </m:e>
+          <m:sub>
+            <m:r>
+              <m:t>2</m:t>
+            </m:r>
+          </m:sub>
+        </m:sSub>
+        <m:sSub>
+          <m:e>
+            <m:r>
+              <m:t>e</m:t>
+            </m:r>
+          </m:e>
+          <m:sub>
+            <m:r>
+              <m:t>3</m:t>
+            </m:r>
+          </m:sub>
+        </m:sSub>
+        <m:r>
+          <m:rPr>
+            <m:sty m:val="p"/>
+          </m:rPr>
+          <m:t>)</m:t>
+        </m:r>
+        <m:r>
+          <m:rPr>
+            <m:sty m:val="p"/>
+          </m:rPr>
+          <m:t>(</m:t>
+        </m:r>
+        <m:sSub>
+          <m:e>
+            <m:r>
+              <m:t>e</m:t>
+            </m:r>
+          </m:e>
+          <m:sub>
+            <m:r>
+              <m:t>4</m:t>
+            </m:r>
+          </m:sub>
+        </m:sSub>
+        <m:sSub>
+          <m:e>
+            <m:r>
+              <m:t>e</m:t>
+            </m:r>
+          </m:e>
+          <m:sub>
+            <m:r>
+              <m:t>5</m:t>
+            </m:r>
+          </m:sub>
+        </m:sSub>
+        <m:r>
+          <m:rPr>
+            <m:sty m:val="p"/>
+          </m:rPr>
+          <m:t>)</m:t>
+        </m:r>
+        <m:r>
+          <m:rPr>
+            <m:sty m:val="p"/>
+          </m:rPr>
+          <m:t>⋯</m:t>
+        </m:r>
+        <m:r>
+          <m:rPr>
+            <m:sty m:val="p"/>
+          </m:rPr>
+          <m:t>(</m:t>
+        </m:r>
+        <m:sSub>
+          <m:e>
+            <m:r>
+              <m:t>e</m:t>
+            </m:r>
+          </m:e>
+          <m:sub>
+            <m:r>
+              <m:t>14</m:t>
+            </m:r>
+          </m:sub>
+        </m:sSub>
+        <m:sSub>
+          <m:e>
+            <m:r>
+              <m:t>e</m:t>
+            </m:r>
+          </m:e>
+          <m:sub>
+            <m:r>
+              <m:t>15</m:t>
+            </m:r>
+          </m:sub>
+        </m:sSub>
+        <m:r>
+          <m:rPr>
+            <m:sty m:val="p"/>
+          </m:rPr>
+          <m:t>)</m:t>
+        </m:r>
+      </m:oMath>
+      <w:r>
+        <w:rPr>
+          <w:i/>
+          <w:iCs/>
+        </w:rPr>
+        <w:t xml:space="preserve"> </w:t>
+      </w:r>
+      <w:r>
+        <w:rPr>
+          <w:i/>
+          <w:iCs/>
+        </w:rPr>
+        <w:t xml:space="preserve">with</w:t>
+      </w:r>
+      <w:r>
+        <w:rPr>
+          <w:i/>
+          <w:iCs/>
+        </w:rPr>
+        <w:t xml:space="preserve"> </w:t>
+      </w:r>
+      <m:oMath>
+        <m:sSub>
+          <m:e>
+            <m:r>
+              <m:t>e</m:t>
+            </m:r>
+          </m:e>
+          <m:sub>
+            <m:r>
+              <m:t>16</m:t>
+            </m:r>
+          </m:sub>
+        </m:sSub>
+      </m:oMath>
+      <w:r>
+        <w:rPr>
+          <w:i/>
+          <w:iCs/>
+        </w:rPr>
+        <w:t xml:space="preserve"> </w:t>
+      </w:r>
+      <w:r>
+        <w:rPr>
+          <w:i/>
+          <w:iCs/>
+        </w:rPr>
+        <w:t xml:space="preserve">fixed, and they are exactly the orbits whose ranks lie in</w:t>
+      </w:r>
+      <w:r>
+        <w:rPr>
+          <w:i/>
+          <w:iCs/>
+        </w:rPr>
+        <w:t xml:space="preserve"> </w:t>
+      </w:r>
+      <m:oMath>
+        <m:r>
+          <m:rPr>
+            <m:sty m:val="p"/>
+          </m:rPr>
+          <m:t>{</m:t>
+        </m:r>
+        <m:r>
+          <m:t>7</m:t>
+        </m:r>
+        <m:r>
+          <m:rPr>
+            <m:sty m:val="p"/>
+          </m:rPr>
+          <m:t>,</m:t>
+        </m:r>
+        <m:r>
+          <m:t>8</m:t>
+        </m:r>
+        <m:r>
+          <m:rPr>
+            <m:sty m:val="p"/>
+          </m:rPr>
+          <m:t>,</m:t>
+        </m:r>
+        <m:r>
+          <m:t>9</m:t>
+        </m:r>
+        <m:r>
+          <m:rPr>
+            <m:sty m:val="p"/>
+          </m:rPr>
+          <m:t>}</m:t>
+        </m:r>
+      </m:oMath>
+      <w:r>
+        <w:rPr>
+          <w:i/>
+          <w:iCs/>
+        </w:rPr>
+        <w:t xml:space="preserve">;</w:t>
+      </w:r>
+      <w:r>
+        <w:rPr>
+          <w:i/>
+          <w:iCs/>
+        </w:rPr>
+        <w:t xml:space="preserve"> </w:t>
+      </w:r>
+      <m:oMath>
+        <m:r>
+          <m:t>w</m:t>
+        </m:r>
+      </m:oMath>
+      <w:r>
+        <w:rPr>
+          <w:i/>
+          <w:iCs/>
+        </w:rPr>
+        <w:t xml:space="preserve"> </w:t>
+      </w:r>
+      <w:r>
+        <w:rPr>
+          <w:i/>
+          <w:iCs/>
+        </w:rPr>
+        <w:t xml:space="preserve">does not commute with</w:t>
+      </w:r>
+      <w:r>
+        <w:rPr>
+          <w:i/>
+          <w:iCs/>
+        </w:rPr>
+        <w:t xml:space="preserve"> </w:t>
+      </w:r>
+      <m:oMath>
+        <m:sSup>
+          <m:e>
+            <m:r>
+              <m:t>R</m:t>
+            </m:r>
+          </m:e>
+          <m:sup>
+            <m:r>
+              <m:t>16</m:t>
+            </m:r>
+          </m:sup>
+        </m:sSup>
+      </m:oMath>
+      <w:r>
+        <w:rPr>
+          <w:i/>
+          <w:iCs/>
+        </w:rPr>
+        <w:t xml:space="preserve">;</w:t>
+      </w:r>
+      <w:r>
+        <w:rPr>
+          <w:i/>
+          <w:iCs/>
+        </w:rPr>
+        <w:t xml:space="preserve"> </w:t>
+      </w:r>
+      <m:oMath>
+        <m:sSub>
+          <m:e>
+            <m:r>
+              <m:t>C</m:t>
+            </m:r>
+          </m:e>
+          <m:sub>
+            <m:r>
+              <m:t>W</m:t>
+            </m:r>
+          </m:sub>
+        </m:sSub>
+        <m:r>
+          <m:rPr>
+            <m:sty m:val="p"/>
+          </m:rPr>
+          <m:t>(</m:t>
+        </m:r>
+        <m:sSup>
+          <m:e>
+            <m:r>
+              <m:t>R</m:t>
+            </m:r>
+          </m:e>
+          <m:sup>
+            <m:r>
+              <m:t>16</m:t>
+            </m:r>
+          </m:sup>
+        </m:sSup>
+        <m:r>
+          <m:rPr>
+            <m:sty m:val="p"/>
+          </m:rPr>
+          <m:t>)</m:t>
+        </m:r>
+        <m:r>
+          <m:rPr>
+            <m:sty m:val="p"/>
+          </m:rPr>
+          <m:t>=</m:t>
+        </m:r>
+        <m:r>
+          <m:rPr>
+            <m:sty m:val="p"/>
+          </m:rPr>
+          <m:t>{</m:t>
+        </m:r>
+        <m:r>
+          <m:rPr>
+            <m:sty m:val="p"/>
+          </m:rPr>
+          <m:t>±</m:t>
+        </m:r>
+        <m:r>
+          <m:t>1</m:t>
+        </m:r>
+        <m:r>
+          <m:rPr>
+            <m:sty m:val="p"/>
+          </m:rPr>
+          <m:t>}</m:t>
+        </m:r>
+      </m:oMath>
+      <w:r>
+        <w:rPr>
+          <w:i/>
+          <w:iCs/>
+        </w:rPr>
+        <w:t xml:space="preserve">; the agreement set</w:t>
+      </w:r>
+      <w:r>
+        <w:rPr>
+          <w:i/>
+          <w:iCs/>
+        </w:rPr>
+        <w:t xml:space="preserve"> </w:t>
+      </w:r>
+      <m:oMath>
+        <m:r>
+          <m:t>Y</m:t>
+        </m:r>
+        <m:r>
+          <m:rPr>
+            <m:sty m:val="p"/>
+          </m:rPr>
+          <m:t>=</m:t>
+        </m:r>
+        <m:r>
+          <m:rPr>
+            <m:sty m:val="p"/>
+          </m:rPr>
+          <m:t>F</m:t>
+        </m:r>
+        <m:r>
+          <m:rPr>
+            <m:sty m:val="p"/>
+          </m:rPr>
+          <m:t>i</m:t>
+        </m:r>
+        <m:r>
+          <m:rPr>
+            <m:sty m:val="p"/>
+          </m:rPr>
+          <m:t>x</m:t>
+        </m:r>
+        <m:r>
+          <m:rPr>
+            <m:sty m:val="p"/>
+          </m:rPr>
+          <m:t>(</m:t>
+        </m:r>
+        <m:sSup>
+          <m:e>
+            <m:r>
+              <m:t>w</m:t>
+            </m:r>
+          </m:e>
+          <m:sup>
+            <m:r>
+              <m:rPr>
+                <m:sty m:val="p"/>
+              </m:rPr>
+              <m:t>−</m:t>
+            </m:r>
+            <m:r>
+              <m:t>1</m:t>
+            </m:r>
+          </m:sup>
+        </m:sSup>
+        <m:sSup>
+          <m:e>
+            <m:r>
+              <m:t>R</m:t>
+            </m:r>
+          </m:e>
+          <m:sup>
+            <m:r>
+              <m:t>16</m:t>
+            </m:r>
+          </m:sup>
+        </m:sSup>
+        <m:r>
+          <m:rPr>
+            <m:sty m:val="p"/>
+          </m:rPr>
+          <m:t>)</m:t>
+        </m:r>
+      </m:oMath>
+      <w:r>
+        <w:rPr>
+          <w:i/>
+          <w:iCs/>
+        </w:rPr>
+        <w:t xml:space="preserve"> </w:t>
+      </w:r>
+      <w:r>
+        <w:rPr>
+          <w:i/>
+          <w:iCs/>
+        </w:rPr>
+        <w:t xml:space="preserve">has</w:t>
+      </w:r>
+      <w:r>
+        <w:rPr>
+          <w:i/>
+          <w:iCs/>
+        </w:rPr>
+        <w:t xml:space="preserve"> </w:t>
+      </w:r>
+      <m:oMath>
+        <m:r>
+          <m:t>1</m:t>
+        </m:r>
+        <m:r>
+          <m:rPr>
+            <m:sty m:val="p"/>
+          </m:rPr>
+          <m:t>,</m:t>
+        </m:r>
+        <m:r>
+          <m:t>900</m:t>
+        </m:r>
+      </m:oMath>
+      <w:r>
+        <w:rPr>
+          <w:i/>
+          <w:iCs/>
+        </w:rPr>
+        <w:t xml:space="preserve"> </w:t>
+      </w:r>
+      <w:r>
+        <w:rPr>
+          <w:i/>
+          <w:iCs/>
+        </w:rPr>
+        <w:t xml:space="preserve">points and spans,</w:t>
+      </w:r>
+      <w:r>
+        <w:rPr>
+          <w:i/>
+          <w:iCs/>
+        </w:rPr>
+        <w:t xml:space="preserve"> </w:t>
+      </w:r>
+      <m:oMath>
+        <m:sSub>
+          <m:e>
+            <m:r>
+              <m:rPr>
+                <m:sty m:val="p"/>
+              </m:rPr>
+              <m:t>S</m:t>
+            </m:r>
+            <m:r>
+              <m:rPr>
+                <m:sty m:val="p"/>
+              </m:rPr>
+              <m:t>t</m:t>
+            </m:r>
+            <m:r>
+              <m:rPr>
+                <m:sty m:val="p"/>
+              </m:rPr>
+              <m:t>a</m:t>
+            </m:r>
+            <m:r>
+              <m:rPr>
+                <m:sty m:val="p"/>
+              </m:rPr>
+              <m:t>b</m:t>
+            </m:r>
+          </m:e>
+          <m:sub>
+            <m:r>
+              <m:t>W</m:t>
+            </m:r>
+          </m:sub>
+        </m:sSub>
+        <m:r>
+          <m:rPr>
+            <m:sty m:val="p"/>
+          </m:rPr>
+          <m:t>(</m:t>
+        </m:r>
+        <m:r>
+          <m:t>Y</m:t>
+        </m:r>
+        <m:r>
+          <m:rPr>
+            <m:sty m:val="p"/>
+          </m:rPr>
+          <m:t>)</m:t>
+        </m:r>
+        <m:r>
+          <m:rPr>
+            <m:sty m:val="p"/>
+          </m:rPr>
+          <m:t>=</m:t>
+        </m:r>
+        <m:r>
+          <m:rPr>
+            <m:sty m:val="p"/>
+          </m:rPr>
+          <m:t>⟨</m:t>
+        </m:r>
+        <m:r>
+          <m:rPr>
+            <m:sty m:val="p"/>
+          </m:rPr>
+          <m:t>−</m:t>
+        </m:r>
+        <m:r>
+          <m:t>1</m:t>
+        </m:r>
+        <m:r>
+          <m:rPr>
+            <m:sty m:val="p"/>
+          </m:rPr>
+          <m:t>,</m:t>
+        </m:r>
+        <m:r>
+          <m:t>w</m:t>
+        </m:r>
+        <m:r>
+          <m:rPr>
+            <m:sty m:val="p"/>
+          </m:rPr>
+          <m:t>⟩</m:t>
+        </m:r>
+      </m:oMath>
+      <w:r>
+        <w:rPr>
+          <w:i/>
+          <w:iCs/>
+        </w:rPr>
+        <w:t xml:space="preserve"> </w:t>
+      </w:r>
+      <w:r>
+        <w:rPr>
+          <w:i/>
+          <w:iCs/>
+        </w:rPr>
+        <w:t xml:space="preserve">and</w:t>
+      </w:r>
+      <w:r>
+        <w:rPr>
+          <w:i/>
+          <w:iCs/>
+        </w:rPr>
+        <w:t xml:space="preserve"> </w:t>
+      </w:r>
+      <m:oMath>
+        <m:sSub>
+          <m:e>
+            <m:r>
+              <m:t>C</m:t>
+            </m:r>
+          </m:e>
+          <m:sub>
+            <m:r>
+              <m:t>W</m:t>
+            </m:r>
+          </m:sub>
+        </m:sSub>
+        <m:r>
+          <m:rPr>
+            <m:sty m:val="p"/>
+          </m:rPr>
+          <m:t>(</m:t>
+        </m:r>
+        <m:sSup>
+          <m:e>
+            <m:r>
+              <m:t>w</m:t>
+            </m:r>
+          </m:e>
+          <m:sup>
+            <m:r>
+              <m:rPr>
+                <m:sty m:val="p"/>
+              </m:rPr>
+              <m:t>−</m:t>
+            </m:r>
+            <m:r>
+              <m:t>1</m:t>
+            </m:r>
+          </m:sup>
+        </m:sSup>
+        <m:sSup>
+          <m:e>
+            <m:r>
+              <m:t>R</m:t>
+            </m:r>
+          </m:e>
+          <m:sup>
+            <m:r>
+              <m:t>16</m:t>
+            </m:r>
+          </m:sup>
+        </m:sSup>
+        <m:r>
+          <m:rPr>
+            <m:sty m:val="p"/>
+          </m:rPr>
+          <m:t>)</m:t>
+        </m:r>
+        <m:r>
+          <m:rPr>
+            <m:sty m:val="p"/>
+          </m:rPr>
+          <m:t>=</m:t>
+        </m:r>
+        <m:r>
+          <m:rPr>
+            <m:sty m:val="p"/>
+          </m:rPr>
+          <m:t>{</m:t>
+        </m:r>
+        <m:r>
+          <m:rPr>
+            <m:sty m:val="p"/>
+          </m:rPr>
+          <m:t>±</m:t>
+        </m:r>
+        <m:r>
+          <m:t>1</m:t>
+        </m:r>
+        <m:r>
+          <m:rPr>
+            <m:sty m:val="p"/>
+          </m:rPr>
+          <m:t>}</m:t>
+        </m:r>
+      </m:oMath>
+      <w:r>
+        <w:rPr>
+          <w:i/>
+          <w:iCs/>
+        </w:rPr>
+        <w:t xml:space="preserve">, so by Lemma 6.1</w:t>
+      </w:r>
+      <w:r>
+        <w:rPr>
+          <w:i/>
+          <w:iCs/>
+        </w:rPr>
+        <w:t xml:space="preserve"> </w:t>
+      </w:r>
+      <m:oMath>
+        <m:sSub>
+          <m:e>
+            <m:r>
+              <m:t>I</m:t>
+            </m:r>
+          </m:e>
+          <m:sub>
+            <m:r>
+              <m:t>16</m:t>
+            </m:r>
+          </m:sub>
+        </m:sSub>
+        <m:r>
+          <m:rPr>
+            <m:sty m:val="p"/>
+          </m:rPr>
+          <m:t>∩</m:t>
+        </m:r>
+        <m:sSub>
+          <m:e>
+            <m:r>
+              <m:rPr>
+                <m:sty m:val="p"/>
+              </m:rPr>
+              <m:t>S</m:t>
+            </m:r>
+            <m:r>
+              <m:rPr>
+                <m:sty m:val="p"/>
+              </m:rPr>
+              <m:t>t</m:t>
+            </m:r>
+            <m:r>
+              <m:rPr>
+                <m:sty m:val="p"/>
+              </m:rPr>
+              <m:t>a</m:t>
+            </m:r>
+            <m:r>
+              <m:rPr>
+                <m:sty m:val="p"/>
+              </m:rPr>
+              <m:t>b</m:t>
+            </m:r>
+          </m:e>
+          <m:sub>
+            <m:r>
+              <m:t>W</m:t>
+            </m:r>
+          </m:sub>
+        </m:sSub>
+        <m:r>
+          <m:rPr>
+            <m:sty m:val="p"/>
+          </m:rPr>
+          <m:t>(</m:t>
+        </m:r>
+        <m:r>
+          <m:t>Y</m:t>
+        </m:r>
+        <m:r>
+          <m:rPr>
+            <m:sty m:val="p"/>
+          </m:rPr>
+          <m:t>)</m:t>
+        </m:r>
+        <m:r>
+          <m:rPr>
+            <m:sty m:val="p"/>
+          </m:rPr>
+          <m:t>=</m:t>
+        </m:r>
+        <m:r>
+          <m:rPr>
+            <m:sty m:val="p"/>
+          </m:rPr>
+          <m:t>{</m:t>
+        </m:r>
+        <m:r>
+          <m:rPr>
+            <m:sty m:val="p"/>
+          </m:rPr>
+          <m:t>±</m:t>
+        </m:r>
+        <m:r>
+          <m:t>1</m:t>
+        </m:r>
+        <m:r>
+          <m:rPr>
+            <m:sty m:val="p"/>
+          </m:rPr>
+          <m:t>}</m:t>
+        </m:r>
+      </m:oMath>
+      <w:r>
+        <w:rPr>
+          <w:i/>
+          <w:iCs/>
+        </w:rPr>
+        <w:t xml:space="preserve">. Whether</w:t>
+      </w:r>
+      <w:r>
+        <w:rPr>
+          <w:i/>
+          <w:iCs/>
+        </w:rPr>
+        <w:t xml:space="preserve"> </w:t>
+      </w:r>
+      <m:oMath>
+        <m:sSub>
+          <m:e>
+            <m:r>
+              <m:t>I</m:t>
+            </m:r>
+          </m:e>
+          <m:sub>
+            <m:r>
+              <m:t>16</m:t>
+            </m:r>
+          </m:sub>
+        </m:sSub>
+        <m:r>
+          <m:rPr>
+            <m:sty m:val="p"/>
+          </m:rPr>
+          <m:t>=</m:t>
+        </m:r>
+        <m:r>
+          <m:rPr>
+            <m:sty m:val="p"/>
+          </m:rPr>
+          <m:t>{</m:t>
+        </m:r>
+        <m:r>
+          <m:rPr>
+            <m:sty m:val="p"/>
+          </m:rPr>
+          <m:t>±</m:t>
+        </m:r>
+        <m:r>
+          <m:t>1</m:t>
+        </m:r>
+        <m:r>
+          <m:rPr>
+            <m:sty m:val="p"/>
+          </m:rPr>
+          <m:t>}</m:t>
+        </m:r>
+      </m:oMath>
+      <w:r>
+        <w:rPr>
+          <w:i/>
+          <w:iCs/>
+        </w:rPr>
+        <w:t xml:space="preserve"> </w:t>
+      </w:r>
+      <w:r>
+        <w:rPr>
+          <w:i/>
+          <w:iCs/>
+        </w:rPr>
+        <w:t xml:space="preserve">is not decided.</w:t>
+      </w:r>
+      <w:r>
+        <w:t xml:space="preserve"> </w:t>
+      </w:r>
+      <w:r>
+        <w:t xml:space="preserve">(Rowmotion was computed combinatorially on the shifted staircase and validated against the</w:t>
+      </w:r>
+      <w:r>
+        <w:t xml:space="preserve"> </w:t>
+      </w:r>
+      <m:oMath>
+        <m:sSub>
+          <m:e>
+            <m:r>
+              <m:t>B</m:t>
+            </m:r>
+          </m:e>
+          <m:sub>
+            <m:r>
+              <m:t>4</m:t>
+            </m:r>
+          </m:sub>
+        </m:sSub>
+      </m:oMath>
+      <w:r>
+        <w:t xml:space="preserve"> </w:t>
+      </w:r>
+      <w:r>
+        <w:t xml:space="preserve">and</w:t>
+      </w:r>
+      <w:r>
+        <w:t xml:space="preserve"> </w:t>
+      </w:r>
+      <m:oMath>
+        <m:sSub>
+          <m:e>
+            <m:r>
+              <m:t>B</m:t>
+            </m:r>
+          </m:e>
+          <m:sub>
+            <m:r>
+              <m:t>8</m:t>
+            </m:r>
+          </m:sub>
+        </m:sSub>
+      </m:oMath>
+      <w:r>
+        <w:t xml:space="preserve"> </w:t>
+      </w:r>
+      <w:r>
+        <w:t xml:space="preserve">clocks; the Weyl element agreeing with</w:t>
+      </w:r>
+      <w:r>
+        <w:t xml:space="preserve"> </w:t>
+      </w:r>
+      <m:oMath>
+        <m:sSup>
+          <m:e>
+            <m:r>
+              <m:t>R</m:t>
+            </m:r>
+          </m:e>
+          <m:sup>
+            <m:r>
+              <m:t>16</m:t>
+            </m:r>
+          </m:sup>
+        </m:sSup>
+      </m:oMath>
+      <w:r>
+        <w:t xml:space="preserve"> </w:t>
+      </w:r>
+      <w:r>
+        <w:t xml:space="preserve">on an orbit was found by matching columns of the difference vectors, the stabilizer and the centralizers by backtracking over coordinate permutations with every solution verified on all</w:t>
+      </w:r>
+      <w:r>
+        <w:t xml:space="preserve"> </w:t>
+      </w:r>
+      <m:oMath>
+        <m:r>
+          <m:t>65</m:t>
+        </m:r>
+        <m:r>
+          <m:rPr>
+            <m:sty m:val="p"/>
+          </m:rPr>
+          <m:t>,</m:t>
+        </m:r>
+        <m:r>
+          <m:t>536</m:t>
+        </m:r>
+      </m:oMath>
+      <w:r>
+        <w:t xml:space="preserve"> </w:t>
+      </w:r>
+      <w:r>
+        <w:t xml:space="preserve">weights.</w:t>
+      </w:r>
+      <w:r>
+        <w:t xml:space="preserve"> </w:t>
+      </w:r>
+      <m:oMath>
+        <m:r>
+          <m:t>1</m:t>
+        </m:r>
+        <m:r>
+          <m:rPr>
+            <m:sty m:val="p"/>
+          </m:rPr>
+          <m:t>,</m:t>
+        </m:r>
+        <m:r>
+          <m:t>987</m:t>
+        </m:r>
+      </m:oMath>
+      <w:r>
+        <w:t xml:space="preserve"> </w:t>
+      </w:r>
+      <w:r>
+        <w:t xml:space="preserve">of the</w:t>
+      </w:r>
+      <w:r>
+        <w:t xml:space="preserve"> </w:t>
+      </w:r>
+      <m:oMath>
+        <m:r>
+          <m:t>2</m:t>
+        </m:r>
+        <m:r>
+          <m:rPr>
+            <m:sty m:val="p"/>
+          </m:rPr>
+          <m:t>,</m:t>
+        </m:r>
+        <m:r>
+          <m:t>048</m:t>
+        </m:r>
+      </m:oMath>
+      <w:r>
+        <w:t xml:space="preserve"> </w:t>
+      </w:r>
+      <w:r>
+        <w:t xml:space="preserve">orbits affinely span</w:t>
+      </w:r>
+      <w:r>
+        <w:t xml:space="preserve"> </w:t>
+      </w:r>
+      <m:oMath>
+        <m:sSubSup>
+          <m:e>
+            <m:r>
+              <m:rPr>
+                <m:scr m:val="double-struck"/>
+                <m:sty m:val="p"/>
+              </m:rPr>
+              <m:t>F</m:t>
+            </m:r>
+          </m:e>
+          <m:sub>
+            <m:r>
+              <m:t>2</m:t>
+            </m:r>
+          </m:sub>
+          <m:sup>
+            <m:r>
+              <m:t>16</m:t>
+            </m:r>
+          </m:sup>
+        </m:sSubSup>
+      </m:oMath>
+      <w:r>
+        <w:t xml:space="preserve">, every carrying orbit among them.)</w:t>
       </w:r>
     </w:p>
     <w:bookmarkEnd w:id="29"/>
@@ -65578,7 +69873,30 @@
         <w:t xml:space="preserve"> </w:t>
       </w:r>
       <w:r>
-        <w:t xml:space="preserve">(65,536 weights) is the next free case; is there a proof that the correction’s centralizer is</w:t>
+        <w:t xml:space="preserve">(65,536 weights) is the next free case; on</w:t>
+      </w:r>
+      <w:r>
+        <w:t xml:space="preserve"> </w:t>
+      </w:r>
+      <m:oMath>
+        <m:sSub>
+          <m:e>
+            <m:r>
+              <m:t>B</m:t>
+            </m:r>
+          </m:e>
+          <m:sub>
+            <m:r>
+              <m:t>16</m:t>
+            </m:r>
+          </m:sub>
+        </m:sSub>
+      </m:oMath>
+      <w:r>
+        <w:t xml:space="preserve"> </w:t>
+      </w:r>
+      <w:r>
+        <w:t xml:space="preserve">the correction’s centralizer is again</w:t>
       </w:r>
       <w:r>
         <w:t xml:space="preserve"> </w:t>
@@ -65610,7 +69928,134 @@
         <w:t xml:space="preserve"> </w:t>
       </w:r>
       <w:r>
-        <w:t xml:space="preserve">for every</w:t>
+        <w:t xml:space="preserve">(Proposition 6.11), and Lemma 6.9 reduces the question to one commutation: why does the nearest Weyl element</w:t>
+      </w:r>
+      <w:r>
+        <w:t xml:space="preserve"> </w:t>
+      </w:r>
+      <m:oMath>
+        <m:r>
+          <m:rPr>
+            <m:sty m:val="p"/>
+          </m:rPr>
+          <m:t>−</m:t>
+        </m:r>
+        <m:r>
+          <m:rPr>
+            <m:sty m:val="p"/>
+          </m:rPr>
+          <m:t>(</m:t>
+        </m:r>
+        <m:sSub>
+          <m:e>
+            <m:r>
+              <m:t>e</m:t>
+            </m:r>
+          </m:e>
+          <m:sub>
+            <m:r>
+              <m:t>2</m:t>
+            </m:r>
+          </m:sub>
+        </m:sSub>
+        <m:sSub>
+          <m:e>
+            <m:r>
+              <m:t>e</m:t>
+            </m:r>
+          </m:e>
+          <m:sub>
+            <m:r>
+              <m:t>3</m:t>
+            </m:r>
+          </m:sub>
+        </m:sSub>
+        <m:r>
+          <m:rPr>
+            <m:sty m:val="p"/>
+          </m:rPr>
+          <m:t>)</m:t>
+        </m:r>
+        <m:r>
+          <m:rPr>
+            <m:sty m:val="p"/>
+          </m:rPr>
+          <m:t>(</m:t>
+        </m:r>
+        <m:sSub>
+          <m:e>
+            <m:r>
+              <m:t>e</m:t>
+            </m:r>
+          </m:e>
+          <m:sub>
+            <m:r>
+              <m:t>4</m:t>
+            </m:r>
+          </m:sub>
+        </m:sSub>
+        <m:sSub>
+          <m:e>
+            <m:r>
+              <m:t>e</m:t>
+            </m:r>
+          </m:e>
+          <m:sub>
+            <m:r>
+              <m:t>5</m:t>
+            </m:r>
+          </m:sub>
+        </m:sSub>
+        <m:r>
+          <m:rPr>
+            <m:sty m:val="p"/>
+          </m:rPr>
+          <m:t>)</m:t>
+        </m:r>
+        <m:r>
+          <m:rPr>
+            <m:sty m:val="p"/>
+          </m:rPr>
+          <m:t>⋯</m:t>
+        </m:r>
+      </m:oMath>
+      <w:r>
+        <w:t xml:space="preserve"> </w:t>
+      </w:r>
+      <w:r>
+        <w:t xml:space="preserve">commute with</w:t>
+      </w:r>
+      <w:r>
+        <w:t xml:space="preserve"> </w:t>
+      </w:r>
+      <m:oMath>
+        <m:sSup>
+          <m:e>
+            <m:r>
+              <m:t>R</m:t>
+            </m:r>
+          </m:e>
+          <m:sup>
+            <m:r>
+              <m:t>h</m:t>
+            </m:r>
+            <m:r>
+              <m:rPr>
+                <m:sty m:val="p"/>
+              </m:rPr>
+              <m:t>/</m:t>
+            </m:r>
+            <m:r>
+              <m:t>2</m:t>
+            </m:r>
+          </m:sup>
+        </m:sSup>
+      </m:oMath>
+      <w:r>
+        <w:t xml:space="preserve"> </w:t>
+      </w:r>
+      <w:r>
+        <w:t xml:space="preserve">only at</w:t>
       </w:r>
       <w:r>
         <w:t xml:space="preserve"> </w:t>
@@ -65623,7 +70068,7 @@
           <m:rPr>
             <m:sty m:val="p"/>
           </m:rPr>
-          <m:t>&gt;</m:t>
+          <m:t>=</m:t>
         </m:r>
         <m:r>
           <m:t>4</m:t>
@@ -67486,6 +71931,104 @@
             </w:pPr>
             <w:r>
               <w:t xml:space="preserve">14 + 4 inverted</w:t>
+            </w:r>
+          </w:p>
+        </w:tc>
+        <w:tc>
+          <w:tcPr/>
+          <w:p>
+            <w:pPr>
+              <w:pStyle w:val="Compact"/>
+            </w:pPr>
+            <w:r>
+              <w:t xml:space="preserve">none</w:t>
+            </w:r>
+          </w:p>
+        </w:tc>
+      </w:tr>
+      <w:tr>
+        <w:tc>
+          <w:tcPr/>
+          <w:p>
+            <w:pPr>
+              <w:pStyle w:val="Compact"/>
+            </w:pPr>
+            <w:r>
+              <w:t xml:space="preserve">Lemma 6.9, Prop. 6.10</w:t>
+            </w:r>
+          </w:p>
+        </w:tc>
+        <w:tc>
+          <w:tcPr/>
+          <w:p>
+            <w:pPr>
+              <w:pStyle w:val="Compact"/>
+            </w:pPr>
+            <w:r>
+              <w:rPr>
+                <w:rStyle w:val="VerbatimChar"/>
+              </w:rPr>
+              <w:t xml:space="preserve">verify_stone_bd_halfturn_criterion.py</w:t>
+            </w:r>
+          </w:p>
+        </w:tc>
+        <w:tc>
+          <w:tcPr/>
+          <w:p>
+            <w:pPr>
+              <w:pStyle w:val="Compact"/>
+            </w:pPr>
+            <w:r>
+              <w:t xml:space="preserve">7 + 3 inverted</w:t>
+            </w:r>
+          </w:p>
+        </w:tc>
+        <w:tc>
+          <w:tcPr/>
+          <w:p>
+            <w:pPr>
+              <w:pStyle w:val="Compact"/>
+            </w:pPr>
+            <w:r>
+              <w:t xml:space="preserve">none</w:t>
+            </w:r>
+          </w:p>
+        </w:tc>
+      </w:tr>
+      <w:tr>
+        <w:tc>
+          <w:tcPr/>
+          <w:p>
+            <w:pPr>
+              <w:pStyle w:val="Compact"/>
+            </w:pPr>
+            <w:r>
+              <w:t xml:space="preserve">Prop. 6.11</w:t>
+            </w:r>
+          </w:p>
+        </w:tc>
+        <w:tc>
+          <w:tcPr/>
+          <w:p>
+            <w:pPr>
+              <w:pStyle w:val="Compact"/>
+            </w:pPr>
+            <w:r>
+              <w:rPr>
+                <w:rStyle w:val="VerbatimChar"/>
+              </w:rPr>
+              <w:t xml:space="preserve">verify_stone_be_b16_orbits.py</w:t>
+            </w:r>
+          </w:p>
+        </w:tc>
+        <w:tc>
+          <w:tcPr/>
+          <w:p>
+            <w:pPr>
+              <w:pStyle w:val="Compact"/>
+            </w:pPr>
+            <w:r>
+              <w:t xml:space="preserve">9 + 2 inverted</w:t>
             </w:r>
           </w:p>
         </w:tc>

</xml_diff>

<commit_message>
v2.0: Proposition 6.13's antipode identity cited to Theorem 5.1 and Lemma 3.1 (was Corollary 5.2)
Co-Authored-By: Claude Fable 5.1 <noreply@anthropic.com>
</commit_message>
<xml_diff>
--- a/joint_paper/Roof_and_Clock_MATH_v2.docx
+++ b/joint_paper/Roof_and_Clock_MATH_v2.docx
@@ -59952,7 +59952,7 @@
         <w:t xml:space="preserve"> </w:t>
       </w:r>
       <w:r>
-        <w:t xml:space="preserve">(Corollary 5.2 with</w:t>
+        <w:t xml:space="preserve">(Theorem 5.1 with</w:t>
       </w:r>
       <w:r>
         <w:t xml:space="preserve"> </w:t>
@@ -59987,7 +59987,7 @@
         </m:r>
       </m:oMath>
       <w:r>
-        <w:t xml:space="preserve">).</w:t>
+        <w:t xml:space="preserve">, Lemma 3.1).</w:t>
       </w:r>
       <w:r>
         <w:t xml:space="preserve"> </w:t>

</xml_diff>

<commit_message>
v2.0 rebuilt with the public repository address (build guard exempts the URL)
Co-Authored-By: Claude Fable 5.1 <noreply@anthropic.com>
</commit_message>
<xml_diff>
--- a/joint_paper/Roof_and_Clock_MATH_v2.docx
+++ b/joint_paper/Roof_and_Clock_MATH_v2.docx
@@ -79973,7 +79973,7 @@
         <w:rPr>
           <w:rStyle w:val="VerbatimChar"/>
         </w:rPr>
-        <w:t xml:space="preserve">https://github.com/selinaserephina-star/Scar_merkabit</w:t>
+        <w:t xml:space="preserve">https://github.com/SelinaAliens/Scar_merkabit</w:t>
       </w:r>
     </w:p>
     <w:p>
@@ -79981,7 +79981,7 @@
         <w:pStyle w:val="FirstParagraph"/>
       </w:pPr>
       <w:r>
-        <w:t xml:space="preserve">The repository is private during review; access is granted to editors and referees on request, and it will be made public on publication. Each script re-checks its brief’s SHA-256 as its first test and runs from a clean checkout with no external data.</w:t>
+        <w:t xml:space="preserve">The repository is public under the MIT licence. Each script re-checks its brief’s SHA-256 as its first test and runs from a clean checkout with no external data.</w:t>
       </w:r>
     </w:p>
     <w:bookmarkEnd w:id="36"/>

</xml_diff>